<commit_message>
Updated figures and table for ms
</commit_message>
<xml_diff>
--- a/CQ_table.docx
+++ b/CQ_table.docx
@@ -43,29 +43,43 @@
     </w:p>
     <w:tbl>
       <w:tblPr>
-        <w:tblStyle w:val="tabletemplate"/>
-        <w:tblW w:w="5609" w:type="pct"/>
+        <w:tblW w:w="4172" w:type="pct"/>
+        <w:jc w:val="center"/>
         <w:tblLook w:val="0420" w:firstRow="1" w:lastRow="0" w:firstColumn="0" w:lastColumn="0" w:noHBand="0" w:noVBand="1"/>
       </w:tblPr>
       <w:tblGrid>
-        <w:gridCol w:w="1044"/>
-        <w:gridCol w:w="799"/>
-        <w:gridCol w:w="888"/>
-        <w:gridCol w:w="1410"/>
-        <w:gridCol w:w="1259"/>
-        <w:gridCol w:w="1261"/>
-        <w:gridCol w:w="1440"/>
-        <w:gridCol w:w="899"/>
-        <w:gridCol w:w="1170"/>
+        <w:gridCol w:w="871"/>
+        <w:gridCol w:w="593"/>
+        <w:gridCol w:w="682"/>
+        <w:gridCol w:w="1094"/>
+        <w:gridCol w:w="804"/>
+        <w:gridCol w:w="1094"/>
+        <w:gridCol w:w="804"/>
+        <w:gridCol w:w="664"/>
+        <w:gridCol w:w="959"/>
       </w:tblGrid>
       <w:tr>
         <w:trPr>
-          <w:cnfStyle w:val="100000000000" w:firstRow="1" w:lastRow="0" w:firstColumn="0" w:lastColumn="0" w:oddVBand="0" w:evenVBand="0" w:oddHBand="0" w:evenHBand="0" w:firstRowFirstColumn="0" w:firstRowLastColumn="0" w:lastRowFirstColumn="0" w:lastRowLastColumn="0"/>
+          <w:tblHeader/>
+          <w:jc w:val="center"/>
         </w:trPr>
         <w:tc>
           <w:tcPr>
-            <w:tcW w:w="513" w:type="pct"/>
-            <w:shd w:val="clear" w:color="auto" w:fill="F2F2F2" w:themeFill="background1" w:themeFillShade="F2"/>
+            <w:tcW w:w="0" w:type="auto"/>
+            <w:tcBorders>
+              <w:top w:val="single" w:sz="12" w:space="0" w:color="666666"/>
+              <w:left w:val="none" w:sz="0" w:space="0" w:color="000000"/>
+              <w:bottom w:val="single" w:sz="12" w:space="0" w:color="666666"/>
+              <w:right w:val="none" w:sz="0" w:space="0" w:color="000000"/>
+            </w:tcBorders>
+            <w:shd w:val="clear" w:color="auto" w:fill="FFFFFF"/>
+            <w:tcMar>
+              <w:top w:w="0" w:type="dxa"/>
+              <w:left w:w="0" w:type="dxa"/>
+              <w:bottom w:w="0" w:type="dxa"/>
+              <w:right w:w="0" w:type="dxa"/>
+            </w:tcMar>
+            <w:vAlign w:val="center"/>
           </w:tcPr>
           <w:p>
             <w:pPr>
@@ -88,7 +102,6 @@
             <w:r>
               <w:rPr>
                 <w:rFonts w:ascii="Helvetica" w:eastAsia="Helvetica" w:hAnsi="Helvetica" w:cs="Helvetica"/>
-                <w:b w:val="0"/>
                 <w:color w:val="000000"/>
                 <w:sz w:val="20"/>
                 <w:szCs w:val="20"/>
@@ -100,7 +113,20 @@
         <w:tc>
           <w:tcPr>
             <w:tcW w:w="0" w:type="auto"/>
-            <w:shd w:val="clear" w:color="auto" w:fill="F2F2F2" w:themeFill="background1" w:themeFillShade="F2"/>
+            <w:tcBorders>
+              <w:top w:val="single" w:sz="12" w:space="0" w:color="666666"/>
+              <w:left w:val="none" w:sz="0" w:space="0" w:color="000000"/>
+              <w:bottom w:val="single" w:sz="12" w:space="0" w:color="666666"/>
+              <w:right w:val="none" w:sz="0" w:space="0" w:color="000000"/>
+            </w:tcBorders>
+            <w:shd w:val="clear" w:color="auto" w:fill="FFFFFF"/>
+            <w:tcMar>
+              <w:top w:w="0" w:type="dxa"/>
+              <w:left w:w="0" w:type="dxa"/>
+              <w:bottom w:w="0" w:type="dxa"/>
+              <w:right w:w="0" w:type="dxa"/>
+            </w:tcMar>
+            <w:vAlign w:val="center"/>
           </w:tcPr>
           <w:p>
             <w:pPr>
@@ -123,7 +149,6 @@
             <w:r>
               <w:rPr>
                 <w:rFonts w:ascii="Helvetica" w:eastAsia="Helvetica" w:hAnsi="Helvetica" w:cs="Helvetica"/>
-                <w:b w:val="0"/>
                 <w:color w:val="000000"/>
                 <w:sz w:val="20"/>
                 <w:szCs w:val="20"/>
@@ -135,7 +160,20 @@
         <w:tc>
           <w:tcPr>
             <w:tcW w:w="0" w:type="auto"/>
-            <w:shd w:val="clear" w:color="auto" w:fill="F2F2F2" w:themeFill="background1" w:themeFillShade="F2"/>
+            <w:tcBorders>
+              <w:top w:val="single" w:sz="12" w:space="0" w:color="666666"/>
+              <w:left w:val="none" w:sz="0" w:space="0" w:color="000000"/>
+              <w:bottom w:val="single" w:sz="12" w:space="0" w:color="666666"/>
+              <w:right w:val="none" w:sz="0" w:space="0" w:color="000000"/>
+            </w:tcBorders>
+            <w:shd w:val="clear" w:color="auto" w:fill="FFFFFF"/>
+            <w:tcMar>
+              <w:top w:w="0" w:type="dxa"/>
+              <w:left w:w="0" w:type="dxa"/>
+              <w:bottom w:w="0" w:type="dxa"/>
+              <w:right w:w="0" w:type="dxa"/>
+            </w:tcMar>
+            <w:vAlign w:val="center"/>
           </w:tcPr>
           <w:p>
             <w:pPr>
@@ -158,7 +196,6 @@
             <w:r>
               <w:rPr>
                 <w:rFonts w:ascii="Helvetica" w:eastAsia="Helvetica" w:hAnsi="Helvetica" w:cs="Helvetica"/>
-                <w:b w:val="0"/>
                 <w:color w:val="000000"/>
                 <w:sz w:val="20"/>
                 <w:szCs w:val="20"/>
@@ -169,8 +206,21 @@
         </w:tc>
         <w:tc>
           <w:tcPr>
-            <w:tcW w:w="693" w:type="pct"/>
-            <w:shd w:val="clear" w:color="auto" w:fill="F2F2F2" w:themeFill="background1" w:themeFillShade="F2"/>
+            <w:tcW w:w="0" w:type="auto"/>
+            <w:tcBorders>
+              <w:top w:val="single" w:sz="12" w:space="0" w:color="666666"/>
+              <w:left w:val="none" w:sz="0" w:space="0" w:color="000000"/>
+              <w:bottom w:val="single" w:sz="12" w:space="0" w:color="666666"/>
+              <w:right w:val="none" w:sz="0" w:space="0" w:color="000000"/>
+            </w:tcBorders>
+            <w:shd w:val="clear" w:color="auto" w:fill="FFFFFF"/>
+            <w:tcMar>
+              <w:top w:w="0" w:type="dxa"/>
+              <w:left w:w="0" w:type="dxa"/>
+              <w:bottom w:w="0" w:type="dxa"/>
+              <w:right w:w="0" w:type="dxa"/>
+            </w:tcMar>
+            <w:vAlign w:val="center"/>
           </w:tcPr>
           <w:p>
             <w:pPr>
@@ -193,7 +243,6 @@
             <w:r>
               <w:rPr>
                 <w:rFonts w:ascii="Helvetica" w:eastAsia="Helvetica" w:hAnsi="Helvetica" w:cs="Helvetica"/>
-                <w:b w:val="0"/>
                 <w:color w:val="000000"/>
                 <w:sz w:val="20"/>
                 <w:szCs w:val="20"/>
@@ -204,8 +253,21 @@
         </w:tc>
         <w:tc>
           <w:tcPr>
-            <w:tcW w:w="619" w:type="pct"/>
-            <w:shd w:val="clear" w:color="auto" w:fill="F2F2F2" w:themeFill="background1" w:themeFillShade="F2"/>
+            <w:tcW w:w="0" w:type="auto"/>
+            <w:tcBorders>
+              <w:top w:val="single" w:sz="12" w:space="0" w:color="666666"/>
+              <w:left w:val="none" w:sz="0" w:space="0" w:color="000000"/>
+              <w:bottom w:val="single" w:sz="12" w:space="0" w:color="666666"/>
+              <w:right w:val="none" w:sz="0" w:space="0" w:color="000000"/>
+            </w:tcBorders>
+            <w:shd w:val="clear" w:color="auto" w:fill="FFFFFF"/>
+            <w:tcMar>
+              <w:top w:w="0" w:type="dxa"/>
+              <w:left w:w="0" w:type="dxa"/>
+              <w:bottom w:w="0" w:type="dxa"/>
+              <w:right w:w="0" w:type="dxa"/>
+            </w:tcMar>
+            <w:vAlign w:val="center"/>
           </w:tcPr>
           <w:p>
             <w:pPr>
@@ -228,7 +290,6 @@
             <w:r>
               <w:rPr>
                 <w:rFonts w:ascii="Helvetica" w:eastAsia="Helvetica" w:hAnsi="Helvetica" w:cs="Helvetica"/>
-                <w:b w:val="0"/>
                 <w:color w:val="000000"/>
                 <w:sz w:val="20"/>
                 <w:szCs w:val="20"/>
@@ -239,8 +300,21 @@
         </w:tc>
         <w:tc>
           <w:tcPr>
-            <w:tcW w:w="620" w:type="pct"/>
-            <w:shd w:val="clear" w:color="auto" w:fill="F2F2F2" w:themeFill="background1" w:themeFillShade="F2"/>
+            <w:tcW w:w="0" w:type="auto"/>
+            <w:tcBorders>
+              <w:top w:val="single" w:sz="12" w:space="0" w:color="666666"/>
+              <w:left w:val="none" w:sz="0" w:space="0" w:color="000000"/>
+              <w:bottom w:val="single" w:sz="12" w:space="0" w:color="666666"/>
+              <w:right w:val="none" w:sz="0" w:space="0" w:color="000000"/>
+            </w:tcBorders>
+            <w:shd w:val="clear" w:color="auto" w:fill="FFFFFF"/>
+            <w:tcMar>
+              <w:top w:w="0" w:type="dxa"/>
+              <w:left w:w="0" w:type="dxa"/>
+              <w:bottom w:w="0" w:type="dxa"/>
+              <w:right w:w="0" w:type="dxa"/>
+            </w:tcMar>
+            <w:vAlign w:val="center"/>
           </w:tcPr>
           <w:p>
             <w:pPr>
@@ -263,7 +337,6 @@
             <w:r>
               <w:rPr>
                 <w:rFonts w:ascii="Helvetica" w:eastAsia="Helvetica" w:hAnsi="Helvetica" w:cs="Helvetica"/>
-                <w:b w:val="0"/>
                 <w:color w:val="000000"/>
                 <w:sz w:val="20"/>
                 <w:szCs w:val="20"/>
@@ -274,8 +347,21 @@
         </w:tc>
         <w:tc>
           <w:tcPr>
-            <w:tcW w:w="708" w:type="pct"/>
-            <w:shd w:val="clear" w:color="auto" w:fill="F2F2F2" w:themeFill="background1" w:themeFillShade="F2"/>
+            <w:tcW w:w="0" w:type="auto"/>
+            <w:tcBorders>
+              <w:top w:val="single" w:sz="12" w:space="0" w:color="666666"/>
+              <w:left w:val="none" w:sz="0" w:space="0" w:color="000000"/>
+              <w:bottom w:val="single" w:sz="12" w:space="0" w:color="666666"/>
+              <w:right w:val="none" w:sz="0" w:space="0" w:color="000000"/>
+            </w:tcBorders>
+            <w:shd w:val="clear" w:color="auto" w:fill="FFFFFF"/>
+            <w:tcMar>
+              <w:top w:w="0" w:type="dxa"/>
+              <w:left w:w="0" w:type="dxa"/>
+              <w:bottom w:w="0" w:type="dxa"/>
+              <w:right w:w="0" w:type="dxa"/>
+            </w:tcMar>
+            <w:vAlign w:val="center"/>
           </w:tcPr>
           <w:p>
             <w:pPr>
@@ -298,7 +384,6 @@
             <w:r>
               <w:rPr>
                 <w:rFonts w:ascii="Helvetica" w:eastAsia="Helvetica" w:hAnsi="Helvetica" w:cs="Helvetica"/>
-                <w:b w:val="0"/>
                 <w:color w:val="000000"/>
                 <w:sz w:val="20"/>
                 <w:szCs w:val="20"/>
@@ -309,8 +394,21 @@
         </w:tc>
         <w:tc>
           <w:tcPr>
-            <w:tcW w:w="442" w:type="pct"/>
-            <w:shd w:val="clear" w:color="auto" w:fill="F2F2F2" w:themeFill="background1" w:themeFillShade="F2"/>
+            <w:tcW w:w="0" w:type="auto"/>
+            <w:tcBorders>
+              <w:top w:val="single" w:sz="12" w:space="0" w:color="666666"/>
+              <w:left w:val="none" w:sz="0" w:space="0" w:color="000000"/>
+              <w:bottom w:val="single" w:sz="12" w:space="0" w:color="666666"/>
+              <w:right w:val="none" w:sz="0" w:space="0" w:color="000000"/>
+            </w:tcBorders>
+            <w:shd w:val="clear" w:color="auto" w:fill="FFFFFF"/>
+            <w:tcMar>
+              <w:top w:w="0" w:type="dxa"/>
+              <w:left w:w="0" w:type="dxa"/>
+              <w:bottom w:w="0" w:type="dxa"/>
+              <w:right w:w="0" w:type="dxa"/>
+            </w:tcMar>
+            <w:vAlign w:val="center"/>
           </w:tcPr>
           <w:p>
             <w:pPr>
@@ -333,7 +431,6 @@
             <w:r>
               <w:rPr>
                 <w:rFonts w:ascii="Helvetica" w:eastAsia="Helvetica" w:hAnsi="Helvetica" w:cs="Helvetica"/>
-                <w:b w:val="0"/>
                 <w:color w:val="000000"/>
                 <w:sz w:val="20"/>
                 <w:szCs w:val="20"/>
@@ -344,7 +441,6 @@
             <w:r>
               <w:rPr>
                 <w:rFonts w:ascii="Helvetica" w:eastAsia="Helvetica" w:hAnsi="Helvetica" w:cs="Helvetica"/>
-                <w:b w:val="0"/>
                 <w:color w:val="000000"/>
                 <w:sz w:val="20"/>
                 <w:szCs w:val="20"/>
@@ -355,7 +451,6 @@
             <w:r>
               <w:rPr>
                 <w:rFonts w:ascii="Helvetica" w:eastAsia="Helvetica" w:hAnsi="Helvetica" w:cs="Helvetica"/>
-                <w:b w:val="0"/>
                 <w:color w:val="000000"/>
                 <w:sz w:val="20"/>
                 <w:szCs w:val="20"/>
@@ -366,8 +461,21 @@
         </w:tc>
         <w:tc>
           <w:tcPr>
-            <w:tcW w:w="575" w:type="pct"/>
-            <w:shd w:val="clear" w:color="auto" w:fill="F2F2F2" w:themeFill="background1" w:themeFillShade="F2"/>
+            <w:tcW w:w="0" w:type="auto"/>
+            <w:tcBorders>
+              <w:top w:val="single" w:sz="12" w:space="0" w:color="666666"/>
+              <w:left w:val="none" w:sz="0" w:space="0" w:color="000000"/>
+              <w:bottom w:val="single" w:sz="12" w:space="0" w:color="666666"/>
+              <w:right w:val="none" w:sz="0" w:space="0" w:color="000000"/>
+            </w:tcBorders>
+            <w:shd w:val="clear" w:color="auto" w:fill="FFFFFF"/>
+            <w:tcMar>
+              <w:top w:w="0" w:type="dxa"/>
+              <w:left w:w="0" w:type="dxa"/>
+              <w:bottom w:w="0" w:type="dxa"/>
+              <w:right w:w="0" w:type="dxa"/>
+            </w:tcMar>
+            <w:vAlign w:val="center"/>
           </w:tcPr>
           <w:p>
             <w:pPr>
@@ -390,7 +498,6 @@
             <w:r>
               <w:rPr>
                 <w:rFonts w:ascii="Helvetica" w:eastAsia="Helvetica" w:hAnsi="Helvetica" w:cs="Helvetica"/>
-                <w:b w:val="0"/>
                 <w:color w:val="000000"/>
                 <w:sz w:val="20"/>
                 <w:szCs w:val="20"/>
@@ -401,7 +508,6 @@
             <w:r>
               <w:rPr>
                 <w:rFonts w:ascii="Helvetica" w:eastAsia="Helvetica" w:hAnsi="Helvetica" w:cs="Helvetica"/>
-                <w:b w:val="0"/>
                 <w:color w:val="000000"/>
                 <w:sz w:val="20"/>
                 <w:szCs w:val="20"/>
@@ -412,7 +518,6 @@
             <w:r>
               <w:rPr>
                 <w:rFonts w:ascii="Helvetica" w:eastAsia="Helvetica" w:hAnsi="Helvetica" w:cs="Helvetica"/>
-                <w:b w:val="0"/>
                 <w:color w:val="000000"/>
                 <w:sz w:val="20"/>
                 <w:szCs w:val="20"/>
@@ -423,9 +528,26 @@
         </w:tc>
       </w:tr>
       <w:tr>
-        <w:tc>
-          <w:tcPr>
-            <w:tcW w:w="513" w:type="pct"/>
+        <w:trPr>
+          <w:jc w:val="center"/>
+        </w:trPr>
+        <w:tc>
+          <w:tcPr>
+            <w:tcW w:w="0" w:type="auto"/>
+            <w:tcBorders>
+              <w:top w:val="single" w:sz="12" w:space="0" w:color="666666"/>
+              <w:left w:val="none" w:sz="0" w:space="0" w:color="000000"/>
+              <w:bottom w:val="none" w:sz="0" w:space="0" w:color="000000"/>
+              <w:right w:val="none" w:sz="0" w:space="0" w:color="000000"/>
+            </w:tcBorders>
+            <w:shd w:val="clear" w:color="auto" w:fill="FFFFFF"/>
+            <w:tcMar>
+              <w:top w:w="0" w:type="dxa"/>
+              <w:left w:w="0" w:type="dxa"/>
+              <w:bottom w:w="0" w:type="dxa"/>
+              <w:right w:w="0" w:type="dxa"/>
+            </w:tcMar>
+            <w:vAlign w:val="center"/>
           </w:tcPr>
           <w:p>
             <w:pPr>
@@ -458,17 +580,32 @@
         <w:tc>
           <w:tcPr>
             <w:tcW w:w="0" w:type="auto"/>
-          </w:tcPr>
-          <w:p>
-            <w:pPr>
-              <w:pBdr>
-                <w:top w:val="none" w:sz="0" w:space="0" w:color="000000"/>
-                <w:left w:val="none" w:sz="0" w:space="0" w:color="000000"/>
-                <w:bottom w:val="none" w:sz="0" w:space="0" w:color="000000"/>
-                <w:right w:val="none" w:sz="0" w:space="0" w:color="000000"/>
-              </w:pBdr>
-              <w:spacing w:before="80" w:after="80"/>
-              <w:ind w:left="80" w:right="80"/>
+            <w:tcBorders>
+              <w:top w:val="single" w:sz="12" w:space="0" w:color="666666"/>
+              <w:left w:val="none" w:sz="0" w:space="0" w:color="000000"/>
+              <w:bottom w:val="none" w:sz="0" w:space="0" w:color="000000"/>
+              <w:right w:val="none" w:sz="0" w:space="0" w:color="000000"/>
+            </w:tcBorders>
+            <w:shd w:val="clear" w:color="auto" w:fill="FFFFFF"/>
+            <w:tcMar>
+              <w:top w:w="0" w:type="dxa"/>
+              <w:left w:w="0" w:type="dxa"/>
+              <w:bottom w:w="0" w:type="dxa"/>
+              <w:right w:w="0" w:type="dxa"/>
+            </w:tcMar>
+            <w:vAlign w:val="center"/>
+          </w:tcPr>
+          <w:p>
+            <w:pPr>
+              <w:pBdr>
+                <w:top w:val="none" w:sz="0" w:space="0" w:color="000000"/>
+                <w:left w:val="none" w:sz="0" w:space="0" w:color="000000"/>
+                <w:bottom w:val="none" w:sz="0" w:space="0" w:color="000000"/>
+                <w:right w:val="none" w:sz="0" w:space="0" w:color="000000"/>
+              </w:pBdr>
+              <w:spacing w:before="80" w:after="80"/>
+              <w:ind w:left="80" w:right="80"/>
+              <w:jc w:val="right"/>
               <w:rPr>
                 <w:rFonts w:ascii="Helvetica" w:eastAsia="Helvetica" w:hAnsi="Helvetica" w:cs="Helvetica"/>
                 <w:color w:val="000000"/>
@@ -490,17 +627,32 @@
         <w:tc>
           <w:tcPr>
             <w:tcW w:w="0" w:type="auto"/>
-          </w:tcPr>
-          <w:p>
-            <w:pPr>
-              <w:pBdr>
-                <w:top w:val="none" w:sz="0" w:space="0" w:color="000000"/>
-                <w:left w:val="none" w:sz="0" w:space="0" w:color="000000"/>
-                <w:bottom w:val="none" w:sz="0" w:space="0" w:color="000000"/>
-                <w:right w:val="none" w:sz="0" w:space="0" w:color="000000"/>
-              </w:pBdr>
-              <w:spacing w:before="80" w:after="80"/>
-              <w:ind w:left="80" w:right="80"/>
+            <w:tcBorders>
+              <w:top w:val="single" w:sz="12" w:space="0" w:color="666666"/>
+              <w:left w:val="none" w:sz="0" w:space="0" w:color="000000"/>
+              <w:bottom w:val="none" w:sz="0" w:space="0" w:color="000000"/>
+              <w:right w:val="none" w:sz="0" w:space="0" w:color="000000"/>
+            </w:tcBorders>
+            <w:shd w:val="clear" w:color="auto" w:fill="FFFFFF"/>
+            <w:tcMar>
+              <w:top w:w="0" w:type="dxa"/>
+              <w:left w:w="0" w:type="dxa"/>
+              <w:bottom w:w="0" w:type="dxa"/>
+              <w:right w:w="0" w:type="dxa"/>
+            </w:tcMar>
+            <w:vAlign w:val="center"/>
+          </w:tcPr>
+          <w:p>
+            <w:pPr>
+              <w:pBdr>
+                <w:top w:val="none" w:sz="0" w:space="0" w:color="000000"/>
+                <w:left w:val="none" w:sz="0" w:space="0" w:color="000000"/>
+                <w:bottom w:val="none" w:sz="0" w:space="0" w:color="000000"/>
+                <w:right w:val="none" w:sz="0" w:space="0" w:color="000000"/>
+              </w:pBdr>
+              <w:spacing w:before="80" w:after="80"/>
+              <w:ind w:left="80" w:right="80"/>
+              <w:jc w:val="right"/>
               <w:rPr>
                 <w:rFonts w:ascii="Helvetica" w:eastAsia="Helvetica" w:hAnsi="Helvetica" w:cs="Helvetica"/>
                 <w:color w:val="000000"/>
@@ -521,7 +673,21 @@
         </w:tc>
         <w:tc>
           <w:tcPr>
-            <w:tcW w:w="693" w:type="pct"/>
+            <w:tcW w:w="0" w:type="auto"/>
+            <w:tcBorders>
+              <w:top w:val="single" w:sz="12" w:space="0" w:color="666666"/>
+              <w:left w:val="none" w:sz="0" w:space="0" w:color="000000"/>
+              <w:bottom w:val="none" w:sz="0" w:space="0" w:color="000000"/>
+              <w:right w:val="none" w:sz="0" w:space="0" w:color="000000"/>
+            </w:tcBorders>
+            <w:shd w:val="clear" w:color="auto" w:fill="FFFFFF"/>
+            <w:tcMar>
+              <w:top w:w="0" w:type="dxa"/>
+              <w:left w:w="0" w:type="dxa"/>
+              <w:bottom w:w="0" w:type="dxa"/>
+              <w:right w:w="0" w:type="dxa"/>
+            </w:tcMar>
+            <w:vAlign w:val="center"/>
           </w:tcPr>
           <w:p>
             <w:pPr>
@@ -553,7 +719,21 @@
         </w:tc>
         <w:tc>
           <w:tcPr>
-            <w:tcW w:w="619" w:type="pct"/>
+            <w:tcW w:w="0" w:type="auto"/>
+            <w:tcBorders>
+              <w:top w:val="single" w:sz="12" w:space="0" w:color="666666"/>
+              <w:left w:val="none" w:sz="0" w:space="0" w:color="000000"/>
+              <w:bottom w:val="none" w:sz="0" w:space="0" w:color="000000"/>
+              <w:right w:val="none" w:sz="0" w:space="0" w:color="000000"/>
+            </w:tcBorders>
+            <w:shd w:val="clear" w:color="auto" w:fill="FFFFFF"/>
+            <w:tcMar>
+              <w:top w:w="0" w:type="dxa"/>
+              <w:left w:w="0" w:type="dxa"/>
+              <w:bottom w:w="0" w:type="dxa"/>
+              <w:right w:w="0" w:type="dxa"/>
+            </w:tcMar>
+            <w:vAlign w:val="center"/>
           </w:tcPr>
           <w:p>
             <w:pPr>
@@ -585,7 +765,21 @@
         </w:tc>
         <w:tc>
           <w:tcPr>
-            <w:tcW w:w="620" w:type="pct"/>
+            <w:tcW w:w="0" w:type="auto"/>
+            <w:tcBorders>
+              <w:top w:val="single" w:sz="12" w:space="0" w:color="666666"/>
+              <w:left w:val="none" w:sz="0" w:space="0" w:color="000000"/>
+              <w:bottom w:val="none" w:sz="0" w:space="0" w:color="000000"/>
+              <w:right w:val="none" w:sz="0" w:space="0" w:color="000000"/>
+            </w:tcBorders>
+            <w:shd w:val="clear" w:color="auto" w:fill="FFFFFF"/>
+            <w:tcMar>
+              <w:top w:w="0" w:type="dxa"/>
+              <w:left w:w="0" w:type="dxa"/>
+              <w:bottom w:w="0" w:type="dxa"/>
+              <w:right w:w="0" w:type="dxa"/>
+            </w:tcMar>
+            <w:vAlign w:val="center"/>
           </w:tcPr>
           <w:p>
             <w:pPr>
@@ -617,7 +811,21 @@
         </w:tc>
         <w:tc>
           <w:tcPr>
-            <w:tcW w:w="708" w:type="pct"/>
+            <w:tcW w:w="0" w:type="auto"/>
+            <w:tcBorders>
+              <w:top w:val="single" w:sz="12" w:space="0" w:color="666666"/>
+              <w:left w:val="none" w:sz="0" w:space="0" w:color="000000"/>
+              <w:bottom w:val="none" w:sz="0" w:space="0" w:color="000000"/>
+              <w:right w:val="none" w:sz="0" w:space="0" w:color="000000"/>
+            </w:tcBorders>
+            <w:shd w:val="clear" w:color="auto" w:fill="FFFFFF"/>
+            <w:tcMar>
+              <w:top w:w="0" w:type="dxa"/>
+              <w:left w:w="0" w:type="dxa"/>
+              <w:bottom w:w="0" w:type="dxa"/>
+              <w:right w:w="0" w:type="dxa"/>
+            </w:tcMar>
+            <w:vAlign w:val="center"/>
           </w:tcPr>
           <w:p>
             <w:pPr>
@@ -649,7 +857,21 @@
         </w:tc>
         <w:tc>
           <w:tcPr>
-            <w:tcW w:w="442" w:type="pct"/>
+            <w:tcW w:w="0" w:type="auto"/>
+            <w:tcBorders>
+              <w:top w:val="single" w:sz="12" w:space="0" w:color="666666"/>
+              <w:left w:val="none" w:sz="0" w:space="0" w:color="000000"/>
+              <w:bottom w:val="none" w:sz="0" w:space="0" w:color="000000"/>
+              <w:right w:val="none" w:sz="0" w:space="0" w:color="000000"/>
+            </w:tcBorders>
+            <w:shd w:val="clear" w:color="auto" w:fill="FFFFFF"/>
+            <w:tcMar>
+              <w:top w:w="0" w:type="dxa"/>
+              <w:left w:w="0" w:type="dxa"/>
+              <w:bottom w:w="0" w:type="dxa"/>
+              <w:right w:w="0" w:type="dxa"/>
+            </w:tcMar>
+            <w:vAlign w:val="center"/>
           </w:tcPr>
           <w:p>
             <w:pPr>
@@ -681,32 +903,42 @@
         </w:tc>
         <w:tc>
           <w:tcPr>
-            <w:tcW w:w="575" w:type="pct"/>
-          </w:tcPr>
-          <w:p>
-            <w:pPr>
-              <w:pBdr>
-                <w:top w:val="none" w:sz="0" w:space="0" w:color="000000"/>
-                <w:left w:val="none" w:sz="0" w:space="0" w:color="000000"/>
-                <w:bottom w:val="none" w:sz="0" w:space="0" w:color="000000"/>
-                <w:right w:val="none" w:sz="0" w:space="0" w:color="000000"/>
-              </w:pBdr>
-              <w:spacing w:before="80" w:after="80"/>
-              <w:ind w:left="80" w:right="80"/>
-              <w:rPr>
-                <w:rFonts w:ascii="Helvetica" w:eastAsia="Helvetica" w:hAnsi="Helvetica" w:cs="Helvetica"/>
-                <w:b/>
-                <w:bCs/>
-                <w:color w:val="000000"/>
-                <w:sz w:val="20"/>
-                <w:szCs w:val="20"/>
-              </w:rPr>
-            </w:pPr>
-            <w:r>
-              <w:rPr>
-                <w:rFonts w:ascii="Helvetica" w:eastAsia="Helvetica" w:hAnsi="Helvetica" w:cs="Helvetica"/>
-                <w:b/>
-                <w:bCs/>
+            <w:tcW w:w="0" w:type="auto"/>
+            <w:tcBorders>
+              <w:top w:val="single" w:sz="12" w:space="0" w:color="666666"/>
+              <w:left w:val="none" w:sz="0" w:space="0" w:color="000000"/>
+              <w:bottom w:val="none" w:sz="0" w:space="0" w:color="000000"/>
+              <w:right w:val="none" w:sz="0" w:space="0" w:color="000000"/>
+            </w:tcBorders>
+            <w:shd w:val="clear" w:color="auto" w:fill="FFFFFF"/>
+            <w:tcMar>
+              <w:top w:w="0" w:type="dxa"/>
+              <w:left w:w="0" w:type="dxa"/>
+              <w:bottom w:w="0" w:type="dxa"/>
+              <w:right w:w="0" w:type="dxa"/>
+            </w:tcMar>
+            <w:vAlign w:val="center"/>
+          </w:tcPr>
+          <w:p>
+            <w:pPr>
+              <w:pBdr>
+                <w:top w:val="none" w:sz="0" w:space="0" w:color="000000"/>
+                <w:left w:val="none" w:sz="0" w:space="0" w:color="000000"/>
+                <w:bottom w:val="none" w:sz="0" w:space="0" w:color="000000"/>
+                <w:right w:val="none" w:sz="0" w:space="0" w:color="000000"/>
+              </w:pBdr>
+              <w:spacing w:before="80" w:after="80"/>
+              <w:ind w:left="80" w:right="80"/>
+              <w:rPr>
+                <w:rFonts w:ascii="Helvetica" w:eastAsia="Helvetica" w:hAnsi="Helvetica" w:cs="Helvetica"/>
+                <w:color w:val="000000"/>
+                <w:sz w:val="20"/>
+                <w:szCs w:val="20"/>
+              </w:rPr>
+            </w:pPr>
+            <w:r>
+              <w:rPr>
+                <w:rFonts w:ascii="Helvetica" w:eastAsia="Helvetica" w:hAnsi="Helvetica" w:cs="Helvetica"/>
                 <w:color w:val="000000"/>
                 <w:sz w:val="20"/>
                 <w:szCs w:val="20"/>
@@ -717,9 +949,26 @@
         </w:tc>
       </w:tr>
       <w:tr>
-        <w:tc>
-          <w:tcPr>
-            <w:tcW w:w="513" w:type="pct"/>
+        <w:trPr>
+          <w:jc w:val="center"/>
+        </w:trPr>
+        <w:tc>
+          <w:tcPr>
+            <w:tcW w:w="0" w:type="auto"/>
+            <w:tcBorders>
+              <w:top w:val="none" w:sz="0" w:space="0" w:color="000000"/>
+              <w:left w:val="none" w:sz="0" w:space="0" w:color="000000"/>
+              <w:bottom w:val="none" w:sz="0" w:space="0" w:color="000000"/>
+              <w:right w:val="none" w:sz="0" w:space="0" w:color="000000"/>
+            </w:tcBorders>
+            <w:shd w:val="clear" w:color="auto" w:fill="FFFFFF"/>
+            <w:tcMar>
+              <w:top w:w="0" w:type="dxa"/>
+              <w:left w:w="0" w:type="dxa"/>
+              <w:bottom w:w="0" w:type="dxa"/>
+              <w:right w:w="0" w:type="dxa"/>
+            </w:tcMar>
+            <w:vAlign w:val="center"/>
           </w:tcPr>
           <w:p>
             <w:pPr>
@@ -752,17 +1001,32 @@
         <w:tc>
           <w:tcPr>
             <w:tcW w:w="0" w:type="auto"/>
-          </w:tcPr>
-          <w:p>
-            <w:pPr>
-              <w:pBdr>
-                <w:top w:val="none" w:sz="0" w:space="0" w:color="000000"/>
-                <w:left w:val="none" w:sz="0" w:space="0" w:color="000000"/>
-                <w:bottom w:val="none" w:sz="0" w:space="0" w:color="000000"/>
-                <w:right w:val="none" w:sz="0" w:space="0" w:color="000000"/>
-              </w:pBdr>
-              <w:spacing w:before="80" w:after="80"/>
-              <w:ind w:left="80" w:right="80"/>
+            <w:tcBorders>
+              <w:top w:val="none" w:sz="0" w:space="0" w:color="000000"/>
+              <w:left w:val="none" w:sz="0" w:space="0" w:color="000000"/>
+              <w:bottom w:val="none" w:sz="0" w:space="0" w:color="000000"/>
+              <w:right w:val="none" w:sz="0" w:space="0" w:color="000000"/>
+            </w:tcBorders>
+            <w:shd w:val="clear" w:color="auto" w:fill="FFFFFF"/>
+            <w:tcMar>
+              <w:top w:w="0" w:type="dxa"/>
+              <w:left w:w="0" w:type="dxa"/>
+              <w:bottom w:w="0" w:type="dxa"/>
+              <w:right w:w="0" w:type="dxa"/>
+            </w:tcMar>
+            <w:vAlign w:val="center"/>
+          </w:tcPr>
+          <w:p>
+            <w:pPr>
+              <w:pBdr>
+                <w:top w:val="none" w:sz="0" w:space="0" w:color="000000"/>
+                <w:left w:val="none" w:sz="0" w:space="0" w:color="000000"/>
+                <w:bottom w:val="none" w:sz="0" w:space="0" w:color="000000"/>
+                <w:right w:val="none" w:sz="0" w:space="0" w:color="000000"/>
+              </w:pBdr>
+              <w:spacing w:before="80" w:after="80"/>
+              <w:ind w:left="80" w:right="80"/>
+              <w:jc w:val="right"/>
               <w:rPr>
                 <w:rFonts w:ascii="Helvetica" w:eastAsia="Helvetica" w:hAnsi="Helvetica" w:cs="Helvetica"/>
                 <w:color w:val="000000"/>
@@ -784,17 +1048,32 @@
         <w:tc>
           <w:tcPr>
             <w:tcW w:w="0" w:type="auto"/>
-          </w:tcPr>
-          <w:p>
-            <w:pPr>
-              <w:pBdr>
-                <w:top w:val="none" w:sz="0" w:space="0" w:color="000000"/>
-                <w:left w:val="none" w:sz="0" w:space="0" w:color="000000"/>
-                <w:bottom w:val="none" w:sz="0" w:space="0" w:color="000000"/>
-                <w:right w:val="none" w:sz="0" w:space="0" w:color="000000"/>
-              </w:pBdr>
-              <w:spacing w:before="80" w:after="80"/>
-              <w:ind w:left="80" w:right="80"/>
+            <w:tcBorders>
+              <w:top w:val="none" w:sz="0" w:space="0" w:color="000000"/>
+              <w:left w:val="none" w:sz="0" w:space="0" w:color="000000"/>
+              <w:bottom w:val="none" w:sz="0" w:space="0" w:color="000000"/>
+              <w:right w:val="none" w:sz="0" w:space="0" w:color="000000"/>
+            </w:tcBorders>
+            <w:shd w:val="clear" w:color="auto" w:fill="FFFFFF"/>
+            <w:tcMar>
+              <w:top w:w="0" w:type="dxa"/>
+              <w:left w:w="0" w:type="dxa"/>
+              <w:bottom w:w="0" w:type="dxa"/>
+              <w:right w:w="0" w:type="dxa"/>
+            </w:tcMar>
+            <w:vAlign w:val="center"/>
+          </w:tcPr>
+          <w:p>
+            <w:pPr>
+              <w:pBdr>
+                <w:top w:val="none" w:sz="0" w:space="0" w:color="000000"/>
+                <w:left w:val="none" w:sz="0" w:space="0" w:color="000000"/>
+                <w:bottom w:val="none" w:sz="0" w:space="0" w:color="000000"/>
+                <w:right w:val="none" w:sz="0" w:space="0" w:color="000000"/>
+              </w:pBdr>
+              <w:spacing w:before="80" w:after="80"/>
+              <w:ind w:left="80" w:right="80"/>
+              <w:jc w:val="right"/>
               <w:rPr>
                 <w:rFonts w:ascii="Helvetica" w:eastAsia="Helvetica" w:hAnsi="Helvetica" w:cs="Helvetica"/>
                 <w:color w:val="000000"/>
@@ -815,7 +1094,21 @@
         </w:tc>
         <w:tc>
           <w:tcPr>
-            <w:tcW w:w="693" w:type="pct"/>
+            <w:tcW w:w="0" w:type="auto"/>
+            <w:tcBorders>
+              <w:top w:val="none" w:sz="0" w:space="0" w:color="000000"/>
+              <w:left w:val="none" w:sz="0" w:space="0" w:color="000000"/>
+              <w:bottom w:val="none" w:sz="0" w:space="0" w:color="000000"/>
+              <w:right w:val="none" w:sz="0" w:space="0" w:color="000000"/>
+            </w:tcBorders>
+            <w:shd w:val="clear" w:color="auto" w:fill="FFFFFF"/>
+            <w:tcMar>
+              <w:top w:w="0" w:type="dxa"/>
+              <w:left w:w="0" w:type="dxa"/>
+              <w:bottom w:w="0" w:type="dxa"/>
+              <w:right w:w="0" w:type="dxa"/>
+            </w:tcMar>
+            <w:vAlign w:val="center"/>
           </w:tcPr>
           <w:p>
             <w:pPr>
@@ -847,7 +1140,21 @@
         </w:tc>
         <w:tc>
           <w:tcPr>
-            <w:tcW w:w="619" w:type="pct"/>
+            <w:tcW w:w="0" w:type="auto"/>
+            <w:tcBorders>
+              <w:top w:val="none" w:sz="0" w:space="0" w:color="000000"/>
+              <w:left w:val="none" w:sz="0" w:space="0" w:color="000000"/>
+              <w:bottom w:val="none" w:sz="0" w:space="0" w:color="000000"/>
+              <w:right w:val="none" w:sz="0" w:space="0" w:color="000000"/>
+            </w:tcBorders>
+            <w:shd w:val="clear" w:color="auto" w:fill="FFFFFF"/>
+            <w:tcMar>
+              <w:top w:w="0" w:type="dxa"/>
+              <w:left w:w="0" w:type="dxa"/>
+              <w:bottom w:w="0" w:type="dxa"/>
+              <w:right w:w="0" w:type="dxa"/>
+            </w:tcMar>
+            <w:vAlign w:val="center"/>
           </w:tcPr>
           <w:p>
             <w:pPr>
@@ -879,7 +1186,21 @@
         </w:tc>
         <w:tc>
           <w:tcPr>
-            <w:tcW w:w="620" w:type="pct"/>
+            <w:tcW w:w="0" w:type="auto"/>
+            <w:tcBorders>
+              <w:top w:val="none" w:sz="0" w:space="0" w:color="000000"/>
+              <w:left w:val="none" w:sz="0" w:space="0" w:color="000000"/>
+              <w:bottom w:val="none" w:sz="0" w:space="0" w:color="000000"/>
+              <w:right w:val="none" w:sz="0" w:space="0" w:color="000000"/>
+            </w:tcBorders>
+            <w:shd w:val="clear" w:color="auto" w:fill="FFFFFF"/>
+            <w:tcMar>
+              <w:top w:w="0" w:type="dxa"/>
+              <w:left w:w="0" w:type="dxa"/>
+              <w:bottom w:w="0" w:type="dxa"/>
+              <w:right w:w="0" w:type="dxa"/>
+            </w:tcMar>
+            <w:vAlign w:val="center"/>
           </w:tcPr>
           <w:p>
             <w:pPr>
@@ -911,7 +1232,21 @@
         </w:tc>
         <w:tc>
           <w:tcPr>
-            <w:tcW w:w="708" w:type="pct"/>
+            <w:tcW w:w="0" w:type="auto"/>
+            <w:tcBorders>
+              <w:top w:val="none" w:sz="0" w:space="0" w:color="000000"/>
+              <w:left w:val="none" w:sz="0" w:space="0" w:color="000000"/>
+              <w:bottom w:val="none" w:sz="0" w:space="0" w:color="000000"/>
+              <w:right w:val="none" w:sz="0" w:space="0" w:color="000000"/>
+            </w:tcBorders>
+            <w:shd w:val="clear" w:color="auto" w:fill="FFFFFF"/>
+            <w:tcMar>
+              <w:top w:w="0" w:type="dxa"/>
+              <w:left w:w="0" w:type="dxa"/>
+              <w:bottom w:w="0" w:type="dxa"/>
+              <w:right w:w="0" w:type="dxa"/>
+            </w:tcMar>
+            <w:vAlign w:val="center"/>
           </w:tcPr>
           <w:p>
             <w:pPr>
@@ -943,7 +1278,21 @@
         </w:tc>
         <w:tc>
           <w:tcPr>
-            <w:tcW w:w="442" w:type="pct"/>
+            <w:tcW w:w="0" w:type="auto"/>
+            <w:tcBorders>
+              <w:top w:val="none" w:sz="0" w:space="0" w:color="000000"/>
+              <w:left w:val="none" w:sz="0" w:space="0" w:color="000000"/>
+              <w:bottom w:val="none" w:sz="0" w:space="0" w:color="000000"/>
+              <w:right w:val="none" w:sz="0" w:space="0" w:color="000000"/>
+            </w:tcBorders>
+            <w:shd w:val="clear" w:color="auto" w:fill="FFFFFF"/>
+            <w:tcMar>
+              <w:top w:w="0" w:type="dxa"/>
+              <w:left w:w="0" w:type="dxa"/>
+              <w:bottom w:w="0" w:type="dxa"/>
+              <w:right w:w="0" w:type="dxa"/>
+            </w:tcMar>
+            <w:vAlign w:val="center"/>
           </w:tcPr>
           <w:p>
             <w:pPr>
@@ -975,32 +1324,42 @@
         </w:tc>
         <w:tc>
           <w:tcPr>
-            <w:tcW w:w="575" w:type="pct"/>
-          </w:tcPr>
-          <w:p>
-            <w:pPr>
-              <w:pBdr>
-                <w:top w:val="none" w:sz="0" w:space="0" w:color="000000"/>
-                <w:left w:val="none" w:sz="0" w:space="0" w:color="000000"/>
-                <w:bottom w:val="none" w:sz="0" w:space="0" w:color="000000"/>
-                <w:right w:val="none" w:sz="0" w:space="0" w:color="000000"/>
-              </w:pBdr>
-              <w:spacing w:before="80" w:after="80"/>
-              <w:ind w:left="80" w:right="80"/>
-              <w:rPr>
-                <w:rFonts w:ascii="Helvetica" w:eastAsia="Helvetica" w:hAnsi="Helvetica" w:cs="Helvetica"/>
-                <w:b/>
-                <w:bCs/>
-                <w:color w:val="000000"/>
-                <w:sz w:val="20"/>
-                <w:szCs w:val="20"/>
-              </w:rPr>
-            </w:pPr>
-            <w:r>
-              <w:rPr>
-                <w:rFonts w:ascii="Helvetica" w:eastAsia="Helvetica" w:hAnsi="Helvetica" w:cs="Helvetica"/>
-                <w:b/>
-                <w:bCs/>
+            <w:tcW w:w="0" w:type="auto"/>
+            <w:tcBorders>
+              <w:top w:val="none" w:sz="0" w:space="0" w:color="000000"/>
+              <w:left w:val="none" w:sz="0" w:space="0" w:color="000000"/>
+              <w:bottom w:val="none" w:sz="0" w:space="0" w:color="000000"/>
+              <w:right w:val="none" w:sz="0" w:space="0" w:color="000000"/>
+            </w:tcBorders>
+            <w:shd w:val="clear" w:color="auto" w:fill="FFFFFF"/>
+            <w:tcMar>
+              <w:top w:w="0" w:type="dxa"/>
+              <w:left w:w="0" w:type="dxa"/>
+              <w:bottom w:w="0" w:type="dxa"/>
+              <w:right w:w="0" w:type="dxa"/>
+            </w:tcMar>
+            <w:vAlign w:val="center"/>
+          </w:tcPr>
+          <w:p>
+            <w:pPr>
+              <w:pBdr>
+                <w:top w:val="none" w:sz="0" w:space="0" w:color="000000"/>
+                <w:left w:val="none" w:sz="0" w:space="0" w:color="000000"/>
+                <w:bottom w:val="none" w:sz="0" w:space="0" w:color="000000"/>
+                <w:right w:val="none" w:sz="0" w:space="0" w:color="000000"/>
+              </w:pBdr>
+              <w:spacing w:before="80" w:after="80"/>
+              <w:ind w:left="80" w:right="80"/>
+              <w:rPr>
+                <w:rFonts w:ascii="Helvetica" w:eastAsia="Helvetica" w:hAnsi="Helvetica" w:cs="Helvetica"/>
+                <w:color w:val="000000"/>
+                <w:sz w:val="20"/>
+                <w:szCs w:val="20"/>
+              </w:rPr>
+            </w:pPr>
+            <w:r>
+              <w:rPr>
+                <w:rFonts w:ascii="Helvetica" w:eastAsia="Helvetica" w:hAnsi="Helvetica" w:cs="Helvetica"/>
                 <w:color w:val="000000"/>
                 <w:sz w:val="20"/>
                 <w:szCs w:val="20"/>
@@ -1011,9 +1370,26 @@
         </w:tc>
       </w:tr>
       <w:tr>
-        <w:tc>
-          <w:tcPr>
-            <w:tcW w:w="513" w:type="pct"/>
+        <w:trPr>
+          <w:jc w:val="center"/>
+        </w:trPr>
+        <w:tc>
+          <w:tcPr>
+            <w:tcW w:w="0" w:type="auto"/>
+            <w:tcBorders>
+              <w:top w:val="none" w:sz="0" w:space="0" w:color="000000"/>
+              <w:left w:val="none" w:sz="0" w:space="0" w:color="000000"/>
+              <w:bottom w:val="none" w:sz="0" w:space="0" w:color="000000"/>
+              <w:right w:val="none" w:sz="0" w:space="0" w:color="000000"/>
+            </w:tcBorders>
+            <w:shd w:val="clear" w:color="auto" w:fill="FFFFFF"/>
+            <w:tcMar>
+              <w:top w:w="0" w:type="dxa"/>
+              <w:left w:w="0" w:type="dxa"/>
+              <w:bottom w:w="0" w:type="dxa"/>
+              <w:right w:w="0" w:type="dxa"/>
+            </w:tcMar>
+            <w:vAlign w:val="center"/>
           </w:tcPr>
           <w:p>
             <w:pPr>
@@ -1046,17 +1422,32 @@
         <w:tc>
           <w:tcPr>
             <w:tcW w:w="0" w:type="auto"/>
-          </w:tcPr>
-          <w:p>
-            <w:pPr>
-              <w:pBdr>
-                <w:top w:val="none" w:sz="0" w:space="0" w:color="000000"/>
-                <w:left w:val="none" w:sz="0" w:space="0" w:color="000000"/>
-                <w:bottom w:val="none" w:sz="0" w:space="0" w:color="000000"/>
-                <w:right w:val="none" w:sz="0" w:space="0" w:color="000000"/>
-              </w:pBdr>
-              <w:spacing w:before="80" w:after="80"/>
-              <w:ind w:left="80" w:right="80"/>
+            <w:tcBorders>
+              <w:top w:val="none" w:sz="0" w:space="0" w:color="000000"/>
+              <w:left w:val="none" w:sz="0" w:space="0" w:color="000000"/>
+              <w:bottom w:val="none" w:sz="0" w:space="0" w:color="000000"/>
+              <w:right w:val="none" w:sz="0" w:space="0" w:color="000000"/>
+            </w:tcBorders>
+            <w:shd w:val="clear" w:color="auto" w:fill="FFFFFF"/>
+            <w:tcMar>
+              <w:top w:w="0" w:type="dxa"/>
+              <w:left w:w="0" w:type="dxa"/>
+              <w:bottom w:w="0" w:type="dxa"/>
+              <w:right w:w="0" w:type="dxa"/>
+            </w:tcMar>
+            <w:vAlign w:val="center"/>
+          </w:tcPr>
+          <w:p>
+            <w:pPr>
+              <w:pBdr>
+                <w:top w:val="none" w:sz="0" w:space="0" w:color="000000"/>
+                <w:left w:val="none" w:sz="0" w:space="0" w:color="000000"/>
+                <w:bottom w:val="none" w:sz="0" w:space="0" w:color="000000"/>
+                <w:right w:val="none" w:sz="0" w:space="0" w:color="000000"/>
+              </w:pBdr>
+              <w:spacing w:before="80" w:after="80"/>
+              <w:ind w:left="80" w:right="80"/>
+              <w:jc w:val="right"/>
               <w:rPr>
                 <w:rFonts w:ascii="Helvetica" w:eastAsia="Helvetica" w:hAnsi="Helvetica" w:cs="Helvetica"/>
                 <w:color w:val="000000"/>
@@ -1078,38 +1469,67 @@
         <w:tc>
           <w:tcPr>
             <w:tcW w:w="0" w:type="auto"/>
-          </w:tcPr>
-          <w:p>
-            <w:pPr>
-              <w:pBdr>
-                <w:top w:val="none" w:sz="0" w:space="0" w:color="000000"/>
-                <w:left w:val="none" w:sz="0" w:space="0" w:color="000000"/>
-                <w:bottom w:val="none" w:sz="0" w:space="0" w:color="000000"/>
-                <w:right w:val="none" w:sz="0" w:space="0" w:color="000000"/>
-              </w:pBdr>
-              <w:spacing w:before="80" w:after="80"/>
-              <w:ind w:left="80" w:right="80"/>
-              <w:rPr>
-                <w:rFonts w:ascii="Helvetica" w:eastAsia="Helvetica" w:hAnsi="Helvetica" w:cs="Helvetica"/>
-                <w:color w:val="000000"/>
-                <w:sz w:val="20"/>
-                <w:szCs w:val="20"/>
-              </w:rPr>
-            </w:pPr>
-            <w:r>
-              <w:rPr>
-                <w:rFonts w:ascii="Helvetica" w:eastAsia="Helvetica" w:hAnsi="Helvetica" w:cs="Helvetica"/>
-                <w:color w:val="000000"/>
-                <w:sz w:val="20"/>
-                <w:szCs w:val="20"/>
-              </w:rPr>
-              <w:t>41</w:t>
-            </w:r>
-          </w:p>
-        </w:tc>
-        <w:tc>
-          <w:tcPr>
-            <w:tcW w:w="693" w:type="pct"/>
+            <w:tcBorders>
+              <w:top w:val="none" w:sz="0" w:space="0" w:color="000000"/>
+              <w:left w:val="none" w:sz="0" w:space="0" w:color="000000"/>
+              <w:bottom w:val="none" w:sz="0" w:space="0" w:color="000000"/>
+              <w:right w:val="none" w:sz="0" w:space="0" w:color="000000"/>
+            </w:tcBorders>
+            <w:shd w:val="clear" w:color="auto" w:fill="FFFFFF"/>
+            <w:tcMar>
+              <w:top w:w="0" w:type="dxa"/>
+              <w:left w:w="0" w:type="dxa"/>
+              <w:bottom w:w="0" w:type="dxa"/>
+              <w:right w:w="0" w:type="dxa"/>
+            </w:tcMar>
+            <w:vAlign w:val="center"/>
+          </w:tcPr>
+          <w:p>
+            <w:pPr>
+              <w:pBdr>
+                <w:top w:val="none" w:sz="0" w:space="0" w:color="000000"/>
+                <w:left w:val="none" w:sz="0" w:space="0" w:color="000000"/>
+                <w:bottom w:val="none" w:sz="0" w:space="0" w:color="000000"/>
+                <w:right w:val="none" w:sz="0" w:space="0" w:color="000000"/>
+              </w:pBdr>
+              <w:spacing w:before="80" w:after="80"/>
+              <w:ind w:left="80" w:right="80"/>
+              <w:jc w:val="right"/>
+              <w:rPr>
+                <w:rFonts w:ascii="Helvetica" w:eastAsia="Helvetica" w:hAnsi="Helvetica" w:cs="Helvetica"/>
+                <w:color w:val="000000"/>
+                <w:sz w:val="20"/>
+                <w:szCs w:val="20"/>
+              </w:rPr>
+            </w:pPr>
+            <w:r>
+              <w:rPr>
+                <w:rFonts w:ascii="Helvetica" w:eastAsia="Helvetica" w:hAnsi="Helvetica" w:cs="Helvetica"/>
+                <w:color w:val="000000"/>
+                <w:sz w:val="20"/>
+                <w:szCs w:val="20"/>
+              </w:rPr>
+              <w:t>53</w:t>
+            </w:r>
+          </w:p>
+        </w:tc>
+        <w:tc>
+          <w:tcPr>
+            <w:tcW w:w="0" w:type="auto"/>
+            <w:tcBorders>
+              <w:top w:val="none" w:sz="0" w:space="0" w:color="000000"/>
+              <w:left w:val="none" w:sz="0" w:space="0" w:color="000000"/>
+              <w:bottom w:val="none" w:sz="0" w:space="0" w:color="000000"/>
+              <w:right w:val="none" w:sz="0" w:space="0" w:color="000000"/>
+            </w:tcBorders>
+            <w:shd w:val="clear" w:color="auto" w:fill="FFFFFF"/>
+            <w:tcMar>
+              <w:top w:w="0" w:type="dxa"/>
+              <w:left w:w="0" w:type="dxa"/>
+              <w:bottom w:w="0" w:type="dxa"/>
+              <w:right w:w="0" w:type="dxa"/>
+            </w:tcMar>
+            <w:vAlign w:val="center"/>
           </w:tcPr>
           <w:p>
             <w:pPr>
@@ -1141,169 +1561,256 @@
         </w:tc>
         <w:tc>
           <w:tcPr>
-            <w:tcW w:w="619" w:type="pct"/>
-          </w:tcPr>
-          <w:p>
-            <w:pPr>
-              <w:pBdr>
-                <w:top w:val="none" w:sz="0" w:space="0" w:color="000000"/>
-                <w:left w:val="none" w:sz="0" w:space="0" w:color="000000"/>
-                <w:bottom w:val="none" w:sz="0" w:space="0" w:color="000000"/>
-                <w:right w:val="none" w:sz="0" w:space="0" w:color="000000"/>
-              </w:pBdr>
-              <w:spacing w:before="80" w:after="80"/>
-              <w:ind w:left="80" w:right="80"/>
-              <w:rPr>
-                <w:rFonts w:ascii="Helvetica" w:eastAsia="Helvetica" w:hAnsi="Helvetica" w:cs="Helvetica"/>
-                <w:color w:val="000000"/>
-                <w:sz w:val="20"/>
-                <w:szCs w:val="20"/>
-              </w:rPr>
-            </w:pPr>
-            <w:r>
-              <w:rPr>
-                <w:rFonts w:ascii="Helvetica" w:eastAsia="Helvetica" w:hAnsi="Helvetica" w:cs="Helvetica"/>
-                <w:color w:val="000000"/>
-                <w:sz w:val="20"/>
-                <w:szCs w:val="20"/>
-              </w:rPr>
-              <w:t>-0.006 [-0.036, 0.024]</w:t>
-            </w:r>
-          </w:p>
-        </w:tc>
-        <w:tc>
-          <w:tcPr>
-            <w:tcW w:w="620" w:type="pct"/>
-          </w:tcPr>
-          <w:p>
-            <w:pPr>
-              <w:pBdr>
-                <w:top w:val="none" w:sz="0" w:space="0" w:color="000000"/>
-                <w:left w:val="none" w:sz="0" w:space="0" w:color="000000"/>
-                <w:bottom w:val="none" w:sz="0" w:space="0" w:color="000000"/>
-                <w:right w:val="none" w:sz="0" w:space="0" w:color="000000"/>
-              </w:pBdr>
-              <w:spacing w:before="80" w:after="80"/>
-              <w:ind w:left="80" w:right="80"/>
-              <w:rPr>
-                <w:rFonts w:ascii="Helvetica" w:eastAsia="Helvetica" w:hAnsi="Helvetica" w:cs="Helvetica"/>
-                <w:color w:val="000000"/>
-                <w:sz w:val="20"/>
-                <w:szCs w:val="20"/>
-              </w:rPr>
-            </w:pPr>
-            <w:r>
-              <w:rPr>
-                <w:rFonts w:ascii="Helvetica" w:eastAsia="Helvetica" w:hAnsi="Helvetica" w:cs="Helvetica"/>
-                <w:color w:val="000000"/>
-                <w:sz w:val="20"/>
-                <w:szCs w:val="20"/>
-              </w:rPr>
-              <w:t>0.138 [0.119, 0.16]</w:t>
-            </w:r>
-          </w:p>
-        </w:tc>
-        <w:tc>
-          <w:tcPr>
-            <w:tcW w:w="708" w:type="pct"/>
-          </w:tcPr>
-          <w:p>
-            <w:pPr>
-              <w:pBdr>
-                <w:top w:val="none" w:sz="0" w:space="0" w:color="000000"/>
-                <w:left w:val="none" w:sz="0" w:space="0" w:color="000000"/>
-                <w:bottom w:val="none" w:sz="0" w:space="0" w:color="000000"/>
-                <w:right w:val="none" w:sz="0" w:space="0" w:color="000000"/>
-              </w:pBdr>
-              <w:spacing w:before="80" w:after="80"/>
-              <w:ind w:left="80" w:right="80"/>
-              <w:rPr>
-                <w:rFonts w:ascii="Helvetica" w:eastAsia="Helvetica" w:hAnsi="Helvetica" w:cs="Helvetica"/>
-                <w:color w:val="000000"/>
-                <w:sz w:val="20"/>
-                <w:szCs w:val="20"/>
-              </w:rPr>
-            </w:pPr>
-            <w:r>
-              <w:rPr>
-                <w:rFonts w:ascii="Helvetica" w:eastAsia="Helvetica" w:hAnsi="Helvetica" w:cs="Helvetica"/>
-                <w:color w:val="000000"/>
-                <w:sz w:val="20"/>
-                <w:szCs w:val="20"/>
-              </w:rPr>
-              <w:t>-0.011 [-0.045, 0.022]</w:t>
-            </w:r>
-          </w:p>
-        </w:tc>
-        <w:tc>
-          <w:tcPr>
-            <w:tcW w:w="442" w:type="pct"/>
-          </w:tcPr>
-          <w:p>
-            <w:pPr>
-              <w:pBdr>
-                <w:top w:val="none" w:sz="0" w:space="0" w:color="000000"/>
-                <w:left w:val="none" w:sz="0" w:space="0" w:color="000000"/>
-                <w:bottom w:val="none" w:sz="0" w:space="0" w:color="000000"/>
-                <w:right w:val="none" w:sz="0" w:space="0" w:color="000000"/>
-              </w:pBdr>
-              <w:spacing w:before="80" w:after="80"/>
-              <w:ind w:left="80" w:right="80"/>
-              <w:rPr>
-                <w:rFonts w:ascii="Helvetica" w:eastAsia="Helvetica" w:hAnsi="Helvetica" w:cs="Helvetica"/>
-                <w:color w:val="000000"/>
-                <w:sz w:val="20"/>
-                <w:szCs w:val="20"/>
-              </w:rPr>
-            </w:pPr>
-            <w:r>
-              <w:rPr>
-                <w:rFonts w:ascii="Helvetica" w:eastAsia="Helvetica" w:hAnsi="Helvetica" w:cs="Helvetica"/>
-                <w:color w:val="000000"/>
-                <w:sz w:val="20"/>
-                <w:szCs w:val="20"/>
-              </w:rPr>
-              <w:t>0.820</w:t>
-            </w:r>
-          </w:p>
-        </w:tc>
-        <w:tc>
-          <w:tcPr>
-            <w:tcW w:w="575" w:type="pct"/>
-          </w:tcPr>
-          <w:p>
-            <w:pPr>
-              <w:pBdr>
-                <w:top w:val="none" w:sz="0" w:space="0" w:color="000000"/>
-                <w:left w:val="none" w:sz="0" w:space="0" w:color="000000"/>
-                <w:bottom w:val="none" w:sz="0" w:space="0" w:color="000000"/>
-                <w:right w:val="none" w:sz="0" w:space="0" w:color="000000"/>
-              </w:pBdr>
-              <w:spacing w:before="80" w:after="80"/>
-              <w:ind w:left="80" w:right="80"/>
-              <w:rPr>
-                <w:rFonts w:ascii="Helvetica" w:eastAsia="Helvetica" w:hAnsi="Helvetica" w:cs="Helvetica"/>
-                <w:color w:val="000000"/>
-                <w:sz w:val="20"/>
-                <w:szCs w:val="20"/>
-              </w:rPr>
-            </w:pPr>
-            <w:r>
-              <w:rPr>
-                <w:rFonts w:ascii="Helvetica" w:eastAsia="Helvetica" w:hAnsi="Helvetica" w:cs="Helvetica"/>
-                <w:color w:val="000000"/>
-                <w:sz w:val="20"/>
-                <w:szCs w:val="20"/>
-              </w:rPr>
-              <w:t>0.616</w:t>
+            <w:tcW w:w="0" w:type="auto"/>
+            <w:tcBorders>
+              <w:top w:val="none" w:sz="0" w:space="0" w:color="000000"/>
+              <w:left w:val="none" w:sz="0" w:space="0" w:color="000000"/>
+              <w:bottom w:val="none" w:sz="0" w:space="0" w:color="000000"/>
+              <w:right w:val="none" w:sz="0" w:space="0" w:color="000000"/>
+            </w:tcBorders>
+            <w:shd w:val="clear" w:color="auto" w:fill="FFFFFF"/>
+            <w:tcMar>
+              <w:top w:w="0" w:type="dxa"/>
+              <w:left w:w="0" w:type="dxa"/>
+              <w:bottom w:w="0" w:type="dxa"/>
+              <w:right w:w="0" w:type="dxa"/>
+            </w:tcMar>
+            <w:vAlign w:val="center"/>
+          </w:tcPr>
+          <w:p>
+            <w:pPr>
+              <w:pBdr>
+                <w:top w:val="none" w:sz="0" w:space="0" w:color="000000"/>
+                <w:left w:val="none" w:sz="0" w:space="0" w:color="000000"/>
+                <w:bottom w:val="none" w:sz="0" w:space="0" w:color="000000"/>
+                <w:right w:val="none" w:sz="0" w:space="0" w:color="000000"/>
+              </w:pBdr>
+              <w:spacing w:before="80" w:after="80"/>
+              <w:ind w:left="80" w:right="80"/>
+              <w:rPr>
+                <w:rFonts w:ascii="Helvetica" w:eastAsia="Helvetica" w:hAnsi="Helvetica" w:cs="Helvetica"/>
+                <w:color w:val="000000"/>
+                <w:sz w:val="20"/>
+                <w:szCs w:val="20"/>
+              </w:rPr>
+            </w:pPr>
+            <w:r>
+              <w:rPr>
+                <w:rFonts w:ascii="Helvetica" w:eastAsia="Helvetica" w:hAnsi="Helvetica" w:cs="Helvetica"/>
+                <w:color w:val="000000"/>
+                <w:sz w:val="20"/>
+                <w:szCs w:val="20"/>
+              </w:rPr>
+              <w:t>-0.006 [-0.036, 0.023]</w:t>
+            </w:r>
+          </w:p>
+        </w:tc>
+        <w:tc>
+          <w:tcPr>
+            <w:tcW w:w="0" w:type="auto"/>
+            <w:tcBorders>
+              <w:top w:val="none" w:sz="0" w:space="0" w:color="000000"/>
+              <w:left w:val="none" w:sz="0" w:space="0" w:color="000000"/>
+              <w:bottom w:val="none" w:sz="0" w:space="0" w:color="000000"/>
+              <w:right w:val="none" w:sz="0" w:space="0" w:color="000000"/>
+            </w:tcBorders>
+            <w:shd w:val="clear" w:color="auto" w:fill="FFFFFF"/>
+            <w:tcMar>
+              <w:top w:w="0" w:type="dxa"/>
+              <w:left w:w="0" w:type="dxa"/>
+              <w:bottom w:w="0" w:type="dxa"/>
+              <w:right w:w="0" w:type="dxa"/>
+            </w:tcMar>
+            <w:vAlign w:val="center"/>
+          </w:tcPr>
+          <w:p>
+            <w:pPr>
+              <w:pBdr>
+                <w:top w:val="none" w:sz="0" w:space="0" w:color="000000"/>
+                <w:left w:val="none" w:sz="0" w:space="0" w:color="000000"/>
+                <w:bottom w:val="none" w:sz="0" w:space="0" w:color="000000"/>
+                <w:right w:val="none" w:sz="0" w:space="0" w:color="000000"/>
+              </w:pBdr>
+              <w:spacing w:before="80" w:after="80"/>
+              <w:ind w:left="80" w:right="80"/>
+              <w:rPr>
+                <w:rFonts w:ascii="Helvetica" w:eastAsia="Helvetica" w:hAnsi="Helvetica" w:cs="Helvetica"/>
+                <w:color w:val="000000"/>
+                <w:sz w:val="20"/>
+                <w:szCs w:val="20"/>
+              </w:rPr>
+            </w:pPr>
+            <w:r>
+              <w:rPr>
+                <w:rFonts w:ascii="Helvetica" w:eastAsia="Helvetica" w:hAnsi="Helvetica" w:cs="Helvetica"/>
+                <w:color w:val="000000"/>
+                <w:sz w:val="20"/>
+                <w:szCs w:val="20"/>
+              </w:rPr>
+              <w:t>0.142 [0.13, 0.155]</w:t>
+            </w:r>
+          </w:p>
+        </w:tc>
+        <w:tc>
+          <w:tcPr>
+            <w:tcW w:w="0" w:type="auto"/>
+            <w:tcBorders>
+              <w:top w:val="none" w:sz="0" w:space="0" w:color="000000"/>
+              <w:left w:val="none" w:sz="0" w:space="0" w:color="000000"/>
+              <w:bottom w:val="none" w:sz="0" w:space="0" w:color="000000"/>
+              <w:right w:val="none" w:sz="0" w:space="0" w:color="000000"/>
+            </w:tcBorders>
+            <w:shd w:val="clear" w:color="auto" w:fill="FFFFFF"/>
+            <w:tcMar>
+              <w:top w:w="0" w:type="dxa"/>
+              <w:left w:w="0" w:type="dxa"/>
+              <w:bottom w:w="0" w:type="dxa"/>
+              <w:right w:w="0" w:type="dxa"/>
+            </w:tcMar>
+            <w:vAlign w:val="center"/>
+          </w:tcPr>
+          <w:p>
+            <w:pPr>
+              <w:pBdr>
+                <w:top w:val="none" w:sz="0" w:space="0" w:color="000000"/>
+                <w:left w:val="none" w:sz="0" w:space="0" w:color="000000"/>
+                <w:bottom w:val="none" w:sz="0" w:space="0" w:color="000000"/>
+                <w:right w:val="none" w:sz="0" w:space="0" w:color="000000"/>
+              </w:pBdr>
+              <w:spacing w:before="80" w:after="80"/>
+              <w:ind w:left="80" w:right="80"/>
+              <w:rPr>
+                <w:rFonts w:ascii="Helvetica" w:eastAsia="Helvetica" w:hAnsi="Helvetica" w:cs="Helvetica"/>
+                <w:color w:val="000000"/>
+                <w:sz w:val="20"/>
+                <w:szCs w:val="20"/>
+              </w:rPr>
+            </w:pPr>
+            <w:r>
+              <w:rPr>
+                <w:rFonts w:ascii="Helvetica" w:eastAsia="Helvetica" w:hAnsi="Helvetica" w:cs="Helvetica"/>
+                <w:color w:val="000000"/>
+                <w:sz w:val="20"/>
+                <w:szCs w:val="20"/>
+              </w:rPr>
+              <w:t>-0.014 [-0.034, 0.006]</w:t>
+            </w:r>
+          </w:p>
+        </w:tc>
+        <w:tc>
+          <w:tcPr>
+            <w:tcW w:w="0" w:type="auto"/>
+            <w:tcBorders>
+              <w:top w:val="none" w:sz="0" w:space="0" w:color="000000"/>
+              <w:left w:val="none" w:sz="0" w:space="0" w:color="000000"/>
+              <w:bottom w:val="none" w:sz="0" w:space="0" w:color="000000"/>
+              <w:right w:val="none" w:sz="0" w:space="0" w:color="000000"/>
+            </w:tcBorders>
+            <w:shd w:val="clear" w:color="auto" w:fill="FFFFFF"/>
+            <w:tcMar>
+              <w:top w:w="0" w:type="dxa"/>
+              <w:left w:w="0" w:type="dxa"/>
+              <w:bottom w:w="0" w:type="dxa"/>
+              <w:right w:w="0" w:type="dxa"/>
+            </w:tcMar>
+            <w:vAlign w:val="center"/>
+          </w:tcPr>
+          <w:p>
+            <w:pPr>
+              <w:pBdr>
+                <w:top w:val="none" w:sz="0" w:space="0" w:color="000000"/>
+                <w:left w:val="none" w:sz="0" w:space="0" w:color="000000"/>
+                <w:bottom w:val="none" w:sz="0" w:space="0" w:color="000000"/>
+                <w:right w:val="none" w:sz="0" w:space="0" w:color="000000"/>
+              </w:pBdr>
+              <w:spacing w:before="80" w:after="80"/>
+              <w:ind w:left="80" w:right="80"/>
+              <w:rPr>
+                <w:rFonts w:ascii="Helvetica" w:eastAsia="Helvetica" w:hAnsi="Helvetica" w:cs="Helvetica"/>
+                <w:color w:val="000000"/>
+                <w:sz w:val="20"/>
+                <w:szCs w:val="20"/>
+              </w:rPr>
+            </w:pPr>
+            <w:r>
+              <w:rPr>
+                <w:rFonts w:ascii="Helvetica" w:eastAsia="Helvetica" w:hAnsi="Helvetica" w:cs="Helvetica"/>
+                <w:color w:val="000000"/>
+                <w:sz w:val="20"/>
+                <w:szCs w:val="20"/>
+              </w:rPr>
+              <w:t>0.662</w:t>
+            </w:r>
+          </w:p>
+        </w:tc>
+        <w:tc>
+          <w:tcPr>
+            <w:tcW w:w="0" w:type="auto"/>
+            <w:tcBorders>
+              <w:top w:val="none" w:sz="0" w:space="0" w:color="000000"/>
+              <w:left w:val="none" w:sz="0" w:space="0" w:color="000000"/>
+              <w:bottom w:val="none" w:sz="0" w:space="0" w:color="000000"/>
+              <w:right w:val="none" w:sz="0" w:space="0" w:color="000000"/>
+            </w:tcBorders>
+            <w:shd w:val="clear" w:color="auto" w:fill="FFFFFF"/>
+            <w:tcMar>
+              <w:top w:w="0" w:type="dxa"/>
+              <w:left w:w="0" w:type="dxa"/>
+              <w:bottom w:w="0" w:type="dxa"/>
+              <w:right w:w="0" w:type="dxa"/>
+            </w:tcMar>
+            <w:vAlign w:val="center"/>
+          </w:tcPr>
+          <w:p>
+            <w:pPr>
+              <w:pBdr>
+                <w:top w:val="none" w:sz="0" w:space="0" w:color="000000"/>
+                <w:left w:val="none" w:sz="0" w:space="0" w:color="000000"/>
+                <w:bottom w:val="none" w:sz="0" w:space="0" w:color="000000"/>
+                <w:right w:val="none" w:sz="0" w:space="0" w:color="000000"/>
+              </w:pBdr>
+              <w:spacing w:before="80" w:after="80"/>
+              <w:ind w:left="80" w:right="80"/>
+              <w:rPr>
+                <w:rFonts w:ascii="Helvetica" w:eastAsia="Helvetica" w:hAnsi="Helvetica" w:cs="Helvetica"/>
+                <w:color w:val="000000"/>
+                <w:sz w:val="20"/>
+                <w:szCs w:val="20"/>
+              </w:rPr>
+            </w:pPr>
+            <w:r>
+              <w:rPr>
+                <w:rFonts w:ascii="Helvetica" w:eastAsia="Helvetica" w:hAnsi="Helvetica" w:cs="Helvetica"/>
+                <w:color w:val="000000"/>
+                <w:sz w:val="20"/>
+                <w:szCs w:val="20"/>
+              </w:rPr>
+              <w:t>0.305</w:t>
             </w:r>
           </w:p>
         </w:tc>
       </w:tr>
       <w:tr>
-        <w:tc>
-          <w:tcPr>
-            <w:tcW w:w="513" w:type="pct"/>
+        <w:trPr>
+          <w:jc w:val="center"/>
+        </w:trPr>
+        <w:tc>
+          <w:tcPr>
+            <w:tcW w:w="0" w:type="auto"/>
+            <w:tcBorders>
+              <w:top w:val="none" w:sz="0" w:space="0" w:color="000000"/>
+              <w:left w:val="none" w:sz="0" w:space="0" w:color="000000"/>
+              <w:bottom w:val="none" w:sz="0" w:space="0" w:color="000000"/>
+              <w:right w:val="none" w:sz="0" w:space="0" w:color="000000"/>
+            </w:tcBorders>
+            <w:shd w:val="clear" w:color="auto" w:fill="FFFFFF"/>
+            <w:tcMar>
+              <w:top w:w="0" w:type="dxa"/>
+              <w:left w:w="0" w:type="dxa"/>
+              <w:bottom w:w="0" w:type="dxa"/>
+              <w:right w:w="0" w:type="dxa"/>
+            </w:tcMar>
+            <w:vAlign w:val="center"/>
           </w:tcPr>
           <w:p>
             <w:pPr>
@@ -1336,17 +1843,32 @@
         <w:tc>
           <w:tcPr>
             <w:tcW w:w="0" w:type="auto"/>
-          </w:tcPr>
-          <w:p>
-            <w:pPr>
-              <w:pBdr>
-                <w:top w:val="none" w:sz="0" w:space="0" w:color="000000"/>
-                <w:left w:val="none" w:sz="0" w:space="0" w:color="000000"/>
-                <w:bottom w:val="none" w:sz="0" w:space="0" w:color="000000"/>
-                <w:right w:val="none" w:sz="0" w:space="0" w:color="000000"/>
-              </w:pBdr>
-              <w:spacing w:before="80" w:after="80"/>
-              <w:ind w:left="80" w:right="80"/>
+            <w:tcBorders>
+              <w:top w:val="none" w:sz="0" w:space="0" w:color="000000"/>
+              <w:left w:val="none" w:sz="0" w:space="0" w:color="000000"/>
+              <w:bottom w:val="none" w:sz="0" w:space="0" w:color="000000"/>
+              <w:right w:val="none" w:sz="0" w:space="0" w:color="000000"/>
+            </w:tcBorders>
+            <w:shd w:val="clear" w:color="auto" w:fill="FFFFFF"/>
+            <w:tcMar>
+              <w:top w:w="0" w:type="dxa"/>
+              <w:left w:w="0" w:type="dxa"/>
+              <w:bottom w:w="0" w:type="dxa"/>
+              <w:right w:w="0" w:type="dxa"/>
+            </w:tcMar>
+            <w:vAlign w:val="center"/>
+          </w:tcPr>
+          <w:p>
+            <w:pPr>
+              <w:pBdr>
+                <w:top w:val="none" w:sz="0" w:space="0" w:color="000000"/>
+                <w:left w:val="none" w:sz="0" w:space="0" w:color="000000"/>
+                <w:bottom w:val="none" w:sz="0" w:space="0" w:color="000000"/>
+                <w:right w:val="none" w:sz="0" w:space="0" w:color="000000"/>
+              </w:pBdr>
+              <w:spacing w:before="80" w:after="80"/>
+              <w:ind w:left="80" w:right="80"/>
+              <w:jc w:val="right"/>
               <w:rPr>
                 <w:rFonts w:ascii="Helvetica" w:eastAsia="Helvetica" w:hAnsi="Helvetica" w:cs="Helvetica"/>
                 <w:color w:val="000000"/>
@@ -1368,17 +1890,32 @@
         <w:tc>
           <w:tcPr>
             <w:tcW w:w="0" w:type="auto"/>
-          </w:tcPr>
-          <w:p>
-            <w:pPr>
-              <w:pBdr>
-                <w:top w:val="none" w:sz="0" w:space="0" w:color="000000"/>
-                <w:left w:val="none" w:sz="0" w:space="0" w:color="000000"/>
-                <w:bottom w:val="none" w:sz="0" w:space="0" w:color="000000"/>
-                <w:right w:val="none" w:sz="0" w:space="0" w:color="000000"/>
-              </w:pBdr>
-              <w:spacing w:before="80" w:after="80"/>
-              <w:ind w:left="80" w:right="80"/>
+            <w:tcBorders>
+              <w:top w:val="none" w:sz="0" w:space="0" w:color="000000"/>
+              <w:left w:val="none" w:sz="0" w:space="0" w:color="000000"/>
+              <w:bottom w:val="none" w:sz="0" w:space="0" w:color="000000"/>
+              <w:right w:val="none" w:sz="0" w:space="0" w:color="000000"/>
+            </w:tcBorders>
+            <w:shd w:val="clear" w:color="auto" w:fill="FFFFFF"/>
+            <w:tcMar>
+              <w:top w:w="0" w:type="dxa"/>
+              <w:left w:w="0" w:type="dxa"/>
+              <w:bottom w:w="0" w:type="dxa"/>
+              <w:right w:w="0" w:type="dxa"/>
+            </w:tcMar>
+            <w:vAlign w:val="center"/>
+          </w:tcPr>
+          <w:p>
+            <w:pPr>
+              <w:pBdr>
+                <w:top w:val="none" w:sz="0" w:space="0" w:color="000000"/>
+                <w:left w:val="none" w:sz="0" w:space="0" w:color="000000"/>
+                <w:bottom w:val="none" w:sz="0" w:space="0" w:color="000000"/>
+                <w:right w:val="none" w:sz="0" w:space="0" w:color="000000"/>
+              </w:pBdr>
+              <w:spacing w:before="80" w:after="80"/>
+              <w:ind w:left="80" w:right="80"/>
+              <w:jc w:val="right"/>
               <w:rPr>
                 <w:rFonts w:ascii="Helvetica" w:eastAsia="Helvetica" w:hAnsi="Helvetica" w:cs="Helvetica"/>
                 <w:color w:val="000000"/>
@@ -1399,7 +1936,21 @@
         </w:tc>
         <w:tc>
           <w:tcPr>
-            <w:tcW w:w="693" w:type="pct"/>
+            <w:tcW w:w="0" w:type="auto"/>
+            <w:tcBorders>
+              <w:top w:val="none" w:sz="0" w:space="0" w:color="000000"/>
+              <w:left w:val="none" w:sz="0" w:space="0" w:color="000000"/>
+              <w:bottom w:val="none" w:sz="0" w:space="0" w:color="000000"/>
+              <w:right w:val="none" w:sz="0" w:space="0" w:color="000000"/>
+            </w:tcBorders>
+            <w:shd w:val="clear" w:color="auto" w:fill="FFFFFF"/>
+            <w:tcMar>
+              <w:top w:w="0" w:type="dxa"/>
+              <w:left w:w="0" w:type="dxa"/>
+              <w:bottom w:w="0" w:type="dxa"/>
+              <w:right w:w="0" w:type="dxa"/>
+            </w:tcMar>
+            <w:vAlign w:val="center"/>
           </w:tcPr>
           <w:p>
             <w:pPr>
@@ -1431,7 +1982,21 @@
         </w:tc>
         <w:tc>
           <w:tcPr>
-            <w:tcW w:w="619" w:type="pct"/>
+            <w:tcW w:w="0" w:type="auto"/>
+            <w:tcBorders>
+              <w:top w:val="none" w:sz="0" w:space="0" w:color="000000"/>
+              <w:left w:val="none" w:sz="0" w:space="0" w:color="000000"/>
+              <w:bottom w:val="none" w:sz="0" w:space="0" w:color="000000"/>
+              <w:right w:val="none" w:sz="0" w:space="0" w:color="000000"/>
+            </w:tcBorders>
+            <w:shd w:val="clear" w:color="auto" w:fill="FFFFFF"/>
+            <w:tcMar>
+              <w:top w:w="0" w:type="dxa"/>
+              <w:left w:w="0" w:type="dxa"/>
+              <w:bottom w:w="0" w:type="dxa"/>
+              <w:right w:w="0" w:type="dxa"/>
+            </w:tcMar>
+            <w:vAlign w:val="center"/>
           </w:tcPr>
           <w:p>
             <w:pPr>
@@ -1463,7 +2028,21 @@
         </w:tc>
         <w:tc>
           <w:tcPr>
-            <w:tcW w:w="620" w:type="pct"/>
+            <w:tcW w:w="0" w:type="auto"/>
+            <w:tcBorders>
+              <w:top w:val="none" w:sz="0" w:space="0" w:color="000000"/>
+              <w:left w:val="none" w:sz="0" w:space="0" w:color="000000"/>
+              <w:bottom w:val="none" w:sz="0" w:space="0" w:color="000000"/>
+              <w:right w:val="none" w:sz="0" w:space="0" w:color="000000"/>
+            </w:tcBorders>
+            <w:shd w:val="clear" w:color="auto" w:fill="FFFFFF"/>
+            <w:tcMar>
+              <w:top w:w="0" w:type="dxa"/>
+              <w:left w:w="0" w:type="dxa"/>
+              <w:bottom w:w="0" w:type="dxa"/>
+              <w:right w:w="0" w:type="dxa"/>
+            </w:tcMar>
+            <w:vAlign w:val="center"/>
           </w:tcPr>
           <w:p>
             <w:pPr>
@@ -1495,7 +2074,21 @@
         </w:tc>
         <w:tc>
           <w:tcPr>
-            <w:tcW w:w="708" w:type="pct"/>
+            <w:tcW w:w="0" w:type="auto"/>
+            <w:tcBorders>
+              <w:top w:val="none" w:sz="0" w:space="0" w:color="000000"/>
+              <w:left w:val="none" w:sz="0" w:space="0" w:color="000000"/>
+              <w:bottom w:val="none" w:sz="0" w:space="0" w:color="000000"/>
+              <w:right w:val="none" w:sz="0" w:space="0" w:color="000000"/>
+            </w:tcBorders>
+            <w:shd w:val="clear" w:color="auto" w:fill="FFFFFF"/>
+            <w:tcMar>
+              <w:top w:w="0" w:type="dxa"/>
+              <w:left w:w="0" w:type="dxa"/>
+              <w:bottom w:w="0" w:type="dxa"/>
+              <w:right w:w="0" w:type="dxa"/>
+            </w:tcMar>
+            <w:vAlign w:val="center"/>
           </w:tcPr>
           <w:p>
             <w:pPr>
@@ -1527,7 +2120,21 @@
         </w:tc>
         <w:tc>
           <w:tcPr>
-            <w:tcW w:w="442" w:type="pct"/>
+            <w:tcW w:w="0" w:type="auto"/>
+            <w:tcBorders>
+              <w:top w:val="none" w:sz="0" w:space="0" w:color="000000"/>
+              <w:left w:val="none" w:sz="0" w:space="0" w:color="000000"/>
+              <w:bottom w:val="none" w:sz="0" w:space="0" w:color="000000"/>
+              <w:right w:val="none" w:sz="0" w:space="0" w:color="000000"/>
+            </w:tcBorders>
+            <w:shd w:val="clear" w:color="auto" w:fill="FFFFFF"/>
+            <w:tcMar>
+              <w:top w:w="0" w:type="dxa"/>
+              <w:left w:w="0" w:type="dxa"/>
+              <w:bottom w:w="0" w:type="dxa"/>
+              <w:right w:w="0" w:type="dxa"/>
+            </w:tcMar>
+            <w:vAlign w:val="center"/>
           </w:tcPr>
           <w:p>
             <w:pPr>
@@ -1559,32 +2166,42 @@
         </w:tc>
         <w:tc>
           <w:tcPr>
-            <w:tcW w:w="575" w:type="pct"/>
-          </w:tcPr>
-          <w:p>
-            <w:pPr>
-              <w:pBdr>
-                <w:top w:val="none" w:sz="0" w:space="0" w:color="000000"/>
-                <w:left w:val="none" w:sz="0" w:space="0" w:color="000000"/>
-                <w:bottom w:val="none" w:sz="0" w:space="0" w:color="000000"/>
-                <w:right w:val="none" w:sz="0" w:space="0" w:color="000000"/>
-              </w:pBdr>
-              <w:spacing w:before="80" w:after="80"/>
-              <w:ind w:left="80" w:right="80"/>
-              <w:rPr>
-                <w:rFonts w:ascii="Helvetica" w:eastAsia="Helvetica" w:hAnsi="Helvetica" w:cs="Helvetica"/>
-                <w:b/>
-                <w:bCs/>
-                <w:color w:val="000000"/>
-                <w:sz w:val="20"/>
-                <w:szCs w:val="20"/>
-              </w:rPr>
-            </w:pPr>
-            <w:r>
-              <w:rPr>
-                <w:rFonts w:ascii="Helvetica" w:eastAsia="Helvetica" w:hAnsi="Helvetica" w:cs="Helvetica"/>
-                <w:b/>
-                <w:bCs/>
+            <w:tcW w:w="0" w:type="auto"/>
+            <w:tcBorders>
+              <w:top w:val="none" w:sz="0" w:space="0" w:color="000000"/>
+              <w:left w:val="none" w:sz="0" w:space="0" w:color="000000"/>
+              <w:bottom w:val="none" w:sz="0" w:space="0" w:color="000000"/>
+              <w:right w:val="none" w:sz="0" w:space="0" w:color="000000"/>
+            </w:tcBorders>
+            <w:shd w:val="clear" w:color="auto" w:fill="FFFFFF"/>
+            <w:tcMar>
+              <w:top w:w="0" w:type="dxa"/>
+              <w:left w:w="0" w:type="dxa"/>
+              <w:bottom w:w="0" w:type="dxa"/>
+              <w:right w:w="0" w:type="dxa"/>
+            </w:tcMar>
+            <w:vAlign w:val="center"/>
+          </w:tcPr>
+          <w:p>
+            <w:pPr>
+              <w:pBdr>
+                <w:top w:val="none" w:sz="0" w:space="0" w:color="000000"/>
+                <w:left w:val="none" w:sz="0" w:space="0" w:color="000000"/>
+                <w:bottom w:val="none" w:sz="0" w:space="0" w:color="000000"/>
+                <w:right w:val="none" w:sz="0" w:space="0" w:color="000000"/>
+              </w:pBdr>
+              <w:spacing w:before="80" w:after="80"/>
+              <w:ind w:left="80" w:right="80"/>
+              <w:rPr>
+                <w:rFonts w:ascii="Helvetica" w:eastAsia="Helvetica" w:hAnsi="Helvetica" w:cs="Helvetica"/>
+                <w:color w:val="000000"/>
+                <w:sz w:val="20"/>
+                <w:szCs w:val="20"/>
+              </w:rPr>
+            </w:pPr>
+            <w:r>
+              <w:rPr>
+                <w:rFonts w:ascii="Helvetica" w:eastAsia="Helvetica" w:hAnsi="Helvetica" w:cs="Helvetica"/>
                 <w:color w:val="000000"/>
                 <w:sz w:val="20"/>
                 <w:szCs w:val="20"/>
@@ -1595,9 +2212,26 @@
         </w:tc>
       </w:tr>
       <w:tr>
-        <w:tc>
-          <w:tcPr>
-            <w:tcW w:w="513" w:type="pct"/>
+        <w:trPr>
+          <w:jc w:val="center"/>
+        </w:trPr>
+        <w:tc>
+          <w:tcPr>
+            <w:tcW w:w="0" w:type="auto"/>
+            <w:tcBorders>
+              <w:top w:val="none" w:sz="0" w:space="0" w:color="000000"/>
+              <w:left w:val="none" w:sz="0" w:space="0" w:color="000000"/>
+              <w:bottom w:val="none" w:sz="0" w:space="0" w:color="000000"/>
+              <w:right w:val="none" w:sz="0" w:space="0" w:color="000000"/>
+            </w:tcBorders>
+            <w:shd w:val="clear" w:color="auto" w:fill="FFFFFF"/>
+            <w:tcMar>
+              <w:top w:w="0" w:type="dxa"/>
+              <w:left w:w="0" w:type="dxa"/>
+              <w:bottom w:w="0" w:type="dxa"/>
+              <w:right w:w="0" w:type="dxa"/>
+            </w:tcMar>
+            <w:vAlign w:val="center"/>
           </w:tcPr>
           <w:p>
             <w:pPr>
@@ -1630,17 +2264,32 @@
         <w:tc>
           <w:tcPr>
             <w:tcW w:w="0" w:type="auto"/>
-          </w:tcPr>
-          <w:p>
-            <w:pPr>
-              <w:pBdr>
-                <w:top w:val="none" w:sz="0" w:space="0" w:color="000000"/>
-                <w:left w:val="none" w:sz="0" w:space="0" w:color="000000"/>
-                <w:bottom w:val="none" w:sz="0" w:space="0" w:color="000000"/>
-                <w:right w:val="none" w:sz="0" w:space="0" w:color="000000"/>
-              </w:pBdr>
-              <w:spacing w:before="80" w:after="80"/>
-              <w:ind w:left="80" w:right="80"/>
+            <w:tcBorders>
+              <w:top w:val="none" w:sz="0" w:space="0" w:color="000000"/>
+              <w:left w:val="none" w:sz="0" w:space="0" w:color="000000"/>
+              <w:bottom w:val="none" w:sz="0" w:space="0" w:color="000000"/>
+              <w:right w:val="none" w:sz="0" w:space="0" w:color="000000"/>
+            </w:tcBorders>
+            <w:shd w:val="clear" w:color="auto" w:fill="FFFFFF"/>
+            <w:tcMar>
+              <w:top w:w="0" w:type="dxa"/>
+              <w:left w:w="0" w:type="dxa"/>
+              <w:bottom w:w="0" w:type="dxa"/>
+              <w:right w:w="0" w:type="dxa"/>
+            </w:tcMar>
+            <w:vAlign w:val="center"/>
+          </w:tcPr>
+          <w:p>
+            <w:pPr>
+              <w:pBdr>
+                <w:top w:val="none" w:sz="0" w:space="0" w:color="000000"/>
+                <w:left w:val="none" w:sz="0" w:space="0" w:color="000000"/>
+                <w:bottom w:val="none" w:sz="0" w:space="0" w:color="000000"/>
+                <w:right w:val="none" w:sz="0" w:space="0" w:color="000000"/>
+              </w:pBdr>
+              <w:spacing w:before="80" w:after="80"/>
+              <w:ind w:left="80" w:right="80"/>
+              <w:jc w:val="right"/>
               <w:rPr>
                 <w:rFonts w:ascii="Helvetica" w:eastAsia="Helvetica" w:hAnsi="Helvetica" w:cs="Helvetica"/>
                 <w:color w:val="000000"/>
@@ -1662,17 +2311,32 @@
         <w:tc>
           <w:tcPr>
             <w:tcW w:w="0" w:type="auto"/>
-          </w:tcPr>
-          <w:p>
-            <w:pPr>
-              <w:pBdr>
-                <w:top w:val="none" w:sz="0" w:space="0" w:color="000000"/>
-                <w:left w:val="none" w:sz="0" w:space="0" w:color="000000"/>
-                <w:bottom w:val="none" w:sz="0" w:space="0" w:color="000000"/>
-                <w:right w:val="none" w:sz="0" w:space="0" w:color="000000"/>
-              </w:pBdr>
-              <w:spacing w:before="80" w:after="80"/>
-              <w:ind w:left="80" w:right="80"/>
+            <w:tcBorders>
+              <w:top w:val="none" w:sz="0" w:space="0" w:color="000000"/>
+              <w:left w:val="none" w:sz="0" w:space="0" w:color="000000"/>
+              <w:bottom w:val="none" w:sz="0" w:space="0" w:color="000000"/>
+              <w:right w:val="none" w:sz="0" w:space="0" w:color="000000"/>
+            </w:tcBorders>
+            <w:shd w:val="clear" w:color="auto" w:fill="FFFFFF"/>
+            <w:tcMar>
+              <w:top w:w="0" w:type="dxa"/>
+              <w:left w:w="0" w:type="dxa"/>
+              <w:bottom w:w="0" w:type="dxa"/>
+              <w:right w:w="0" w:type="dxa"/>
+            </w:tcMar>
+            <w:vAlign w:val="center"/>
+          </w:tcPr>
+          <w:p>
+            <w:pPr>
+              <w:pBdr>
+                <w:top w:val="none" w:sz="0" w:space="0" w:color="000000"/>
+                <w:left w:val="none" w:sz="0" w:space="0" w:color="000000"/>
+                <w:bottom w:val="none" w:sz="0" w:space="0" w:color="000000"/>
+                <w:right w:val="none" w:sz="0" w:space="0" w:color="000000"/>
+              </w:pBdr>
+              <w:spacing w:before="80" w:after="80"/>
+              <w:ind w:left="80" w:right="80"/>
+              <w:jc w:val="right"/>
               <w:rPr>
                 <w:rFonts w:ascii="Helvetica" w:eastAsia="Helvetica" w:hAnsi="Helvetica" w:cs="Helvetica"/>
                 <w:color w:val="000000"/>
@@ -1693,7 +2357,21 @@
         </w:tc>
         <w:tc>
           <w:tcPr>
-            <w:tcW w:w="693" w:type="pct"/>
+            <w:tcW w:w="0" w:type="auto"/>
+            <w:tcBorders>
+              <w:top w:val="none" w:sz="0" w:space="0" w:color="000000"/>
+              <w:left w:val="none" w:sz="0" w:space="0" w:color="000000"/>
+              <w:bottom w:val="none" w:sz="0" w:space="0" w:color="000000"/>
+              <w:right w:val="none" w:sz="0" w:space="0" w:color="000000"/>
+            </w:tcBorders>
+            <w:shd w:val="clear" w:color="auto" w:fill="FFFFFF"/>
+            <w:tcMar>
+              <w:top w:w="0" w:type="dxa"/>
+              <w:left w:w="0" w:type="dxa"/>
+              <w:bottom w:w="0" w:type="dxa"/>
+              <w:right w:w="0" w:type="dxa"/>
+            </w:tcMar>
+            <w:vAlign w:val="center"/>
           </w:tcPr>
           <w:p>
             <w:pPr>
@@ -1725,7 +2403,21 @@
         </w:tc>
         <w:tc>
           <w:tcPr>
-            <w:tcW w:w="619" w:type="pct"/>
+            <w:tcW w:w="0" w:type="auto"/>
+            <w:tcBorders>
+              <w:top w:val="none" w:sz="0" w:space="0" w:color="000000"/>
+              <w:left w:val="none" w:sz="0" w:space="0" w:color="000000"/>
+              <w:bottom w:val="none" w:sz="0" w:space="0" w:color="000000"/>
+              <w:right w:val="none" w:sz="0" w:space="0" w:color="000000"/>
+            </w:tcBorders>
+            <w:shd w:val="clear" w:color="auto" w:fill="FFFFFF"/>
+            <w:tcMar>
+              <w:top w:w="0" w:type="dxa"/>
+              <w:left w:w="0" w:type="dxa"/>
+              <w:bottom w:w="0" w:type="dxa"/>
+              <w:right w:w="0" w:type="dxa"/>
+            </w:tcMar>
+            <w:vAlign w:val="center"/>
           </w:tcPr>
           <w:p>
             <w:pPr>
@@ -1757,7 +2449,21 @@
         </w:tc>
         <w:tc>
           <w:tcPr>
-            <w:tcW w:w="620" w:type="pct"/>
+            <w:tcW w:w="0" w:type="auto"/>
+            <w:tcBorders>
+              <w:top w:val="none" w:sz="0" w:space="0" w:color="000000"/>
+              <w:left w:val="none" w:sz="0" w:space="0" w:color="000000"/>
+              <w:bottom w:val="none" w:sz="0" w:space="0" w:color="000000"/>
+              <w:right w:val="none" w:sz="0" w:space="0" w:color="000000"/>
+            </w:tcBorders>
+            <w:shd w:val="clear" w:color="auto" w:fill="FFFFFF"/>
+            <w:tcMar>
+              <w:top w:w="0" w:type="dxa"/>
+              <w:left w:w="0" w:type="dxa"/>
+              <w:bottom w:w="0" w:type="dxa"/>
+              <w:right w:w="0" w:type="dxa"/>
+            </w:tcMar>
+            <w:vAlign w:val="center"/>
           </w:tcPr>
           <w:p>
             <w:pPr>
@@ -1789,7 +2495,21 @@
         </w:tc>
         <w:tc>
           <w:tcPr>
-            <w:tcW w:w="708" w:type="pct"/>
+            <w:tcW w:w="0" w:type="auto"/>
+            <w:tcBorders>
+              <w:top w:val="none" w:sz="0" w:space="0" w:color="000000"/>
+              <w:left w:val="none" w:sz="0" w:space="0" w:color="000000"/>
+              <w:bottom w:val="none" w:sz="0" w:space="0" w:color="000000"/>
+              <w:right w:val="none" w:sz="0" w:space="0" w:color="000000"/>
+            </w:tcBorders>
+            <w:shd w:val="clear" w:color="auto" w:fill="FFFFFF"/>
+            <w:tcMar>
+              <w:top w:w="0" w:type="dxa"/>
+              <w:left w:w="0" w:type="dxa"/>
+              <w:bottom w:w="0" w:type="dxa"/>
+              <w:right w:w="0" w:type="dxa"/>
+            </w:tcMar>
+            <w:vAlign w:val="center"/>
           </w:tcPr>
           <w:p>
             <w:pPr>
@@ -1821,7 +2541,21 @@
         </w:tc>
         <w:tc>
           <w:tcPr>
-            <w:tcW w:w="442" w:type="pct"/>
+            <w:tcW w:w="0" w:type="auto"/>
+            <w:tcBorders>
+              <w:top w:val="none" w:sz="0" w:space="0" w:color="000000"/>
+              <w:left w:val="none" w:sz="0" w:space="0" w:color="000000"/>
+              <w:bottom w:val="none" w:sz="0" w:space="0" w:color="000000"/>
+              <w:right w:val="none" w:sz="0" w:space="0" w:color="000000"/>
+            </w:tcBorders>
+            <w:shd w:val="clear" w:color="auto" w:fill="FFFFFF"/>
+            <w:tcMar>
+              <w:top w:w="0" w:type="dxa"/>
+              <w:left w:w="0" w:type="dxa"/>
+              <w:bottom w:w="0" w:type="dxa"/>
+              <w:right w:w="0" w:type="dxa"/>
+            </w:tcMar>
+            <w:vAlign w:val="center"/>
           </w:tcPr>
           <w:p>
             <w:pPr>
@@ -1853,7 +2587,21 @@
         </w:tc>
         <w:tc>
           <w:tcPr>
-            <w:tcW w:w="575" w:type="pct"/>
+            <w:tcW w:w="0" w:type="auto"/>
+            <w:tcBorders>
+              <w:top w:val="none" w:sz="0" w:space="0" w:color="000000"/>
+              <w:left w:val="none" w:sz="0" w:space="0" w:color="000000"/>
+              <w:bottom w:val="none" w:sz="0" w:space="0" w:color="000000"/>
+              <w:right w:val="none" w:sz="0" w:space="0" w:color="000000"/>
+            </w:tcBorders>
+            <w:shd w:val="clear" w:color="auto" w:fill="FFFFFF"/>
+            <w:tcMar>
+              <w:top w:w="0" w:type="dxa"/>
+              <w:left w:w="0" w:type="dxa"/>
+              <w:bottom w:w="0" w:type="dxa"/>
+              <w:right w:w="0" w:type="dxa"/>
+            </w:tcMar>
+            <w:vAlign w:val="center"/>
           </w:tcPr>
           <w:p>
             <w:pPr>
@@ -1885,9 +2633,26 @@
         </w:tc>
       </w:tr>
       <w:tr>
-        <w:tc>
-          <w:tcPr>
-            <w:tcW w:w="513" w:type="pct"/>
+        <w:trPr>
+          <w:jc w:val="center"/>
+        </w:trPr>
+        <w:tc>
+          <w:tcPr>
+            <w:tcW w:w="0" w:type="auto"/>
+            <w:tcBorders>
+              <w:top w:val="none" w:sz="0" w:space="0" w:color="000000"/>
+              <w:left w:val="none" w:sz="0" w:space="0" w:color="000000"/>
+              <w:bottom w:val="none" w:sz="0" w:space="0" w:color="000000"/>
+              <w:right w:val="none" w:sz="0" w:space="0" w:color="000000"/>
+            </w:tcBorders>
+            <w:shd w:val="clear" w:color="auto" w:fill="FFFFFF"/>
+            <w:tcMar>
+              <w:top w:w="0" w:type="dxa"/>
+              <w:left w:w="0" w:type="dxa"/>
+              <w:bottom w:w="0" w:type="dxa"/>
+              <w:right w:w="0" w:type="dxa"/>
+            </w:tcMar>
+            <w:vAlign w:val="center"/>
           </w:tcPr>
           <w:p>
             <w:pPr>
@@ -1920,17 +2685,32 @@
         <w:tc>
           <w:tcPr>
             <w:tcW w:w="0" w:type="auto"/>
-          </w:tcPr>
-          <w:p>
-            <w:pPr>
-              <w:pBdr>
-                <w:top w:val="none" w:sz="0" w:space="0" w:color="000000"/>
-                <w:left w:val="none" w:sz="0" w:space="0" w:color="000000"/>
-                <w:bottom w:val="none" w:sz="0" w:space="0" w:color="000000"/>
-                <w:right w:val="none" w:sz="0" w:space="0" w:color="000000"/>
-              </w:pBdr>
-              <w:spacing w:before="80" w:after="80"/>
-              <w:ind w:left="80" w:right="80"/>
+            <w:tcBorders>
+              <w:top w:val="none" w:sz="0" w:space="0" w:color="000000"/>
+              <w:left w:val="none" w:sz="0" w:space="0" w:color="000000"/>
+              <w:bottom w:val="none" w:sz="0" w:space="0" w:color="000000"/>
+              <w:right w:val="none" w:sz="0" w:space="0" w:color="000000"/>
+            </w:tcBorders>
+            <w:shd w:val="clear" w:color="auto" w:fill="FFFFFF"/>
+            <w:tcMar>
+              <w:top w:w="0" w:type="dxa"/>
+              <w:left w:w="0" w:type="dxa"/>
+              <w:bottom w:w="0" w:type="dxa"/>
+              <w:right w:w="0" w:type="dxa"/>
+            </w:tcMar>
+            <w:vAlign w:val="center"/>
+          </w:tcPr>
+          <w:p>
+            <w:pPr>
+              <w:pBdr>
+                <w:top w:val="none" w:sz="0" w:space="0" w:color="000000"/>
+                <w:left w:val="none" w:sz="0" w:space="0" w:color="000000"/>
+                <w:bottom w:val="none" w:sz="0" w:space="0" w:color="000000"/>
+                <w:right w:val="none" w:sz="0" w:space="0" w:color="000000"/>
+              </w:pBdr>
+              <w:spacing w:before="80" w:after="80"/>
+              <w:ind w:left="80" w:right="80"/>
+              <w:jc w:val="right"/>
               <w:rPr>
                 <w:rFonts w:ascii="Helvetica" w:eastAsia="Helvetica" w:hAnsi="Helvetica" w:cs="Helvetica"/>
                 <w:color w:val="000000"/>
@@ -1952,17 +2732,32 @@
         <w:tc>
           <w:tcPr>
             <w:tcW w:w="0" w:type="auto"/>
-          </w:tcPr>
-          <w:p>
-            <w:pPr>
-              <w:pBdr>
-                <w:top w:val="none" w:sz="0" w:space="0" w:color="000000"/>
-                <w:left w:val="none" w:sz="0" w:space="0" w:color="000000"/>
-                <w:bottom w:val="none" w:sz="0" w:space="0" w:color="000000"/>
-                <w:right w:val="none" w:sz="0" w:space="0" w:color="000000"/>
-              </w:pBdr>
-              <w:spacing w:before="80" w:after="80"/>
-              <w:ind w:left="80" w:right="80"/>
+            <w:tcBorders>
+              <w:top w:val="none" w:sz="0" w:space="0" w:color="000000"/>
+              <w:left w:val="none" w:sz="0" w:space="0" w:color="000000"/>
+              <w:bottom w:val="none" w:sz="0" w:space="0" w:color="000000"/>
+              <w:right w:val="none" w:sz="0" w:space="0" w:color="000000"/>
+            </w:tcBorders>
+            <w:shd w:val="clear" w:color="auto" w:fill="FFFFFF"/>
+            <w:tcMar>
+              <w:top w:w="0" w:type="dxa"/>
+              <w:left w:w="0" w:type="dxa"/>
+              <w:bottom w:w="0" w:type="dxa"/>
+              <w:right w:w="0" w:type="dxa"/>
+            </w:tcMar>
+            <w:vAlign w:val="center"/>
+          </w:tcPr>
+          <w:p>
+            <w:pPr>
+              <w:pBdr>
+                <w:top w:val="none" w:sz="0" w:space="0" w:color="000000"/>
+                <w:left w:val="none" w:sz="0" w:space="0" w:color="000000"/>
+                <w:bottom w:val="none" w:sz="0" w:space="0" w:color="000000"/>
+                <w:right w:val="none" w:sz="0" w:space="0" w:color="000000"/>
+              </w:pBdr>
+              <w:spacing w:before="80" w:after="80"/>
+              <w:ind w:left="80" w:right="80"/>
+              <w:jc w:val="right"/>
               <w:rPr>
                 <w:rFonts w:ascii="Helvetica" w:eastAsia="Helvetica" w:hAnsi="Helvetica" w:cs="Helvetica"/>
                 <w:color w:val="000000"/>
@@ -1983,7 +2778,21 @@
         </w:tc>
         <w:tc>
           <w:tcPr>
-            <w:tcW w:w="693" w:type="pct"/>
+            <w:tcW w:w="0" w:type="auto"/>
+            <w:tcBorders>
+              <w:top w:val="none" w:sz="0" w:space="0" w:color="000000"/>
+              <w:left w:val="none" w:sz="0" w:space="0" w:color="000000"/>
+              <w:bottom w:val="none" w:sz="0" w:space="0" w:color="000000"/>
+              <w:right w:val="none" w:sz="0" w:space="0" w:color="000000"/>
+            </w:tcBorders>
+            <w:shd w:val="clear" w:color="auto" w:fill="FFFFFF"/>
+            <w:tcMar>
+              <w:top w:w="0" w:type="dxa"/>
+              <w:left w:w="0" w:type="dxa"/>
+              <w:bottom w:w="0" w:type="dxa"/>
+              <w:right w:w="0" w:type="dxa"/>
+            </w:tcMar>
+            <w:vAlign w:val="center"/>
           </w:tcPr>
           <w:p>
             <w:pPr>
@@ -2015,7 +2824,21 @@
         </w:tc>
         <w:tc>
           <w:tcPr>
-            <w:tcW w:w="619" w:type="pct"/>
+            <w:tcW w:w="0" w:type="auto"/>
+            <w:tcBorders>
+              <w:top w:val="none" w:sz="0" w:space="0" w:color="000000"/>
+              <w:left w:val="none" w:sz="0" w:space="0" w:color="000000"/>
+              <w:bottom w:val="none" w:sz="0" w:space="0" w:color="000000"/>
+              <w:right w:val="none" w:sz="0" w:space="0" w:color="000000"/>
+            </w:tcBorders>
+            <w:shd w:val="clear" w:color="auto" w:fill="FFFFFF"/>
+            <w:tcMar>
+              <w:top w:w="0" w:type="dxa"/>
+              <w:left w:w="0" w:type="dxa"/>
+              <w:bottom w:w="0" w:type="dxa"/>
+              <w:right w:w="0" w:type="dxa"/>
+            </w:tcMar>
+            <w:vAlign w:val="center"/>
           </w:tcPr>
           <w:p>
             <w:pPr>
@@ -2047,7 +2870,21 @@
         </w:tc>
         <w:tc>
           <w:tcPr>
-            <w:tcW w:w="620" w:type="pct"/>
+            <w:tcW w:w="0" w:type="auto"/>
+            <w:tcBorders>
+              <w:top w:val="none" w:sz="0" w:space="0" w:color="000000"/>
+              <w:left w:val="none" w:sz="0" w:space="0" w:color="000000"/>
+              <w:bottom w:val="none" w:sz="0" w:space="0" w:color="000000"/>
+              <w:right w:val="none" w:sz="0" w:space="0" w:color="000000"/>
+            </w:tcBorders>
+            <w:shd w:val="clear" w:color="auto" w:fill="FFFFFF"/>
+            <w:tcMar>
+              <w:top w:w="0" w:type="dxa"/>
+              <w:left w:w="0" w:type="dxa"/>
+              <w:bottom w:w="0" w:type="dxa"/>
+              <w:right w:w="0" w:type="dxa"/>
+            </w:tcMar>
+            <w:vAlign w:val="center"/>
           </w:tcPr>
           <w:p>
             <w:pPr>
@@ -2079,7 +2916,21 @@
         </w:tc>
         <w:tc>
           <w:tcPr>
-            <w:tcW w:w="708" w:type="pct"/>
+            <w:tcW w:w="0" w:type="auto"/>
+            <w:tcBorders>
+              <w:top w:val="none" w:sz="0" w:space="0" w:color="000000"/>
+              <w:left w:val="none" w:sz="0" w:space="0" w:color="000000"/>
+              <w:bottom w:val="none" w:sz="0" w:space="0" w:color="000000"/>
+              <w:right w:val="none" w:sz="0" w:space="0" w:color="000000"/>
+            </w:tcBorders>
+            <w:shd w:val="clear" w:color="auto" w:fill="FFFFFF"/>
+            <w:tcMar>
+              <w:top w:w="0" w:type="dxa"/>
+              <w:left w:w="0" w:type="dxa"/>
+              <w:bottom w:w="0" w:type="dxa"/>
+              <w:right w:w="0" w:type="dxa"/>
+            </w:tcMar>
+            <w:vAlign w:val="center"/>
           </w:tcPr>
           <w:p>
             <w:pPr>
@@ -2111,7 +2962,21 @@
         </w:tc>
         <w:tc>
           <w:tcPr>
-            <w:tcW w:w="442" w:type="pct"/>
+            <w:tcW w:w="0" w:type="auto"/>
+            <w:tcBorders>
+              <w:top w:val="none" w:sz="0" w:space="0" w:color="000000"/>
+              <w:left w:val="none" w:sz="0" w:space="0" w:color="000000"/>
+              <w:bottom w:val="none" w:sz="0" w:space="0" w:color="000000"/>
+              <w:right w:val="none" w:sz="0" w:space="0" w:color="000000"/>
+            </w:tcBorders>
+            <w:shd w:val="clear" w:color="auto" w:fill="FFFFFF"/>
+            <w:tcMar>
+              <w:top w:w="0" w:type="dxa"/>
+              <w:left w:w="0" w:type="dxa"/>
+              <w:bottom w:w="0" w:type="dxa"/>
+              <w:right w:w="0" w:type="dxa"/>
+            </w:tcMar>
+            <w:vAlign w:val="center"/>
           </w:tcPr>
           <w:p>
             <w:pPr>
@@ -2143,32 +3008,42 @@
         </w:tc>
         <w:tc>
           <w:tcPr>
-            <w:tcW w:w="575" w:type="pct"/>
-          </w:tcPr>
-          <w:p>
-            <w:pPr>
-              <w:pBdr>
-                <w:top w:val="none" w:sz="0" w:space="0" w:color="000000"/>
-                <w:left w:val="none" w:sz="0" w:space="0" w:color="000000"/>
-                <w:bottom w:val="none" w:sz="0" w:space="0" w:color="000000"/>
-                <w:right w:val="none" w:sz="0" w:space="0" w:color="000000"/>
-              </w:pBdr>
-              <w:spacing w:before="80" w:after="80"/>
-              <w:ind w:left="80" w:right="80"/>
-              <w:rPr>
-                <w:rFonts w:ascii="Helvetica" w:eastAsia="Helvetica" w:hAnsi="Helvetica" w:cs="Helvetica"/>
-                <w:b/>
-                <w:bCs/>
-                <w:color w:val="000000"/>
-                <w:sz w:val="20"/>
-                <w:szCs w:val="20"/>
-              </w:rPr>
-            </w:pPr>
-            <w:r>
-              <w:rPr>
-                <w:rFonts w:ascii="Helvetica" w:eastAsia="Helvetica" w:hAnsi="Helvetica" w:cs="Helvetica"/>
-                <w:b/>
-                <w:bCs/>
+            <w:tcW w:w="0" w:type="auto"/>
+            <w:tcBorders>
+              <w:top w:val="none" w:sz="0" w:space="0" w:color="000000"/>
+              <w:left w:val="none" w:sz="0" w:space="0" w:color="000000"/>
+              <w:bottom w:val="none" w:sz="0" w:space="0" w:color="000000"/>
+              <w:right w:val="none" w:sz="0" w:space="0" w:color="000000"/>
+            </w:tcBorders>
+            <w:shd w:val="clear" w:color="auto" w:fill="FFFFFF"/>
+            <w:tcMar>
+              <w:top w:w="0" w:type="dxa"/>
+              <w:left w:w="0" w:type="dxa"/>
+              <w:bottom w:w="0" w:type="dxa"/>
+              <w:right w:w="0" w:type="dxa"/>
+            </w:tcMar>
+            <w:vAlign w:val="center"/>
+          </w:tcPr>
+          <w:p>
+            <w:pPr>
+              <w:pBdr>
+                <w:top w:val="none" w:sz="0" w:space="0" w:color="000000"/>
+                <w:left w:val="none" w:sz="0" w:space="0" w:color="000000"/>
+                <w:bottom w:val="none" w:sz="0" w:space="0" w:color="000000"/>
+                <w:right w:val="none" w:sz="0" w:space="0" w:color="000000"/>
+              </w:pBdr>
+              <w:spacing w:before="80" w:after="80"/>
+              <w:ind w:left="80" w:right="80"/>
+              <w:rPr>
+                <w:rFonts w:ascii="Helvetica" w:eastAsia="Helvetica" w:hAnsi="Helvetica" w:cs="Helvetica"/>
+                <w:color w:val="000000"/>
+                <w:sz w:val="20"/>
+                <w:szCs w:val="20"/>
+              </w:rPr>
+            </w:pPr>
+            <w:r>
+              <w:rPr>
+                <w:rFonts w:ascii="Helvetica" w:eastAsia="Helvetica" w:hAnsi="Helvetica" w:cs="Helvetica"/>
                 <w:color w:val="000000"/>
                 <w:sz w:val="20"/>
                 <w:szCs w:val="20"/>
@@ -2179,9 +3054,26 @@
         </w:tc>
       </w:tr>
       <w:tr>
-        <w:tc>
-          <w:tcPr>
-            <w:tcW w:w="513" w:type="pct"/>
+        <w:trPr>
+          <w:jc w:val="center"/>
+        </w:trPr>
+        <w:tc>
+          <w:tcPr>
+            <w:tcW w:w="0" w:type="auto"/>
+            <w:tcBorders>
+              <w:top w:val="none" w:sz="0" w:space="0" w:color="000000"/>
+              <w:left w:val="none" w:sz="0" w:space="0" w:color="000000"/>
+              <w:bottom w:val="none" w:sz="0" w:space="0" w:color="000000"/>
+              <w:right w:val="none" w:sz="0" w:space="0" w:color="000000"/>
+            </w:tcBorders>
+            <w:shd w:val="clear" w:color="auto" w:fill="FFFFFF"/>
+            <w:tcMar>
+              <w:top w:w="0" w:type="dxa"/>
+              <w:left w:w="0" w:type="dxa"/>
+              <w:bottom w:w="0" w:type="dxa"/>
+              <w:right w:w="0" w:type="dxa"/>
+            </w:tcMar>
+            <w:vAlign w:val="center"/>
           </w:tcPr>
           <w:p>
             <w:pPr>
@@ -2214,17 +3106,32 @@
         <w:tc>
           <w:tcPr>
             <w:tcW w:w="0" w:type="auto"/>
-          </w:tcPr>
-          <w:p>
-            <w:pPr>
-              <w:pBdr>
-                <w:top w:val="none" w:sz="0" w:space="0" w:color="000000"/>
-                <w:left w:val="none" w:sz="0" w:space="0" w:color="000000"/>
-                <w:bottom w:val="none" w:sz="0" w:space="0" w:color="000000"/>
-                <w:right w:val="none" w:sz="0" w:space="0" w:color="000000"/>
-              </w:pBdr>
-              <w:spacing w:before="80" w:after="80"/>
-              <w:ind w:left="80" w:right="80"/>
+            <w:tcBorders>
+              <w:top w:val="none" w:sz="0" w:space="0" w:color="000000"/>
+              <w:left w:val="none" w:sz="0" w:space="0" w:color="000000"/>
+              <w:bottom w:val="none" w:sz="0" w:space="0" w:color="000000"/>
+              <w:right w:val="none" w:sz="0" w:space="0" w:color="000000"/>
+            </w:tcBorders>
+            <w:shd w:val="clear" w:color="auto" w:fill="FFFFFF"/>
+            <w:tcMar>
+              <w:top w:w="0" w:type="dxa"/>
+              <w:left w:w="0" w:type="dxa"/>
+              <w:bottom w:w="0" w:type="dxa"/>
+              <w:right w:w="0" w:type="dxa"/>
+            </w:tcMar>
+            <w:vAlign w:val="center"/>
+          </w:tcPr>
+          <w:p>
+            <w:pPr>
+              <w:pBdr>
+                <w:top w:val="none" w:sz="0" w:space="0" w:color="000000"/>
+                <w:left w:val="none" w:sz="0" w:space="0" w:color="000000"/>
+                <w:bottom w:val="none" w:sz="0" w:space="0" w:color="000000"/>
+                <w:right w:val="none" w:sz="0" w:space="0" w:color="000000"/>
+              </w:pBdr>
+              <w:spacing w:before="80" w:after="80"/>
+              <w:ind w:left="80" w:right="80"/>
+              <w:jc w:val="right"/>
               <w:rPr>
                 <w:rFonts w:ascii="Helvetica" w:eastAsia="Helvetica" w:hAnsi="Helvetica" w:cs="Helvetica"/>
                 <w:color w:val="000000"/>
@@ -2246,17 +3153,32 @@
         <w:tc>
           <w:tcPr>
             <w:tcW w:w="0" w:type="auto"/>
-          </w:tcPr>
-          <w:p>
-            <w:pPr>
-              <w:pBdr>
-                <w:top w:val="none" w:sz="0" w:space="0" w:color="000000"/>
-                <w:left w:val="none" w:sz="0" w:space="0" w:color="000000"/>
-                <w:bottom w:val="none" w:sz="0" w:space="0" w:color="000000"/>
-                <w:right w:val="none" w:sz="0" w:space="0" w:color="000000"/>
-              </w:pBdr>
-              <w:spacing w:before="80" w:after="80"/>
-              <w:ind w:left="80" w:right="80"/>
+            <w:tcBorders>
+              <w:top w:val="none" w:sz="0" w:space="0" w:color="000000"/>
+              <w:left w:val="none" w:sz="0" w:space="0" w:color="000000"/>
+              <w:bottom w:val="none" w:sz="0" w:space="0" w:color="000000"/>
+              <w:right w:val="none" w:sz="0" w:space="0" w:color="000000"/>
+            </w:tcBorders>
+            <w:shd w:val="clear" w:color="auto" w:fill="FFFFFF"/>
+            <w:tcMar>
+              <w:top w:w="0" w:type="dxa"/>
+              <w:left w:w="0" w:type="dxa"/>
+              <w:bottom w:w="0" w:type="dxa"/>
+              <w:right w:w="0" w:type="dxa"/>
+            </w:tcMar>
+            <w:vAlign w:val="center"/>
+          </w:tcPr>
+          <w:p>
+            <w:pPr>
+              <w:pBdr>
+                <w:top w:val="none" w:sz="0" w:space="0" w:color="000000"/>
+                <w:left w:val="none" w:sz="0" w:space="0" w:color="000000"/>
+                <w:bottom w:val="none" w:sz="0" w:space="0" w:color="000000"/>
+                <w:right w:val="none" w:sz="0" w:space="0" w:color="000000"/>
+              </w:pBdr>
+              <w:spacing w:before="80" w:after="80"/>
+              <w:ind w:left="80" w:right="80"/>
+              <w:jc w:val="right"/>
               <w:rPr>
                 <w:rFonts w:ascii="Helvetica" w:eastAsia="Helvetica" w:hAnsi="Helvetica" w:cs="Helvetica"/>
                 <w:color w:val="000000"/>
@@ -2277,7 +3199,21 @@
         </w:tc>
         <w:tc>
           <w:tcPr>
-            <w:tcW w:w="693" w:type="pct"/>
+            <w:tcW w:w="0" w:type="auto"/>
+            <w:tcBorders>
+              <w:top w:val="none" w:sz="0" w:space="0" w:color="000000"/>
+              <w:left w:val="none" w:sz="0" w:space="0" w:color="000000"/>
+              <w:bottom w:val="none" w:sz="0" w:space="0" w:color="000000"/>
+              <w:right w:val="none" w:sz="0" w:space="0" w:color="000000"/>
+            </w:tcBorders>
+            <w:shd w:val="clear" w:color="auto" w:fill="FFFFFF"/>
+            <w:tcMar>
+              <w:top w:w="0" w:type="dxa"/>
+              <w:left w:w="0" w:type="dxa"/>
+              <w:bottom w:w="0" w:type="dxa"/>
+              <w:right w:w="0" w:type="dxa"/>
+            </w:tcMar>
+            <w:vAlign w:val="center"/>
           </w:tcPr>
           <w:p>
             <w:pPr>
@@ -2309,7 +3245,21 @@
         </w:tc>
         <w:tc>
           <w:tcPr>
-            <w:tcW w:w="619" w:type="pct"/>
+            <w:tcW w:w="0" w:type="auto"/>
+            <w:tcBorders>
+              <w:top w:val="none" w:sz="0" w:space="0" w:color="000000"/>
+              <w:left w:val="none" w:sz="0" w:space="0" w:color="000000"/>
+              <w:bottom w:val="none" w:sz="0" w:space="0" w:color="000000"/>
+              <w:right w:val="none" w:sz="0" w:space="0" w:color="000000"/>
+            </w:tcBorders>
+            <w:shd w:val="clear" w:color="auto" w:fill="FFFFFF"/>
+            <w:tcMar>
+              <w:top w:w="0" w:type="dxa"/>
+              <w:left w:w="0" w:type="dxa"/>
+              <w:bottom w:w="0" w:type="dxa"/>
+              <w:right w:w="0" w:type="dxa"/>
+            </w:tcMar>
+            <w:vAlign w:val="center"/>
           </w:tcPr>
           <w:p>
             <w:pPr>
@@ -2341,7 +3291,21 @@
         </w:tc>
         <w:tc>
           <w:tcPr>
-            <w:tcW w:w="620" w:type="pct"/>
+            <w:tcW w:w="0" w:type="auto"/>
+            <w:tcBorders>
+              <w:top w:val="none" w:sz="0" w:space="0" w:color="000000"/>
+              <w:left w:val="none" w:sz="0" w:space="0" w:color="000000"/>
+              <w:bottom w:val="none" w:sz="0" w:space="0" w:color="000000"/>
+              <w:right w:val="none" w:sz="0" w:space="0" w:color="000000"/>
+            </w:tcBorders>
+            <w:shd w:val="clear" w:color="auto" w:fill="FFFFFF"/>
+            <w:tcMar>
+              <w:top w:w="0" w:type="dxa"/>
+              <w:left w:w="0" w:type="dxa"/>
+              <w:bottom w:w="0" w:type="dxa"/>
+              <w:right w:w="0" w:type="dxa"/>
+            </w:tcMar>
+            <w:vAlign w:val="center"/>
           </w:tcPr>
           <w:p>
             <w:pPr>
@@ -2373,7 +3337,21 @@
         </w:tc>
         <w:tc>
           <w:tcPr>
-            <w:tcW w:w="708" w:type="pct"/>
+            <w:tcW w:w="0" w:type="auto"/>
+            <w:tcBorders>
+              <w:top w:val="none" w:sz="0" w:space="0" w:color="000000"/>
+              <w:left w:val="none" w:sz="0" w:space="0" w:color="000000"/>
+              <w:bottom w:val="none" w:sz="0" w:space="0" w:color="000000"/>
+              <w:right w:val="none" w:sz="0" w:space="0" w:color="000000"/>
+            </w:tcBorders>
+            <w:shd w:val="clear" w:color="auto" w:fill="FFFFFF"/>
+            <w:tcMar>
+              <w:top w:w="0" w:type="dxa"/>
+              <w:left w:w="0" w:type="dxa"/>
+              <w:bottom w:w="0" w:type="dxa"/>
+              <w:right w:w="0" w:type="dxa"/>
+            </w:tcMar>
+            <w:vAlign w:val="center"/>
           </w:tcPr>
           <w:p>
             <w:pPr>
@@ -2405,32 +3383,42 @@
         </w:tc>
         <w:tc>
           <w:tcPr>
-            <w:tcW w:w="442" w:type="pct"/>
-          </w:tcPr>
-          <w:p>
-            <w:pPr>
-              <w:pBdr>
-                <w:top w:val="none" w:sz="0" w:space="0" w:color="000000"/>
-                <w:left w:val="none" w:sz="0" w:space="0" w:color="000000"/>
-                <w:bottom w:val="none" w:sz="0" w:space="0" w:color="000000"/>
-                <w:right w:val="none" w:sz="0" w:space="0" w:color="000000"/>
-              </w:pBdr>
-              <w:spacing w:before="80" w:after="80"/>
-              <w:ind w:left="80" w:right="80"/>
-              <w:rPr>
-                <w:rFonts w:ascii="Helvetica" w:eastAsia="Helvetica" w:hAnsi="Helvetica" w:cs="Helvetica"/>
-                <w:b/>
-                <w:bCs/>
-                <w:color w:val="000000"/>
-                <w:sz w:val="20"/>
-                <w:szCs w:val="20"/>
-              </w:rPr>
-            </w:pPr>
-            <w:r>
-              <w:rPr>
-                <w:rFonts w:ascii="Helvetica" w:eastAsia="Helvetica" w:hAnsi="Helvetica" w:cs="Helvetica"/>
-                <w:b/>
-                <w:bCs/>
+            <w:tcW w:w="0" w:type="auto"/>
+            <w:tcBorders>
+              <w:top w:val="none" w:sz="0" w:space="0" w:color="000000"/>
+              <w:left w:val="none" w:sz="0" w:space="0" w:color="000000"/>
+              <w:bottom w:val="none" w:sz="0" w:space="0" w:color="000000"/>
+              <w:right w:val="none" w:sz="0" w:space="0" w:color="000000"/>
+            </w:tcBorders>
+            <w:shd w:val="clear" w:color="auto" w:fill="FFFFFF"/>
+            <w:tcMar>
+              <w:top w:w="0" w:type="dxa"/>
+              <w:left w:w="0" w:type="dxa"/>
+              <w:bottom w:w="0" w:type="dxa"/>
+              <w:right w:w="0" w:type="dxa"/>
+            </w:tcMar>
+            <w:vAlign w:val="center"/>
+          </w:tcPr>
+          <w:p>
+            <w:pPr>
+              <w:pBdr>
+                <w:top w:val="none" w:sz="0" w:space="0" w:color="000000"/>
+                <w:left w:val="none" w:sz="0" w:space="0" w:color="000000"/>
+                <w:bottom w:val="none" w:sz="0" w:space="0" w:color="000000"/>
+                <w:right w:val="none" w:sz="0" w:space="0" w:color="000000"/>
+              </w:pBdr>
+              <w:spacing w:before="80" w:after="80"/>
+              <w:ind w:left="80" w:right="80"/>
+              <w:rPr>
+                <w:rFonts w:ascii="Helvetica" w:eastAsia="Helvetica" w:hAnsi="Helvetica" w:cs="Helvetica"/>
+                <w:color w:val="000000"/>
+                <w:sz w:val="20"/>
+                <w:szCs w:val="20"/>
+              </w:rPr>
+            </w:pPr>
+            <w:r>
+              <w:rPr>
+                <w:rFonts w:ascii="Helvetica" w:eastAsia="Helvetica" w:hAnsi="Helvetica" w:cs="Helvetica"/>
                 <w:color w:val="000000"/>
                 <w:sz w:val="20"/>
                 <w:szCs w:val="20"/>
@@ -2441,32 +3429,42 @@
         </w:tc>
         <w:tc>
           <w:tcPr>
-            <w:tcW w:w="575" w:type="pct"/>
-          </w:tcPr>
-          <w:p>
-            <w:pPr>
-              <w:pBdr>
-                <w:top w:val="none" w:sz="0" w:space="0" w:color="000000"/>
-                <w:left w:val="none" w:sz="0" w:space="0" w:color="000000"/>
-                <w:bottom w:val="none" w:sz="0" w:space="0" w:color="000000"/>
-                <w:right w:val="none" w:sz="0" w:space="0" w:color="000000"/>
-              </w:pBdr>
-              <w:spacing w:before="80" w:after="80"/>
-              <w:ind w:left="80" w:right="80"/>
-              <w:rPr>
-                <w:rFonts w:ascii="Helvetica" w:eastAsia="Helvetica" w:hAnsi="Helvetica" w:cs="Helvetica"/>
-                <w:b/>
-                <w:bCs/>
-                <w:color w:val="000000"/>
-                <w:sz w:val="20"/>
-                <w:szCs w:val="20"/>
-              </w:rPr>
-            </w:pPr>
-            <w:r>
-              <w:rPr>
-                <w:rFonts w:ascii="Helvetica" w:eastAsia="Helvetica" w:hAnsi="Helvetica" w:cs="Helvetica"/>
-                <w:b/>
-                <w:bCs/>
+            <w:tcW w:w="0" w:type="auto"/>
+            <w:tcBorders>
+              <w:top w:val="none" w:sz="0" w:space="0" w:color="000000"/>
+              <w:left w:val="none" w:sz="0" w:space="0" w:color="000000"/>
+              <w:bottom w:val="none" w:sz="0" w:space="0" w:color="000000"/>
+              <w:right w:val="none" w:sz="0" w:space="0" w:color="000000"/>
+            </w:tcBorders>
+            <w:shd w:val="clear" w:color="auto" w:fill="FFFFFF"/>
+            <w:tcMar>
+              <w:top w:w="0" w:type="dxa"/>
+              <w:left w:w="0" w:type="dxa"/>
+              <w:bottom w:w="0" w:type="dxa"/>
+              <w:right w:w="0" w:type="dxa"/>
+            </w:tcMar>
+            <w:vAlign w:val="center"/>
+          </w:tcPr>
+          <w:p>
+            <w:pPr>
+              <w:pBdr>
+                <w:top w:val="none" w:sz="0" w:space="0" w:color="000000"/>
+                <w:left w:val="none" w:sz="0" w:space="0" w:color="000000"/>
+                <w:bottom w:val="none" w:sz="0" w:space="0" w:color="000000"/>
+                <w:right w:val="none" w:sz="0" w:space="0" w:color="000000"/>
+              </w:pBdr>
+              <w:spacing w:before="80" w:after="80"/>
+              <w:ind w:left="80" w:right="80"/>
+              <w:rPr>
+                <w:rFonts w:ascii="Helvetica" w:eastAsia="Helvetica" w:hAnsi="Helvetica" w:cs="Helvetica"/>
+                <w:color w:val="000000"/>
+                <w:sz w:val="20"/>
+                <w:szCs w:val="20"/>
+              </w:rPr>
+            </w:pPr>
+            <w:r>
+              <w:rPr>
+                <w:rFonts w:ascii="Helvetica" w:eastAsia="Helvetica" w:hAnsi="Helvetica" w:cs="Helvetica"/>
                 <w:color w:val="000000"/>
                 <w:sz w:val="20"/>
                 <w:szCs w:val="20"/>
@@ -2477,9 +3475,26 @@
         </w:tc>
       </w:tr>
       <w:tr>
-        <w:tc>
-          <w:tcPr>
-            <w:tcW w:w="513" w:type="pct"/>
+        <w:trPr>
+          <w:jc w:val="center"/>
+        </w:trPr>
+        <w:tc>
+          <w:tcPr>
+            <w:tcW w:w="0" w:type="auto"/>
+            <w:tcBorders>
+              <w:top w:val="none" w:sz="0" w:space="0" w:color="000000"/>
+              <w:left w:val="none" w:sz="0" w:space="0" w:color="000000"/>
+              <w:bottom w:val="none" w:sz="0" w:space="0" w:color="000000"/>
+              <w:right w:val="none" w:sz="0" w:space="0" w:color="000000"/>
+            </w:tcBorders>
+            <w:shd w:val="clear" w:color="auto" w:fill="FFFFFF"/>
+            <w:tcMar>
+              <w:top w:w="0" w:type="dxa"/>
+              <w:left w:w="0" w:type="dxa"/>
+              <w:bottom w:w="0" w:type="dxa"/>
+              <w:right w:w="0" w:type="dxa"/>
+            </w:tcMar>
+            <w:vAlign w:val="center"/>
           </w:tcPr>
           <w:p>
             <w:pPr>
@@ -2512,17 +3527,32 @@
         <w:tc>
           <w:tcPr>
             <w:tcW w:w="0" w:type="auto"/>
-          </w:tcPr>
-          <w:p>
-            <w:pPr>
-              <w:pBdr>
-                <w:top w:val="none" w:sz="0" w:space="0" w:color="000000"/>
-                <w:left w:val="none" w:sz="0" w:space="0" w:color="000000"/>
-                <w:bottom w:val="none" w:sz="0" w:space="0" w:color="000000"/>
-                <w:right w:val="none" w:sz="0" w:space="0" w:color="000000"/>
-              </w:pBdr>
-              <w:spacing w:before="80" w:after="80"/>
-              <w:ind w:left="80" w:right="80"/>
+            <w:tcBorders>
+              <w:top w:val="none" w:sz="0" w:space="0" w:color="000000"/>
+              <w:left w:val="none" w:sz="0" w:space="0" w:color="000000"/>
+              <w:bottom w:val="none" w:sz="0" w:space="0" w:color="000000"/>
+              <w:right w:val="none" w:sz="0" w:space="0" w:color="000000"/>
+            </w:tcBorders>
+            <w:shd w:val="clear" w:color="auto" w:fill="FFFFFF"/>
+            <w:tcMar>
+              <w:top w:w="0" w:type="dxa"/>
+              <w:left w:w="0" w:type="dxa"/>
+              <w:bottom w:w="0" w:type="dxa"/>
+              <w:right w:w="0" w:type="dxa"/>
+            </w:tcMar>
+            <w:vAlign w:val="center"/>
+          </w:tcPr>
+          <w:p>
+            <w:pPr>
+              <w:pBdr>
+                <w:top w:val="none" w:sz="0" w:space="0" w:color="000000"/>
+                <w:left w:val="none" w:sz="0" w:space="0" w:color="000000"/>
+                <w:bottom w:val="none" w:sz="0" w:space="0" w:color="000000"/>
+                <w:right w:val="none" w:sz="0" w:space="0" w:color="000000"/>
+              </w:pBdr>
+              <w:spacing w:before="80" w:after="80"/>
+              <w:ind w:left="80" w:right="80"/>
+              <w:jc w:val="right"/>
               <w:rPr>
                 <w:rFonts w:ascii="Helvetica" w:eastAsia="Helvetica" w:hAnsi="Helvetica" w:cs="Helvetica"/>
                 <w:color w:val="000000"/>
@@ -2544,17 +3574,32 @@
         <w:tc>
           <w:tcPr>
             <w:tcW w:w="0" w:type="auto"/>
-          </w:tcPr>
-          <w:p>
-            <w:pPr>
-              <w:pBdr>
-                <w:top w:val="none" w:sz="0" w:space="0" w:color="000000"/>
-                <w:left w:val="none" w:sz="0" w:space="0" w:color="000000"/>
-                <w:bottom w:val="none" w:sz="0" w:space="0" w:color="000000"/>
-                <w:right w:val="none" w:sz="0" w:space="0" w:color="000000"/>
-              </w:pBdr>
-              <w:spacing w:before="80" w:after="80"/>
-              <w:ind w:left="80" w:right="80"/>
+            <w:tcBorders>
+              <w:top w:val="none" w:sz="0" w:space="0" w:color="000000"/>
+              <w:left w:val="none" w:sz="0" w:space="0" w:color="000000"/>
+              <w:bottom w:val="none" w:sz="0" w:space="0" w:color="000000"/>
+              <w:right w:val="none" w:sz="0" w:space="0" w:color="000000"/>
+            </w:tcBorders>
+            <w:shd w:val="clear" w:color="auto" w:fill="FFFFFF"/>
+            <w:tcMar>
+              <w:top w:w="0" w:type="dxa"/>
+              <w:left w:w="0" w:type="dxa"/>
+              <w:bottom w:w="0" w:type="dxa"/>
+              <w:right w:w="0" w:type="dxa"/>
+            </w:tcMar>
+            <w:vAlign w:val="center"/>
+          </w:tcPr>
+          <w:p>
+            <w:pPr>
+              <w:pBdr>
+                <w:top w:val="none" w:sz="0" w:space="0" w:color="000000"/>
+                <w:left w:val="none" w:sz="0" w:space="0" w:color="000000"/>
+                <w:bottom w:val="none" w:sz="0" w:space="0" w:color="000000"/>
+                <w:right w:val="none" w:sz="0" w:space="0" w:color="000000"/>
+              </w:pBdr>
+              <w:spacing w:before="80" w:after="80"/>
+              <w:ind w:left="80" w:right="80"/>
+              <w:jc w:val="right"/>
               <w:rPr>
                 <w:rFonts w:ascii="Helvetica" w:eastAsia="Helvetica" w:hAnsi="Helvetica" w:cs="Helvetica"/>
                 <w:color w:val="000000"/>
@@ -2575,7 +3620,21 @@
         </w:tc>
         <w:tc>
           <w:tcPr>
-            <w:tcW w:w="693" w:type="pct"/>
+            <w:tcW w:w="0" w:type="auto"/>
+            <w:tcBorders>
+              <w:top w:val="none" w:sz="0" w:space="0" w:color="000000"/>
+              <w:left w:val="none" w:sz="0" w:space="0" w:color="000000"/>
+              <w:bottom w:val="none" w:sz="0" w:space="0" w:color="000000"/>
+              <w:right w:val="none" w:sz="0" w:space="0" w:color="000000"/>
+            </w:tcBorders>
+            <w:shd w:val="clear" w:color="auto" w:fill="FFFFFF"/>
+            <w:tcMar>
+              <w:top w:w="0" w:type="dxa"/>
+              <w:left w:w="0" w:type="dxa"/>
+              <w:bottom w:w="0" w:type="dxa"/>
+              <w:right w:w="0" w:type="dxa"/>
+            </w:tcMar>
+            <w:vAlign w:val="center"/>
           </w:tcPr>
           <w:p>
             <w:pPr>
@@ -2607,7 +3666,21 @@
         </w:tc>
         <w:tc>
           <w:tcPr>
-            <w:tcW w:w="619" w:type="pct"/>
+            <w:tcW w:w="0" w:type="auto"/>
+            <w:tcBorders>
+              <w:top w:val="none" w:sz="0" w:space="0" w:color="000000"/>
+              <w:left w:val="none" w:sz="0" w:space="0" w:color="000000"/>
+              <w:bottom w:val="none" w:sz="0" w:space="0" w:color="000000"/>
+              <w:right w:val="none" w:sz="0" w:space="0" w:color="000000"/>
+            </w:tcBorders>
+            <w:shd w:val="clear" w:color="auto" w:fill="FFFFFF"/>
+            <w:tcMar>
+              <w:top w:w="0" w:type="dxa"/>
+              <w:left w:w="0" w:type="dxa"/>
+              <w:bottom w:w="0" w:type="dxa"/>
+              <w:right w:w="0" w:type="dxa"/>
+            </w:tcMar>
+            <w:vAlign w:val="center"/>
           </w:tcPr>
           <w:p>
             <w:pPr>
@@ -2639,7 +3712,21 @@
         </w:tc>
         <w:tc>
           <w:tcPr>
-            <w:tcW w:w="620" w:type="pct"/>
+            <w:tcW w:w="0" w:type="auto"/>
+            <w:tcBorders>
+              <w:top w:val="none" w:sz="0" w:space="0" w:color="000000"/>
+              <w:left w:val="none" w:sz="0" w:space="0" w:color="000000"/>
+              <w:bottom w:val="none" w:sz="0" w:space="0" w:color="000000"/>
+              <w:right w:val="none" w:sz="0" w:space="0" w:color="000000"/>
+            </w:tcBorders>
+            <w:shd w:val="clear" w:color="auto" w:fill="FFFFFF"/>
+            <w:tcMar>
+              <w:top w:w="0" w:type="dxa"/>
+              <w:left w:w="0" w:type="dxa"/>
+              <w:bottom w:w="0" w:type="dxa"/>
+              <w:right w:w="0" w:type="dxa"/>
+            </w:tcMar>
+            <w:vAlign w:val="center"/>
           </w:tcPr>
           <w:p>
             <w:pPr>
@@ -2671,7 +3758,21 @@
         </w:tc>
         <w:tc>
           <w:tcPr>
-            <w:tcW w:w="708" w:type="pct"/>
+            <w:tcW w:w="0" w:type="auto"/>
+            <w:tcBorders>
+              <w:top w:val="none" w:sz="0" w:space="0" w:color="000000"/>
+              <w:left w:val="none" w:sz="0" w:space="0" w:color="000000"/>
+              <w:bottom w:val="none" w:sz="0" w:space="0" w:color="000000"/>
+              <w:right w:val="none" w:sz="0" w:space="0" w:color="000000"/>
+            </w:tcBorders>
+            <w:shd w:val="clear" w:color="auto" w:fill="FFFFFF"/>
+            <w:tcMar>
+              <w:top w:w="0" w:type="dxa"/>
+              <w:left w:w="0" w:type="dxa"/>
+              <w:bottom w:w="0" w:type="dxa"/>
+              <w:right w:w="0" w:type="dxa"/>
+            </w:tcMar>
+            <w:vAlign w:val="center"/>
           </w:tcPr>
           <w:p>
             <w:pPr>
@@ -2703,7 +3804,21 @@
         </w:tc>
         <w:tc>
           <w:tcPr>
-            <w:tcW w:w="442" w:type="pct"/>
+            <w:tcW w:w="0" w:type="auto"/>
+            <w:tcBorders>
+              <w:top w:val="none" w:sz="0" w:space="0" w:color="000000"/>
+              <w:left w:val="none" w:sz="0" w:space="0" w:color="000000"/>
+              <w:bottom w:val="none" w:sz="0" w:space="0" w:color="000000"/>
+              <w:right w:val="none" w:sz="0" w:space="0" w:color="000000"/>
+            </w:tcBorders>
+            <w:shd w:val="clear" w:color="auto" w:fill="FFFFFF"/>
+            <w:tcMar>
+              <w:top w:w="0" w:type="dxa"/>
+              <w:left w:w="0" w:type="dxa"/>
+              <w:bottom w:w="0" w:type="dxa"/>
+              <w:right w:w="0" w:type="dxa"/>
+            </w:tcMar>
+            <w:vAlign w:val="center"/>
           </w:tcPr>
           <w:p>
             <w:pPr>
@@ -2735,32 +3850,42 @@
         </w:tc>
         <w:tc>
           <w:tcPr>
-            <w:tcW w:w="575" w:type="pct"/>
-          </w:tcPr>
-          <w:p>
-            <w:pPr>
-              <w:pBdr>
-                <w:top w:val="none" w:sz="0" w:space="0" w:color="000000"/>
-                <w:left w:val="none" w:sz="0" w:space="0" w:color="000000"/>
-                <w:bottom w:val="none" w:sz="0" w:space="0" w:color="000000"/>
-                <w:right w:val="none" w:sz="0" w:space="0" w:color="000000"/>
-              </w:pBdr>
-              <w:spacing w:before="80" w:after="80"/>
-              <w:ind w:left="80" w:right="80"/>
-              <w:rPr>
-                <w:rFonts w:ascii="Helvetica" w:eastAsia="Helvetica" w:hAnsi="Helvetica" w:cs="Helvetica"/>
-                <w:b/>
-                <w:bCs/>
-                <w:color w:val="000000"/>
-                <w:sz w:val="20"/>
-                <w:szCs w:val="20"/>
-              </w:rPr>
-            </w:pPr>
-            <w:r>
-              <w:rPr>
-                <w:rFonts w:ascii="Helvetica" w:eastAsia="Helvetica" w:hAnsi="Helvetica" w:cs="Helvetica"/>
-                <w:b/>
-                <w:bCs/>
+            <w:tcW w:w="0" w:type="auto"/>
+            <w:tcBorders>
+              <w:top w:val="none" w:sz="0" w:space="0" w:color="000000"/>
+              <w:left w:val="none" w:sz="0" w:space="0" w:color="000000"/>
+              <w:bottom w:val="none" w:sz="0" w:space="0" w:color="000000"/>
+              <w:right w:val="none" w:sz="0" w:space="0" w:color="000000"/>
+            </w:tcBorders>
+            <w:shd w:val="clear" w:color="auto" w:fill="FFFFFF"/>
+            <w:tcMar>
+              <w:top w:w="0" w:type="dxa"/>
+              <w:left w:w="0" w:type="dxa"/>
+              <w:bottom w:w="0" w:type="dxa"/>
+              <w:right w:w="0" w:type="dxa"/>
+            </w:tcMar>
+            <w:vAlign w:val="center"/>
+          </w:tcPr>
+          <w:p>
+            <w:pPr>
+              <w:pBdr>
+                <w:top w:val="none" w:sz="0" w:space="0" w:color="000000"/>
+                <w:left w:val="none" w:sz="0" w:space="0" w:color="000000"/>
+                <w:bottom w:val="none" w:sz="0" w:space="0" w:color="000000"/>
+                <w:right w:val="none" w:sz="0" w:space="0" w:color="000000"/>
+              </w:pBdr>
+              <w:spacing w:before="80" w:after="80"/>
+              <w:ind w:left="80" w:right="80"/>
+              <w:rPr>
+                <w:rFonts w:ascii="Helvetica" w:eastAsia="Helvetica" w:hAnsi="Helvetica" w:cs="Helvetica"/>
+                <w:color w:val="000000"/>
+                <w:sz w:val="20"/>
+                <w:szCs w:val="20"/>
+              </w:rPr>
+            </w:pPr>
+            <w:r>
+              <w:rPr>
+                <w:rFonts w:ascii="Helvetica" w:eastAsia="Helvetica" w:hAnsi="Helvetica" w:cs="Helvetica"/>
                 <w:color w:val="000000"/>
                 <w:sz w:val="20"/>
                 <w:szCs w:val="20"/>
@@ -2771,9 +3896,26 @@
         </w:tc>
       </w:tr>
       <w:tr>
-        <w:tc>
-          <w:tcPr>
-            <w:tcW w:w="513" w:type="pct"/>
+        <w:trPr>
+          <w:jc w:val="center"/>
+        </w:trPr>
+        <w:tc>
+          <w:tcPr>
+            <w:tcW w:w="0" w:type="auto"/>
+            <w:tcBorders>
+              <w:top w:val="none" w:sz="0" w:space="0" w:color="000000"/>
+              <w:left w:val="none" w:sz="0" w:space="0" w:color="000000"/>
+              <w:bottom w:val="none" w:sz="0" w:space="0" w:color="000000"/>
+              <w:right w:val="none" w:sz="0" w:space="0" w:color="000000"/>
+            </w:tcBorders>
+            <w:shd w:val="clear" w:color="auto" w:fill="FFFFFF"/>
+            <w:tcMar>
+              <w:top w:w="0" w:type="dxa"/>
+              <w:left w:w="0" w:type="dxa"/>
+              <w:bottom w:w="0" w:type="dxa"/>
+              <w:right w:w="0" w:type="dxa"/>
+            </w:tcMar>
+            <w:vAlign w:val="center"/>
           </w:tcPr>
           <w:p>
             <w:pPr>
@@ -2806,17 +3948,32 @@
         <w:tc>
           <w:tcPr>
             <w:tcW w:w="0" w:type="auto"/>
-          </w:tcPr>
-          <w:p>
-            <w:pPr>
-              <w:pBdr>
-                <w:top w:val="none" w:sz="0" w:space="0" w:color="000000"/>
-                <w:left w:val="none" w:sz="0" w:space="0" w:color="000000"/>
-                <w:bottom w:val="none" w:sz="0" w:space="0" w:color="000000"/>
-                <w:right w:val="none" w:sz="0" w:space="0" w:color="000000"/>
-              </w:pBdr>
-              <w:spacing w:before="80" w:after="80"/>
-              <w:ind w:left="80" w:right="80"/>
+            <w:tcBorders>
+              <w:top w:val="none" w:sz="0" w:space="0" w:color="000000"/>
+              <w:left w:val="none" w:sz="0" w:space="0" w:color="000000"/>
+              <w:bottom w:val="none" w:sz="0" w:space="0" w:color="000000"/>
+              <w:right w:val="none" w:sz="0" w:space="0" w:color="000000"/>
+            </w:tcBorders>
+            <w:shd w:val="clear" w:color="auto" w:fill="FFFFFF"/>
+            <w:tcMar>
+              <w:top w:w="0" w:type="dxa"/>
+              <w:left w:w="0" w:type="dxa"/>
+              <w:bottom w:w="0" w:type="dxa"/>
+              <w:right w:w="0" w:type="dxa"/>
+            </w:tcMar>
+            <w:vAlign w:val="center"/>
+          </w:tcPr>
+          <w:p>
+            <w:pPr>
+              <w:pBdr>
+                <w:top w:val="none" w:sz="0" w:space="0" w:color="000000"/>
+                <w:left w:val="none" w:sz="0" w:space="0" w:color="000000"/>
+                <w:bottom w:val="none" w:sz="0" w:space="0" w:color="000000"/>
+                <w:right w:val="none" w:sz="0" w:space="0" w:color="000000"/>
+              </w:pBdr>
+              <w:spacing w:before="80" w:after="80"/>
+              <w:ind w:left="80" w:right="80"/>
+              <w:jc w:val="right"/>
               <w:rPr>
                 <w:rFonts w:ascii="Helvetica" w:eastAsia="Helvetica" w:hAnsi="Helvetica" w:cs="Helvetica"/>
                 <w:color w:val="000000"/>
@@ -2838,279 +3995,406 @@
         <w:tc>
           <w:tcPr>
             <w:tcW w:w="0" w:type="auto"/>
-          </w:tcPr>
-          <w:p>
-            <w:pPr>
-              <w:pBdr>
-                <w:top w:val="none" w:sz="0" w:space="0" w:color="000000"/>
-                <w:left w:val="none" w:sz="0" w:space="0" w:color="000000"/>
-                <w:bottom w:val="none" w:sz="0" w:space="0" w:color="000000"/>
-                <w:right w:val="none" w:sz="0" w:space="0" w:color="000000"/>
-              </w:pBdr>
-              <w:spacing w:before="80" w:after="80"/>
-              <w:ind w:left="80" w:right="80"/>
-              <w:rPr>
-                <w:rFonts w:ascii="Helvetica" w:eastAsia="Helvetica" w:hAnsi="Helvetica" w:cs="Helvetica"/>
-                <w:color w:val="000000"/>
-                <w:sz w:val="20"/>
-                <w:szCs w:val="20"/>
-              </w:rPr>
-            </w:pPr>
-            <w:r>
-              <w:rPr>
-                <w:rFonts w:ascii="Helvetica" w:eastAsia="Helvetica" w:hAnsi="Helvetica" w:cs="Helvetica"/>
-                <w:color w:val="000000"/>
-                <w:sz w:val="20"/>
-                <w:szCs w:val="20"/>
-              </w:rPr>
-              <w:t>28</w:t>
-            </w:r>
-          </w:p>
-        </w:tc>
-        <w:tc>
-          <w:tcPr>
-            <w:tcW w:w="693" w:type="pct"/>
-          </w:tcPr>
-          <w:p>
-            <w:pPr>
-              <w:pBdr>
-                <w:top w:val="none" w:sz="0" w:space="0" w:color="000000"/>
-                <w:left w:val="none" w:sz="0" w:space="0" w:color="000000"/>
-                <w:bottom w:val="none" w:sz="0" w:space="0" w:color="000000"/>
-                <w:right w:val="none" w:sz="0" w:space="0" w:color="000000"/>
-              </w:pBdr>
-              <w:spacing w:before="80" w:after="80"/>
-              <w:ind w:left="80" w:right="80"/>
-              <w:rPr>
-                <w:rFonts w:ascii="Helvetica" w:eastAsia="Helvetica" w:hAnsi="Helvetica" w:cs="Helvetica"/>
-                <w:color w:val="000000"/>
-                <w:sz w:val="20"/>
-                <w:szCs w:val="20"/>
-              </w:rPr>
-            </w:pPr>
-            <w:r>
-              <w:rPr>
-                <w:rFonts w:ascii="Helvetica" w:eastAsia="Helvetica" w:hAnsi="Helvetica" w:cs="Helvetica"/>
-                <w:color w:val="000000"/>
-                <w:sz w:val="20"/>
-                <w:szCs w:val="20"/>
-              </w:rPr>
-              <w:t>0.00418 [0.0016, 0.0109]</w:t>
-            </w:r>
-          </w:p>
-        </w:tc>
-        <w:tc>
-          <w:tcPr>
-            <w:tcW w:w="619" w:type="pct"/>
-          </w:tcPr>
-          <w:p>
-            <w:pPr>
-              <w:pBdr>
-                <w:top w:val="none" w:sz="0" w:space="0" w:color="000000"/>
-                <w:left w:val="none" w:sz="0" w:space="0" w:color="000000"/>
-                <w:bottom w:val="none" w:sz="0" w:space="0" w:color="000000"/>
-                <w:right w:val="none" w:sz="0" w:space="0" w:color="000000"/>
-              </w:pBdr>
-              <w:spacing w:before="80" w:after="80"/>
-              <w:ind w:left="80" w:right="80"/>
-              <w:rPr>
-                <w:rFonts w:ascii="Helvetica" w:eastAsia="Helvetica" w:hAnsi="Helvetica" w:cs="Helvetica"/>
-                <w:color w:val="000000"/>
-                <w:sz w:val="20"/>
-                <w:szCs w:val="20"/>
-              </w:rPr>
-            </w:pPr>
-            <w:r>
-              <w:rPr>
-                <w:rFonts w:ascii="Helvetica" w:eastAsia="Helvetica" w:hAnsi="Helvetica" w:cs="Helvetica"/>
-                <w:color w:val="000000"/>
-                <w:sz w:val="20"/>
-                <w:szCs w:val="20"/>
-              </w:rPr>
-              <w:t>0.022 [-0.222, 0.266]</w:t>
-            </w:r>
-          </w:p>
-        </w:tc>
-        <w:tc>
-          <w:tcPr>
-            <w:tcW w:w="620" w:type="pct"/>
-          </w:tcPr>
-          <w:p>
-            <w:pPr>
-              <w:pBdr>
-                <w:top w:val="none" w:sz="0" w:space="0" w:color="000000"/>
-                <w:left w:val="none" w:sz="0" w:space="0" w:color="000000"/>
-                <w:bottom w:val="none" w:sz="0" w:space="0" w:color="000000"/>
-                <w:right w:val="none" w:sz="0" w:space="0" w:color="000000"/>
-              </w:pBdr>
-              <w:spacing w:before="80" w:after="80"/>
-              <w:ind w:left="80" w:right="80"/>
-              <w:rPr>
-                <w:rFonts w:ascii="Helvetica" w:eastAsia="Helvetica" w:hAnsi="Helvetica" w:cs="Helvetica"/>
-                <w:color w:val="000000"/>
-                <w:sz w:val="20"/>
-                <w:szCs w:val="20"/>
-              </w:rPr>
-            </w:pPr>
-            <w:r>
-              <w:rPr>
-                <w:rFonts w:ascii="Helvetica" w:eastAsia="Helvetica" w:hAnsi="Helvetica" w:cs="Helvetica"/>
-                <w:color w:val="000000"/>
-                <w:sz w:val="20"/>
-                <w:szCs w:val="20"/>
-              </w:rPr>
-              <w:t>0.0173 [0.00583, 0.0512]</w:t>
-            </w:r>
-          </w:p>
-        </w:tc>
-        <w:tc>
-          <w:tcPr>
-            <w:tcW w:w="708" w:type="pct"/>
-          </w:tcPr>
-          <w:p>
-            <w:pPr>
-              <w:pBdr>
-                <w:top w:val="none" w:sz="0" w:space="0" w:color="000000"/>
-                <w:left w:val="none" w:sz="0" w:space="0" w:color="000000"/>
-                <w:bottom w:val="none" w:sz="0" w:space="0" w:color="000000"/>
-                <w:right w:val="none" w:sz="0" w:space="0" w:color="000000"/>
-              </w:pBdr>
-              <w:spacing w:before="80" w:after="80"/>
-              <w:ind w:left="80" w:right="80"/>
-              <w:rPr>
-                <w:rFonts w:ascii="Helvetica" w:eastAsia="Helvetica" w:hAnsi="Helvetica" w:cs="Helvetica"/>
-                <w:color w:val="000000"/>
-                <w:sz w:val="20"/>
-                <w:szCs w:val="20"/>
-              </w:rPr>
-            </w:pPr>
-            <w:r>
-              <w:rPr>
-                <w:rFonts w:ascii="Helvetica" w:eastAsia="Helvetica" w:hAnsi="Helvetica" w:cs="Helvetica"/>
-                <w:color w:val="000000"/>
-                <w:sz w:val="20"/>
-                <w:szCs w:val="20"/>
-              </w:rPr>
-              <w:t>-0.028 [-0.252, 0.195]</w:t>
-            </w:r>
-          </w:p>
-        </w:tc>
-        <w:tc>
-          <w:tcPr>
-            <w:tcW w:w="442" w:type="pct"/>
-          </w:tcPr>
-          <w:p>
-            <w:pPr>
-              <w:pBdr>
-                <w:top w:val="none" w:sz="0" w:space="0" w:color="000000"/>
-                <w:left w:val="none" w:sz="0" w:space="0" w:color="000000"/>
-                <w:bottom w:val="none" w:sz="0" w:space="0" w:color="000000"/>
-                <w:right w:val="none" w:sz="0" w:space="0" w:color="000000"/>
-              </w:pBdr>
-              <w:spacing w:before="80" w:after="80"/>
-              <w:ind w:left="80" w:right="80"/>
-              <w:rPr>
-                <w:rFonts w:ascii="Helvetica" w:eastAsia="Helvetica" w:hAnsi="Helvetica" w:cs="Helvetica"/>
-                <w:color w:val="000000"/>
-                <w:sz w:val="20"/>
-                <w:szCs w:val="20"/>
-              </w:rPr>
-            </w:pPr>
-            <w:r>
-              <w:rPr>
-                <w:rFonts w:ascii="Helvetica" w:eastAsia="Helvetica" w:hAnsi="Helvetica" w:cs="Helvetica"/>
-                <w:color w:val="000000"/>
-                <w:sz w:val="20"/>
-                <w:szCs w:val="20"/>
-              </w:rPr>
-              <w:t>0.762</w:t>
-            </w:r>
-          </w:p>
-        </w:tc>
-        <w:tc>
-          <w:tcPr>
-            <w:tcW w:w="575" w:type="pct"/>
-          </w:tcPr>
-          <w:p>
-            <w:pPr>
-              <w:pBdr>
-                <w:top w:val="none" w:sz="0" w:space="0" w:color="000000"/>
-                <w:left w:val="none" w:sz="0" w:space="0" w:color="000000"/>
-                <w:bottom w:val="none" w:sz="0" w:space="0" w:color="000000"/>
-                <w:right w:val="none" w:sz="0" w:space="0" w:color="000000"/>
-              </w:pBdr>
-              <w:spacing w:before="80" w:after="80"/>
-              <w:ind w:left="80" w:right="80"/>
-              <w:rPr>
-                <w:rFonts w:ascii="Helvetica" w:eastAsia="Helvetica" w:hAnsi="Helvetica" w:cs="Helvetica"/>
-                <w:b/>
-                <w:bCs/>
-                <w:color w:val="000000"/>
-                <w:sz w:val="20"/>
-                <w:szCs w:val="20"/>
-              </w:rPr>
-            </w:pPr>
-            <w:r>
-              <w:rPr>
-                <w:rFonts w:ascii="Helvetica" w:eastAsia="Helvetica" w:hAnsi="Helvetica" w:cs="Helvetica"/>
-                <w:b/>
-                <w:bCs/>
-                <w:color w:val="000000"/>
-                <w:sz w:val="20"/>
-                <w:szCs w:val="20"/>
-              </w:rPr>
-              <w:t>0.055</w:t>
+            <w:tcBorders>
+              <w:top w:val="none" w:sz="0" w:space="0" w:color="000000"/>
+              <w:left w:val="none" w:sz="0" w:space="0" w:color="000000"/>
+              <w:bottom w:val="none" w:sz="0" w:space="0" w:color="000000"/>
+              <w:right w:val="none" w:sz="0" w:space="0" w:color="000000"/>
+            </w:tcBorders>
+            <w:shd w:val="clear" w:color="auto" w:fill="FFFFFF"/>
+            <w:tcMar>
+              <w:top w:w="0" w:type="dxa"/>
+              <w:left w:w="0" w:type="dxa"/>
+              <w:bottom w:w="0" w:type="dxa"/>
+              <w:right w:w="0" w:type="dxa"/>
+            </w:tcMar>
+            <w:vAlign w:val="center"/>
+          </w:tcPr>
+          <w:p>
+            <w:pPr>
+              <w:pBdr>
+                <w:top w:val="none" w:sz="0" w:space="0" w:color="000000"/>
+                <w:left w:val="none" w:sz="0" w:space="0" w:color="000000"/>
+                <w:bottom w:val="none" w:sz="0" w:space="0" w:color="000000"/>
+                <w:right w:val="none" w:sz="0" w:space="0" w:color="000000"/>
+              </w:pBdr>
+              <w:spacing w:before="80" w:after="80"/>
+              <w:ind w:left="80" w:right="80"/>
+              <w:jc w:val="right"/>
+              <w:rPr>
+                <w:rFonts w:ascii="Helvetica" w:eastAsia="Helvetica" w:hAnsi="Helvetica" w:cs="Helvetica"/>
+                <w:color w:val="000000"/>
+                <w:sz w:val="20"/>
+                <w:szCs w:val="20"/>
+              </w:rPr>
+            </w:pPr>
+            <w:r>
+              <w:rPr>
+                <w:rFonts w:ascii="Helvetica" w:eastAsia="Helvetica" w:hAnsi="Helvetica" w:cs="Helvetica"/>
+                <w:color w:val="000000"/>
+                <w:sz w:val="20"/>
+                <w:szCs w:val="20"/>
+              </w:rPr>
+              <w:t>40</w:t>
+            </w:r>
+          </w:p>
+        </w:tc>
+        <w:tc>
+          <w:tcPr>
+            <w:tcW w:w="0" w:type="auto"/>
+            <w:tcBorders>
+              <w:top w:val="none" w:sz="0" w:space="0" w:color="000000"/>
+              <w:left w:val="none" w:sz="0" w:space="0" w:color="000000"/>
+              <w:bottom w:val="none" w:sz="0" w:space="0" w:color="000000"/>
+              <w:right w:val="none" w:sz="0" w:space="0" w:color="000000"/>
+            </w:tcBorders>
+            <w:shd w:val="clear" w:color="auto" w:fill="FFFFFF"/>
+            <w:tcMar>
+              <w:top w:w="0" w:type="dxa"/>
+              <w:left w:w="0" w:type="dxa"/>
+              <w:bottom w:w="0" w:type="dxa"/>
+              <w:right w:w="0" w:type="dxa"/>
+            </w:tcMar>
+            <w:vAlign w:val="center"/>
+          </w:tcPr>
+          <w:p>
+            <w:pPr>
+              <w:pBdr>
+                <w:top w:val="none" w:sz="0" w:space="0" w:color="000000"/>
+                <w:left w:val="none" w:sz="0" w:space="0" w:color="000000"/>
+                <w:bottom w:val="none" w:sz="0" w:space="0" w:color="000000"/>
+                <w:right w:val="none" w:sz="0" w:space="0" w:color="000000"/>
+              </w:pBdr>
+              <w:spacing w:before="80" w:after="80"/>
+              <w:ind w:left="80" w:right="80"/>
+              <w:rPr>
+                <w:rFonts w:ascii="Helvetica" w:eastAsia="Helvetica" w:hAnsi="Helvetica" w:cs="Helvetica"/>
+                <w:color w:val="000000"/>
+                <w:sz w:val="20"/>
+                <w:szCs w:val="20"/>
+              </w:rPr>
+            </w:pPr>
+            <w:r>
+              <w:rPr>
+                <w:rFonts w:ascii="Helvetica" w:eastAsia="Helvetica" w:hAnsi="Helvetica" w:cs="Helvetica"/>
+                <w:color w:val="000000"/>
+                <w:sz w:val="20"/>
+                <w:szCs w:val="20"/>
+              </w:rPr>
+              <w:t>0.00418 [0.00132, 0.0133]</w:t>
+            </w:r>
+          </w:p>
+        </w:tc>
+        <w:tc>
+          <w:tcPr>
+            <w:tcW w:w="0" w:type="auto"/>
+            <w:tcBorders>
+              <w:top w:val="none" w:sz="0" w:space="0" w:color="000000"/>
+              <w:left w:val="none" w:sz="0" w:space="0" w:color="000000"/>
+              <w:bottom w:val="none" w:sz="0" w:space="0" w:color="000000"/>
+              <w:right w:val="none" w:sz="0" w:space="0" w:color="000000"/>
+            </w:tcBorders>
+            <w:shd w:val="clear" w:color="auto" w:fill="FFFFFF"/>
+            <w:tcMar>
+              <w:top w:w="0" w:type="dxa"/>
+              <w:left w:w="0" w:type="dxa"/>
+              <w:bottom w:w="0" w:type="dxa"/>
+              <w:right w:w="0" w:type="dxa"/>
+            </w:tcMar>
+            <w:vAlign w:val="center"/>
+          </w:tcPr>
+          <w:p>
+            <w:pPr>
+              <w:pBdr>
+                <w:top w:val="none" w:sz="0" w:space="0" w:color="000000"/>
+                <w:left w:val="none" w:sz="0" w:space="0" w:color="000000"/>
+                <w:bottom w:val="none" w:sz="0" w:space="0" w:color="000000"/>
+                <w:right w:val="none" w:sz="0" w:space="0" w:color="000000"/>
+              </w:pBdr>
+              <w:spacing w:before="80" w:after="80"/>
+              <w:ind w:left="80" w:right="80"/>
+              <w:rPr>
+                <w:rFonts w:ascii="Helvetica" w:eastAsia="Helvetica" w:hAnsi="Helvetica" w:cs="Helvetica"/>
+                <w:color w:val="000000"/>
+                <w:sz w:val="20"/>
+                <w:szCs w:val="20"/>
+              </w:rPr>
+            </w:pPr>
+            <w:r>
+              <w:rPr>
+                <w:rFonts w:ascii="Helvetica" w:eastAsia="Helvetica" w:hAnsi="Helvetica" w:cs="Helvetica"/>
+                <w:color w:val="000000"/>
+                <w:sz w:val="20"/>
+                <w:szCs w:val="20"/>
+              </w:rPr>
+              <w:t>0.022 [-0.271, 0.315]</w:t>
+            </w:r>
+          </w:p>
+        </w:tc>
+        <w:tc>
+          <w:tcPr>
+            <w:tcW w:w="0" w:type="auto"/>
+            <w:tcBorders>
+              <w:top w:val="none" w:sz="0" w:space="0" w:color="000000"/>
+              <w:left w:val="none" w:sz="0" w:space="0" w:color="000000"/>
+              <w:bottom w:val="none" w:sz="0" w:space="0" w:color="000000"/>
+              <w:right w:val="none" w:sz="0" w:space="0" w:color="000000"/>
+            </w:tcBorders>
+            <w:shd w:val="clear" w:color="auto" w:fill="FFFFFF"/>
+            <w:tcMar>
+              <w:top w:w="0" w:type="dxa"/>
+              <w:left w:w="0" w:type="dxa"/>
+              <w:bottom w:w="0" w:type="dxa"/>
+              <w:right w:w="0" w:type="dxa"/>
+            </w:tcMar>
+            <w:vAlign w:val="center"/>
+          </w:tcPr>
+          <w:p>
+            <w:pPr>
+              <w:pBdr>
+                <w:top w:val="none" w:sz="0" w:space="0" w:color="000000"/>
+                <w:left w:val="none" w:sz="0" w:space="0" w:color="000000"/>
+                <w:bottom w:val="none" w:sz="0" w:space="0" w:color="000000"/>
+                <w:right w:val="none" w:sz="0" w:space="0" w:color="000000"/>
+              </w:pBdr>
+              <w:spacing w:before="80" w:after="80"/>
+              <w:ind w:left="80" w:right="80"/>
+              <w:rPr>
+                <w:rFonts w:ascii="Helvetica" w:eastAsia="Helvetica" w:hAnsi="Helvetica" w:cs="Helvetica"/>
+                <w:color w:val="000000"/>
+                <w:sz w:val="20"/>
+                <w:szCs w:val="20"/>
+              </w:rPr>
+            </w:pPr>
+            <w:r>
+              <w:rPr>
+                <w:rFonts w:ascii="Helvetica" w:eastAsia="Helvetica" w:hAnsi="Helvetica" w:cs="Helvetica"/>
+                <w:color w:val="000000"/>
+                <w:sz w:val="20"/>
+                <w:szCs w:val="20"/>
+              </w:rPr>
+              <w:t>0.00557 [0.00274, 0.0113]</w:t>
+            </w:r>
+          </w:p>
+        </w:tc>
+        <w:tc>
+          <w:tcPr>
+            <w:tcW w:w="0" w:type="auto"/>
+            <w:tcBorders>
+              <w:top w:val="none" w:sz="0" w:space="0" w:color="000000"/>
+              <w:left w:val="none" w:sz="0" w:space="0" w:color="000000"/>
+              <w:bottom w:val="none" w:sz="0" w:space="0" w:color="000000"/>
+              <w:right w:val="none" w:sz="0" w:space="0" w:color="000000"/>
+            </w:tcBorders>
+            <w:shd w:val="clear" w:color="auto" w:fill="FFFFFF"/>
+            <w:tcMar>
+              <w:top w:w="0" w:type="dxa"/>
+              <w:left w:w="0" w:type="dxa"/>
+              <w:bottom w:w="0" w:type="dxa"/>
+              <w:right w:w="0" w:type="dxa"/>
+            </w:tcMar>
+            <w:vAlign w:val="center"/>
+          </w:tcPr>
+          <w:p>
+            <w:pPr>
+              <w:pBdr>
+                <w:top w:val="none" w:sz="0" w:space="0" w:color="000000"/>
+                <w:left w:val="none" w:sz="0" w:space="0" w:color="000000"/>
+                <w:bottom w:val="none" w:sz="0" w:space="0" w:color="000000"/>
+                <w:right w:val="none" w:sz="0" w:space="0" w:color="000000"/>
+              </w:pBdr>
+              <w:spacing w:before="80" w:after="80"/>
+              <w:ind w:left="80" w:right="80"/>
+              <w:rPr>
+                <w:rFonts w:ascii="Helvetica" w:eastAsia="Helvetica" w:hAnsi="Helvetica" w:cs="Helvetica"/>
+                <w:color w:val="000000"/>
+                <w:sz w:val="20"/>
+                <w:szCs w:val="20"/>
+              </w:rPr>
+            </w:pPr>
+            <w:r>
+              <w:rPr>
+                <w:rFonts w:ascii="Helvetica" w:eastAsia="Helvetica" w:hAnsi="Helvetica" w:cs="Helvetica"/>
+                <w:color w:val="000000"/>
+                <w:sz w:val="20"/>
+                <w:szCs w:val="20"/>
+              </w:rPr>
+              <w:t>0.109 [-0.047, 0.266]</w:t>
+            </w:r>
+          </w:p>
+        </w:tc>
+        <w:tc>
+          <w:tcPr>
+            <w:tcW w:w="0" w:type="auto"/>
+            <w:tcBorders>
+              <w:top w:val="none" w:sz="0" w:space="0" w:color="000000"/>
+              <w:left w:val="none" w:sz="0" w:space="0" w:color="000000"/>
+              <w:bottom w:val="none" w:sz="0" w:space="0" w:color="000000"/>
+              <w:right w:val="none" w:sz="0" w:space="0" w:color="000000"/>
+            </w:tcBorders>
+            <w:shd w:val="clear" w:color="auto" w:fill="FFFFFF"/>
+            <w:tcMar>
+              <w:top w:w="0" w:type="dxa"/>
+              <w:left w:w="0" w:type="dxa"/>
+              <w:bottom w:w="0" w:type="dxa"/>
+              <w:right w:w="0" w:type="dxa"/>
+            </w:tcMar>
+            <w:vAlign w:val="center"/>
+          </w:tcPr>
+          <w:p>
+            <w:pPr>
+              <w:pBdr>
+                <w:top w:val="none" w:sz="0" w:space="0" w:color="000000"/>
+                <w:left w:val="none" w:sz="0" w:space="0" w:color="000000"/>
+                <w:bottom w:val="none" w:sz="0" w:space="0" w:color="000000"/>
+                <w:right w:val="none" w:sz="0" w:space="0" w:color="000000"/>
+              </w:pBdr>
+              <w:spacing w:before="80" w:after="80"/>
+              <w:ind w:left="80" w:right="80"/>
+              <w:rPr>
+                <w:rFonts w:ascii="Helvetica" w:eastAsia="Helvetica" w:hAnsi="Helvetica" w:cs="Helvetica"/>
+                <w:color w:val="000000"/>
+                <w:sz w:val="20"/>
+                <w:szCs w:val="20"/>
+              </w:rPr>
+            </w:pPr>
+            <w:r>
+              <w:rPr>
+                <w:rFonts w:ascii="Helvetica" w:eastAsia="Helvetica" w:hAnsi="Helvetica" w:cs="Helvetica"/>
+                <w:color w:val="000000"/>
+                <w:sz w:val="20"/>
+                <w:szCs w:val="20"/>
+              </w:rPr>
+              <w:t>0.601</w:t>
+            </w:r>
+          </w:p>
+        </w:tc>
+        <w:tc>
+          <w:tcPr>
+            <w:tcW w:w="0" w:type="auto"/>
+            <w:tcBorders>
+              <w:top w:val="none" w:sz="0" w:space="0" w:color="000000"/>
+              <w:left w:val="none" w:sz="0" w:space="0" w:color="000000"/>
+              <w:bottom w:val="none" w:sz="0" w:space="0" w:color="000000"/>
+              <w:right w:val="none" w:sz="0" w:space="0" w:color="000000"/>
+            </w:tcBorders>
+            <w:shd w:val="clear" w:color="auto" w:fill="FFFFFF"/>
+            <w:tcMar>
+              <w:top w:w="0" w:type="dxa"/>
+              <w:left w:w="0" w:type="dxa"/>
+              <w:bottom w:w="0" w:type="dxa"/>
+              <w:right w:w="0" w:type="dxa"/>
+            </w:tcMar>
+            <w:vAlign w:val="center"/>
+          </w:tcPr>
+          <w:p>
+            <w:pPr>
+              <w:pBdr>
+                <w:top w:val="none" w:sz="0" w:space="0" w:color="000000"/>
+                <w:left w:val="none" w:sz="0" w:space="0" w:color="000000"/>
+                <w:bottom w:val="none" w:sz="0" w:space="0" w:color="000000"/>
+                <w:right w:val="none" w:sz="0" w:space="0" w:color="000000"/>
+              </w:pBdr>
+              <w:spacing w:before="80" w:after="80"/>
+              <w:ind w:left="80" w:right="80"/>
+              <w:rPr>
+                <w:rFonts w:ascii="Helvetica" w:eastAsia="Helvetica" w:hAnsi="Helvetica" w:cs="Helvetica"/>
+                <w:color w:val="000000"/>
+                <w:sz w:val="20"/>
+                <w:szCs w:val="20"/>
+              </w:rPr>
+            </w:pPr>
+            <w:r>
+              <w:rPr>
+                <w:rFonts w:ascii="Helvetica" w:eastAsia="Helvetica" w:hAnsi="Helvetica" w:cs="Helvetica"/>
+                <w:color w:val="000000"/>
+                <w:sz w:val="20"/>
+                <w:szCs w:val="20"/>
+              </w:rPr>
+              <w:t>0.673</w:t>
             </w:r>
           </w:p>
         </w:tc>
       </w:tr>
       <w:tr>
-        <w:tc>
-          <w:tcPr>
-            <w:tcW w:w="513" w:type="pct"/>
-          </w:tcPr>
-          <w:p>
-            <w:pPr>
-              <w:pBdr>
-                <w:top w:val="none" w:sz="0" w:space="0" w:color="000000"/>
-                <w:left w:val="none" w:sz="0" w:space="0" w:color="000000"/>
-                <w:bottom w:val="none" w:sz="0" w:space="0" w:color="000000"/>
-                <w:right w:val="none" w:sz="0" w:space="0" w:color="000000"/>
-              </w:pBdr>
-              <w:spacing w:before="80" w:after="80"/>
-              <w:ind w:left="80" w:right="80"/>
-              <w:rPr>
-                <w:rFonts w:ascii="Helvetica" w:eastAsia="Helvetica" w:hAnsi="Helvetica" w:cs="Helvetica"/>
-                <w:color w:val="000000"/>
-                <w:sz w:val="20"/>
-                <w:szCs w:val="20"/>
-              </w:rPr>
-            </w:pPr>
-            <w:r>
-              <w:rPr>
-                <w:rFonts w:ascii="Helvetica" w:eastAsia="Helvetica" w:hAnsi="Helvetica" w:cs="Helvetica"/>
-                <w:color w:val="000000"/>
-                <w:sz w:val="20"/>
-                <w:szCs w:val="20"/>
-              </w:rPr>
-              <w:t>Si</w:t>
-            </w:r>
-          </w:p>
-        </w:tc>
-        <w:tc>
-          <w:tcPr>
-            <w:tcW w:w="0" w:type="auto"/>
-          </w:tcPr>
-          <w:p>
-            <w:pPr>
-              <w:pBdr>
-                <w:top w:val="none" w:sz="0" w:space="0" w:color="000000"/>
-                <w:left w:val="none" w:sz="0" w:space="0" w:color="000000"/>
-                <w:bottom w:val="none" w:sz="0" w:space="0" w:color="000000"/>
-                <w:right w:val="none" w:sz="0" w:space="0" w:color="000000"/>
-              </w:pBdr>
-              <w:spacing w:before="80" w:after="80"/>
-              <w:ind w:left="80" w:right="80"/>
+        <w:trPr>
+          <w:jc w:val="center"/>
+        </w:trPr>
+        <w:tc>
+          <w:tcPr>
+            <w:tcW w:w="0" w:type="auto"/>
+            <w:tcBorders>
+              <w:top w:val="none" w:sz="0" w:space="0" w:color="000000"/>
+              <w:left w:val="none" w:sz="0" w:space="0" w:color="000000"/>
+              <w:bottom w:val="none" w:sz="0" w:space="0" w:color="000000"/>
+              <w:right w:val="none" w:sz="0" w:space="0" w:color="000000"/>
+            </w:tcBorders>
+            <w:shd w:val="clear" w:color="auto" w:fill="FFFFFF"/>
+            <w:tcMar>
+              <w:top w:w="0" w:type="dxa"/>
+              <w:left w:w="0" w:type="dxa"/>
+              <w:bottom w:w="0" w:type="dxa"/>
+              <w:right w:w="0" w:type="dxa"/>
+            </w:tcMar>
+            <w:vAlign w:val="center"/>
+          </w:tcPr>
+          <w:p>
+            <w:pPr>
+              <w:pBdr>
+                <w:top w:val="none" w:sz="0" w:space="0" w:color="000000"/>
+                <w:left w:val="none" w:sz="0" w:space="0" w:color="000000"/>
+                <w:bottom w:val="none" w:sz="0" w:space="0" w:color="000000"/>
+                <w:right w:val="none" w:sz="0" w:space="0" w:color="000000"/>
+              </w:pBdr>
+              <w:spacing w:before="80" w:after="80"/>
+              <w:ind w:left="80" w:right="80"/>
+              <w:rPr>
+                <w:rFonts w:ascii="Helvetica" w:eastAsia="Helvetica" w:hAnsi="Helvetica" w:cs="Helvetica"/>
+                <w:color w:val="000000"/>
+                <w:sz w:val="20"/>
+                <w:szCs w:val="20"/>
+              </w:rPr>
+            </w:pPr>
+            <w:r>
+              <w:rPr>
+                <w:rFonts w:ascii="Helvetica" w:eastAsia="Helvetica" w:hAnsi="Helvetica" w:cs="Helvetica"/>
+                <w:color w:val="000000"/>
+                <w:sz w:val="20"/>
+                <w:szCs w:val="20"/>
+              </w:rPr>
+              <w:t>Si^{'4+'}</w:t>
+            </w:r>
+          </w:p>
+        </w:tc>
+        <w:tc>
+          <w:tcPr>
+            <w:tcW w:w="0" w:type="auto"/>
+            <w:tcBorders>
+              <w:top w:val="none" w:sz="0" w:space="0" w:color="000000"/>
+              <w:left w:val="none" w:sz="0" w:space="0" w:color="000000"/>
+              <w:bottom w:val="none" w:sz="0" w:space="0" w:color="000000"/>
+              <w:right w:val="none" w:sz="0" w:space="0" w:color="000000"/>
+            </w:tcBorders>
+            <w:shd w:val="clear" w:color="auto" w:fill="FFFFFF"/>
+            <w:tcMar>
+              <w:top w:w="0" w:type="dxa"/>
+              <w:left w:w="0" w:type="dxa"/>
+              <w:bottom w:w="0" w:type="dxa"/>
+              <w:right w:w="0" w:type="dxa"/>
+            </w:tcMar>
+            <w:vAlign w:val="center"/>
+          </w:tcPr>
+          <w:p>
+            <w:pPr>
+              <w:pBdr>
+                <w:top w:val="none" w:sz="0" w:space="0" w:color="000000"/>
+                <w:left w:val="none" w:sz="0" w:space="0" w:color="000000"/>
+                <w:bottom w:val="none" w:sz="0" w:space="0" w:color="000000"/>
+                <w:right w:val="none" w:sz="0" w:space="0" w:color="000000"/>
+              </w:pBdr>
+              <w:spacing w:before="80" w:after="80"/>
+              <w:ind w:left="80" w:right="80"/>
+              <w:jc w:val="right"/>
               <w:rPr>
                 <w:rFonts w:ascii="Helvetica" w:eastAsia="Helvetica" w:hAnsi="Helvetica" w:cs="Helvetica"/>
                 <w:color w:val="000000"/>
@@ -3132,17 +4416,32 @@
         <w:tc>
           <w:tcPr>
             <w:tcW w:w="0" w:type="auto"/>
-          </w:tcPr>
-          <w:p>
-            <w:pPr>
-              <w:pBdr>
-                <w:top w:val="none" w:sz="0" w:space="0" w:color="000000"/>
-                <w:left w:val="none" w:sz="0" w:space="0" w:color="000000"/>
-                <w:bottom w:val="none" w:sz="0" w:space="0" w:color="000000"/>
-                <w:right w:val="none" w:sz="0" w:space="0" w:color="000000"/>
-              </w:pBdr>
-              <w:spacing w:before="80" w:after="80"/>
-              <w:ind w:left="80" w:right="80"/>
+            <w:tcBorders>
+              <w:top w:val="none" w:sz="0" w:space="0" w:color="000000"/>
+              <w:left w:val="none" w:sz="0" w:space="0" w:color="000000"/>
+              <w:bottom w:val="none" w:sz="0" w:space="0" w:color="000000"/>
+              <w:right w:val="none" w:sz="0" w:space="0" w:color="000000"/>
+            </w:tcBorders>
+            <w:shd w:val="clear" w:color="auto" w:fill="FFFFFF"/>
+            <w:tcMar>
+              <w:top w:w="0" w:type="dxa"/>
+              <w:left w:w="0" w:type="dxa"/>
+              <w:bottom w:w="0" w:type="dxa"/>
+              <w:right w:w="0" w:type="dxa"/>
+            </w:tcMar>
+            <w:vAlign w:val="center"/>
+          </w:tcPr>
+          <w:p>
+            <w:pPr>
+              <w:pBdr>
+                <w:top w:val="none" w:sz="0" w:space="0" w:color="000000"/>
+                <w:left w:val="none" w:sz="0" w:space="0" w:color="000000"/>
+                <w:bottom w:val="none" w:sz="0" w:space="0" w:color="000000"/>
+                <w:right w:val="none" w:sz="0" w:space="0" w:color="000000"/>
+              </w:pBdr>
+              <w:spacing w:before="80" w:after="80"/>
+              <w:ind w:left="80" w:right="80"/>
+              <w:jc w:val="right"/>
               <w:rPr>
                 <w:rFonts w:ascii="Helvetica" w:eastAsia="Helvetica" w:hAnsi="Helvetica" w:cs="Helvetica"/>
                 <w:color w:val="000000"/>
@@ -3163,7 +4462,21 @@
         </w:tc>
         <w:tc>
           <w:tcPr>
-            <w:tcW w:w="693" w:type="pct"/>
+            <w:tcW w:w="0" w:type="auto"/>
+            <w:tcBorders>
+              <w:top w:val="none" w:sz="0" w:space="0" w:color="000000"/>
+              <w:left w:val="none" w:sz="0" w:space="0" w:color="000000"/>
+              <w:bottom w:val="none" w:sz="0" w:space="0" w:color="000000"/>
+              <w:right w:val="none" w:sz="0" w:space="0" w:color="000000"/>
+            </w:tcBorders>
+            <w:shd w:val="clear" w:color="auto" w:fill="FFFFFF"/>
+            <w:tcMar>
+              <w:top w:w="0" w:type="dxa"/>
+              <w:left w:w="0" w:type="dxa"/>
+              <w:bottom w:w="0" w:type="dxa"/>
+              <w:right w:w="0" w:type="dxa"/>
+            </w:tcMar>
+            <w:vAlign w:val="center"/>
           </w:tcPr>
           <w:p>
             <w:pPr>
@@ -3195,139 +4508,227 @@
         </w:tc>
         <w:tc>
           <w:tcPr>
-            <w:tcW w:w="619" w:type="pct"/>
-          </w:tcPr>
-          <w:p>
-            <w:pPr>
-              <w:pBdr>
-                <w:top w:val="none" w:sz="0" w:space="0" w:color="000000"/>
-                <w:left w:val="none" w:sz="0" w:space="0" w:color="000000"/>
-                <w:bottom w:val="none" w:sz="0" w:space="0" w:color="000000"/>
-                <w:right w:val="none" w:sz="0" w:space="0" w:color="000000"/>
-              </w:pBdr>
-              <w:spacing w:before="80" w:after="80"/>
-              <w:ind w:left="80" w:right="80"/>
-              <w:rPr>
-                <w:rFonts w:ascii="Helvetica" w:eastAsia="Helvetica" w:hAnsi="Helvetica" w:cs="Helvetica"/>
-                <w:color w:val="000000"/>
-                <w:sz w:val="20"/>
-                <w:szCs w:val="20"/>
-              </w:rPr>
-            </w:pPr>
-            <w:r>
-              <w:rPr>
-                <w:rFonts w:ascii="Helvetica" w:eastAsia="Helvetica" w:hAnsi="Helvetica" w:cs="Helvetica"/>
-                <w:color w:val="000000"/>
-                <w:sz w:val="20"/>
-                <w:szCs w:val="20"/>
-              </w:rPr>
-              <w:t>0.009 [-0.013, 0.031]</w:t>
-            </w:r>
-          </w:p>
-        </w:tc>
-        <w:tc>
-          <w:tcPr>
-            <w:tcW w:w="620" w:type="pct"/>
-          </w:tcPr>
-          <w:p>
-            <w:pPr>
-              <w:pBdr>
-                <w:top w:val="none" w:sz="0" w:space="0" w:color="000000"/>
-                <w:left w:val="none" w:sz="0" w:space="0" w:color="000000"/>
-                <w:bottom w:val="none" w:sz="0" w:space="0" w:color="000000"/>
-                <w:right w:val="none" w:sz="0" w:space="0" w:color="000000"/>
-              </w:pBdr>
-              <w:spacing w:before="80" w:after="80"/>
-              <w:ind w:left="80" w:right="80"/>
-              <w:rPr>
-                <w:rFonts w:ascii="Helvetica" w:eastAsia="Helvetica" w:hAnsi="Helvetica" w:cs="Helvetica"/>
-                <w:color w:val="000000"/>
-                <w:sz w:val="20"/>
-                <w:szCs w:val="20"/>
-              </w:rPr>
-            </w:pPr>
-            <w:r>
-              <w:rPr>
-                <w:rFonts w:ascii="Helvetica" w:eastAsia="Helvetica" w:hAnsi="Helvetica" w:cs="Helvetica"/>
-                <w:color w:val="000000"/>
-                <w:sz w:val="20"/>
-                <w:szCs w:val="20"/>
-              </w:rPr>
+            <w:tcW w:w="0" w:type="auto"/>
+            <w:tcBorders>
+              <w:top w:val="none" w:sz="0" w:space="0" w:color="000000"/>
+              <w:left w:val="none" w:sz="0" w:space="0" w:color="000000"/>
+              <w:bottom w:val="none" w:sz="0" w:space="0" w:color="000000"/>
+              <w:right w:val="none" w:sz="0" w:space="0" w:color="000000"/>
+            </w:tcBorders>
+            <w:shd w:val="clear" w:color="auto" w:fill="FFFFFF"/>
+            <w:tcMar>
+              <w:top w:w="0" w:type="dxa"/>
+              <w:left w:w="0" w:type="dxa"/>
+              <w:bottom w:w="0" w:type="dxa"/>
+              <w:right w:w="0" w:type="dxa"/>
+            </w:tcMar>
+            <w:vAlign w:val="center"/>
+          </w:tcPr>
+          <w:p>
+            <w:pPr>
+              <w:pBdr>
+                <w:top w:val="none" w:sz="0" w:space="0" w:color="000000"/>
+                <w:left w:val="none" w:sz="0" w:space="0" w:color="000000"/>
+                <w:bottom w:val="none" w:sz="0" w:space="0" w:color="000000"/>
+                <w:right w:val="none" w:sz="0" w:space="0" w:color="000000"/>
+              </w:pBdr>
+              <w:spacing w:before="80" w:after="80"/>
+              <w:ind w:left="80" w:right="80"/>
+              <w:rPr>
+                <w:rFonts w:ascii="Helvetica" w:eastAsia="Helvetica" w:hAnsi="Helvetica" w:cs="Helvetica"/>
+                <w:color w:val="000000"/>
+                <w:sz w:val="20"/>
+                <w:szCs w:val="20"/>
+              </w:rPr>
+            </w:pPr>
+            <w:r>
+              <w:rPr>
+                <w:rFonts w:ascii="Helvetica" w:eastAsia="Helvetica" w:hAnsi="Helvetica" w:cs="Helvetica"/>
+                <w:color w:val="000000"/>
+                <w:sz w:val="20"/>
+                <w:szCs w:val="20"/>
+              </w:rPr>
+              <w:t>0.009 [-</w:t>
+            </w:r>
+            <w:r>
+              <w:rPr>
+                <w:rFonts w:ascii="Helvetica" w:eastAsia="Helvetica" w:hAnsi="Helvetica" w:cs="Helvetica"/>
+                <w:color w:val="000000"/>
+                <w:sz w:val="20"/>
+                <w:szCs w:val="20"/>
+              </w:rPr>
+              <w:lastRenderedPageBreak/>
+              <w:t>0.013, 0.031]</w:t>
+            </w:r>
+          </w:p>
+        </w:tc>
+        <w:tc>
+          <w:tcPr>
+            <w:tcW w:w="0" w:type="auto"/>
+            <w:tcBorders>
+              <w:top w:val="none" w:sz="0" w:space="0" w:color="000000"/>
+              <w:left w:val="none" w:sz="0" w:space="0" w:color="000000"/>
+              <w:bottom w:val="none" w:sz="0" w:space="0" w:color="000000"/>
+              <w:right w:val="none" w:sz="0" w:space="0" w:color="000000"/>
+            </w:tcBorders>
+            <w:shd w:val="clear" w:color="auto" w:fill="FFFFFF"/>
+            <w:tcMar>
+              <w:top w:w="0" w:type="dxa"/>
+              <w:left w:w="0" w:type="dxa"/>
+              <w:bottom w:w="0" w:type="dxa"/>
+              <w:right w:w="0" w:type="dxa"/>
+            </w:tcMar>
+            <w:vAlign w:val="center"/>
+          </w:tcPr>
+          <w:p>
+            <w:pPr>
+              <w:pBdr>
+                <w:top w:val="none" w:sz="0" w:space="0" w:color="000000"/>
+                <w:left w:val="none" w:sz="0" w:space="0" w:color="000000"/>
+                <w:bottom w:val="none" w:sz="0" w:space="0" w:color="000000"/>
+                <w:right w:val="none" w:sz="0" w:space="0" w:color="000000"/>
+              </w:pBdr>
+              <w:spacing w:before="80" w:after="80"/>
+              <w:ind w:left="80" w:right="80"/>
+              <w:rPr>
+                <w:rFonts w:ascii="Helvetica" w:eastAsia="Helvetica" w:hAnsi="Helvetica" w:cs="Helvetica"/>
+                <w:color w:val="000000"/>
+                <w:sz w:val="20"/>
+                <w:szCs w:val="20"/>
+              </w:rPr>
+            </w:pPr>
+            <w:r>
+              <w:rPr>
+                <w:rFonts w:ascii="Helvetica" w:eastAsia="Helvetica" w:hAnsi="Helvetica" w:cs="Helvetica"/>
+                <w:color w:val="000000"/>
+                <w:sz w:val="20"/>
+                <w:szCs w:val="20"/>
+              </w:rPr>
+              <w:lastRenderedPageBreak/>
               <w:t>3.51 [3.27, 3.78]</w:t>
             </w:r>
           </w:p>
         </w:tc>
         <w:tc>
           <w:tcPr>
-            <w:tcW w:w="708" w:type="pct"/>
-          </w:tcPr>
-          <w:p>
-            <w:pPr>
-              <w:pBdr>
-                <w:top w:val="none" w:sz="0" w:space="0" w:color="000000"/>
-                <w:left w:val="none" w:sz="0" w:space="0" w:color="000000"/>
-                <w:bottom w:val="none" w:sz="0" w:space="0" w:color="000000"/>
-                <w:right w:val="none" w:sz="0" w:space="0" w:color="000000"/>
-              </w:pBdr>
-              <w:spacing w:before="80" w:after="80"/>
-              <w:ind w:left="80" w:right="80"/>
-              <w:rPr>
-                <w:rFonts w:ascii="Helvetica" w:eastAsia="Helvetica" w:hAnsi="Helvetica" w:cs="Helvetica"/>
-                <w:color w:val="000000"/>
-                <w:sz w:val="20"/>
-                <w:szCs w:val="20"/>
-              </w:rPr>
-            </w:pPr>
-            <w:r>
-              <w:rPr>
-                <w:rFonts w:ascii="Helvetica" w:eastAsia="Helvetica" w:hAnsi="Helvetica" w:cs="Helvetica"/>
-                <w:color w:val="000000"/>
-                <w:sz w:val="20"/>
-                <w:szCs w:val="20"/>
-              </w:rPr>
-              <w:t>-0.024 [-0.041, -0.007]</w:t>
-            </w:r>
-          </w:p>
-        </w:tc>
-        <w:tc>
-          <w:tcPr>
-            <w:tcW w:w="442" w:type="pct"/>
-          </w:tcPr>
-          <w:p>
-            <w:pPr>
-              <w:pBdr>
-                <w:top w:val="none" w:sz="0" w:space="0" w:color="000000"/>
-                <w:left w:val="none" w:sz="0" w:space="0" w:color="000000"/>
-                <w:bottom w:val="none" w:sz="0" w:space="0" w:color="000000"/>
-                <w:right w:val="none" w:sz="0" w:space="0" w:color="000000"/>
-              </w:pBdr>
-              <w:spacing w:before="80" w:after="80"/>
-              <w:ind w:left="80" w:right="80"/>
-              <w:rPr>
-                <w:rFonts w:ascii="Helvetica" w:eastAsia="Helvetica" w:hAnsi="Helvetica" w:cs="Helvetica"/>
-                <w:b/>
-                <w:bCs/>
-                <w:color w:val="000000"/>
-                <w:sz w:val="20"/>
-                <w:szCs w:val="20"/>
-              </w:rPr>
-            </w:pPr>
-            <w:r>
-              <w:rPr>
-                <w:rFonts w:ascii="Helvetica" w:eastAsia="Helvetica" w:hAnsi="Helvetica" w:cs="Helvetica"/>
-                <w:b/>
-                <w:bCs/>
-                <w:color w:val="000000"/>
-                <w:sz w:val="20"/>
-                <w:szCs w:val="20"/>
-              </w:rPr>
+            <w:tcW w:w="0" w:type="auto"/>
+            <w:tcBorders>
+              <w:top w:val="none" w:sz="0" w:space="0" w:color="000000"/>
+              <w:left w:val="none" w:sz="0" w:space="0" w:color="000000"/>
+              <w:bottom w:val="none" w:sz="0" w:space="0" w:color="000000"/>
+              <w:right w:val="none" w:sz="0" w:space="0" w:color="000000"/>
+            </w:tcBorders>
+            <w:shd w:val="clear" w:color="auto" w:fill="FFFFFF"/>
+            <w:tcMar>
+              <w:top w:w="0" w:type="dxa"/>
+              <w:left w:w="0" w:type="dxa"/>
+              <w:bottom w:w="0" w:type="dxa"/>
+              <w:right w:w="0" w:type="dxa"/>
+            </w:tcMar>
+            <w:vAlign w:val="center"/>
+          </w:tcPr>
+          <w:p>
+            <w:pPr>
+              <w:pBdr>
+                <w:top w:val="none" w:sz="0" w:space="0" w:color="000000"/>
+                <w:left w:val="none" w:sz="0" w:space="0" w:color="000000"/>
+                <w:bottom w:val="none" w:sz="0" w:space="0" w:color="000000"/>
+                <w:right w:val="none" w:sz="0" w:space="0" w:color="000000"/>
+              </w:pBdr>
+              <w:spacing w:before="80" w:after="80"/>
+              <w:ind w:left="80" w:right="80"/>
+              <w:rPr>
+                <w:rFonts w:ascii="Helvetica" w:eastAsia="Helvetica" w:hAnsi="Helvetica" w:cs="Helvetica"/>
+                <w:color w:val="000000"/>
+                <w:sz w:val="20"/>
+                <w:szCs w:val="20"/>
+              </w:rPr>
+            </w:pPr>
+            <w:r>
+              <w:rPr>
+                <w:rFonts w:ascii="Helvetica" w:eastAsia="Helvetica" w:hAnsi="Helvetica" w:cs="Helvetica"/>
+                <w:color w:val="000000"/>
+                <w:sz w:val="20"/>
+                <w:szCs w:val="20"/>
+              </w:rPr>
+              <w:t>-0.024 [-</w:t>
+            </w:r>
+            <w:r>
+              <w:rPr>
+                <w:rFonts w:ascii="Helvetica" w:eastAsia="Helvetica" w:hAnsi="Helvetica" w:cs="Helvetica"/>
+                <w:color w:val="000000"/>
+                <w:sz w:val="20"/>
+                <w:szCs w:val="20"/>
+              </w:rPr>
+              <w:lastRenderedPageBreak/>
+              <w:t>0.041, -0.007]</w:t>
+            </w:r>
+          </w:p>
+        </w:tc>
+        <w:tc>
+          <w:tcPr>
+            <w:tcW w:w="0" w:type="auto"/>
+            <w:tcBorders>
+              <w:top w:val="none" w:sz="0" w:space="0" w:color="000000"/>
+              <w:left w:val="none" w:sz="0" w:space="0" w:color="000000"/>
+              <w:bottom w:val="none" w:sz="0" w:space="0" w:color="000000"/>
+              <w:right w:val="none" w:sz="0" w:space="0" w:color="000000"/>
+            </w:tcBorders>
+            <w:shd w:val="clear" w:color="auto" w:fill="FFFFFF"/>
+            <w:tcMar>
+              <w:top w:w="0" w:type="dxa"/>
+              <w:left w:w="0" w:type="dxa"/>
+              <w:bottom w:w="0" w:type="dxa"/>
+              <w:right w:w="0" w:type="dxa"/>
+            </w:tcMar>
+            <w:vAlign w:val="center"/>
+          </w:tcPr>
+          <w:p>
+            <w:pPr>
+              <w:pBdr>
+                <w:top w:val="none" w:sz="0" w:space="0" w:color="000000"/>
+                <w:left w:val="none" w:sz="0" w:space="0" w:color="000000"/>
+                <w:bottom w:val="none" w:sz="0" w:space="0" w:color="000000"/>
+                <w:right w:val="none" w:sz="0" w:space="0" w:color="000000"/>
+              </w:pBdr>
+              <w:spacing w:before="80" w:after="80"/>
+              <w:ind w:left="80" w:right="80"/>
+              <w:rPr>
+                <w:rFonts w:ascii="Helvetica" w:eastAsia="Helvetica" w:hAnsi="Helvetica" w:cs="Helvetica"/>
+                <w:color w:val="000000"/>
+                <w:sz w:val="20"/>
+                <w:szCs w:val="20"/>
+              </w:rPr>
+            </w:pPr>
+            <w:r>
+              <w:rPr>
+                <w:rFonts w:ascii="Helvetica" w:eastAsia="Helvetica" w:hAnsi="Helvetica" w:cs="Helvetica"/>
+                <w:color w:val="000000"/>
+                <w:sz w:val="20"/>
+                <w:szCs w:val="20"/>
+              </w:rPr>
+              <w:lastRenderedPageBreak/>
               <w:t>0.020</w:t>
             </w:r>
           </w:p>
         </w:tc>
         <w:tc>
           <w:tcPr>
-            <w:tcW w:w="575" w:type="pct"/>
+            <w:tcW w:w="0" w:type="auto"/>
+            <w:tcBorders>
+              <w:top w:val="none" w:sz="0" w:space="0" w:color="000000"/>
+              <w:left w:val="none" w:sz="0" w:space="0" w:color="000000"/>
+              <w:bottom w:val="none" w:sz="0" w:space="0" w:color="000000"/>
+              <w:right w:val="none" w:sz="0" w:space="0" w:color="000000"/>
+            </w:tcBorders>
+            <w:shd w:val="clear" w:color="auto" w:fill="FFFFFF"/>
+            <w:tcMar>
+              <w:top w:w="0" w:type="dxa"/>
+              <w:left w:w="0" w:type="dxa"/>
+              <w:bottom w:w="0" w:type="dxa"/>
+              <w:right w:w="0" w:type="dxa"/>
+            </w:tcMar>
+            <w:vAlign w:val="center"/>
           </w:tcPr>
           <w:p>
             <w:pPr>
@@ -3359,9 +4760,26 @@
         </w:tc>
       </w:tr>
       <w:tr>
-        <w:tc>
-          <w:tcPr>
-            <w:tcW w:w="513" w:type="pct"/>
+        <w:trPr>
+          <w:jc w:val="center"/>
+        </w:trPr>
+        <w:tc>
+          <w:tcPr>
+            <w:tcW w:w="0" w:type="auto"/>
+            <w:tcBorders>
+              <w:top w:val="none" w:sz="0" w:space="0" w:color="000000"/>
+              <w:left w:val="none" w:sz="0" w:space="0" w:color="000000"/>
+              <w:bottom w:val="none" w:sz="0" w:space="0" w:color="000000"/>
+              <w:right w:val="none" w:sz="0" w:space="0" w:color="000000"/>
+            </w:tcBorders>
+            <w:shd w:val="clear" w:color="auto" w:fill="FFFFFF"/>
+            <w:tcMar>
+              <w:top w:w="0" w:type="dxa"/>
+              <w:left w:w="0" w:type="dxa"/>
+              <w:bottom w:w="0" w:type="dxa"/>
+              <w:right w:w="0" w:type="dxa"/>
+            </w:tcMar>
+            <w:vAlign w:val="center"/>
           </w:tcPr>
           <w:p>
             <w:pPr>
@@ -3394,17 +4812,32 @@
         <w:tc>
           <w:tcPr>
             <w:tcW w:w="0" w:type="auto"/>
-          </w:tcPr>
-          <w:p>
-            <w:pPr>
-              <w:pBdr>
-                <w:top w:val="none" w:sz="0" w:space="0" w:color="000000"/>
-                <w:left w:val="none" w:sz="0" w:space="0" w:color="000000"/>
-                <w:bottom w:val="none" w:sz="0" w:space="0" w:color="000000"/>
-                <w:right w:val="none" w:sz="0" w:space="0" w:color="000000"/>
-              </w:pBdr>
-              <w:spacing w:before="80" w:after="80"/>
-              <w:ind w:left="80" w:right="80"/>
+            <w:tcBorders>
+              <w:top w:val="none" w:sz="0" w:space="0" w:color="000000"/>
+              <w:left w:val="none" w:sz="0" w:space="0" w:color="000000"/>
+              <w:bottom w:val="none" w:sz="0" w:space="0" w:color="000000"/>
+              <w:right w:val="none" w:sz="0" w:space="0" w:color="000000"/>
+            </w:tcBorders>
+            <w:shd w:val="clear" w:color="auto" w:fill="FFFFFF"/>
+            <w:tcMar>
+              <w:top w:w="0" w:type="dxa"/>
+              <w:left w:w="0" w:type="dxa"/>
+              <w:bottom w:w="0" w:type="dxa"/>
+              <w:right w:w="0" w:type="dxa"/>
+            </w:tcMar>
+            <w:vAlign w:val="center"/>
+          </w:tcPr>
+          <w:p>
+            <w:pPr>
+              <w:pBdr>
+                <w:top w:val="none" w:sz="0" w:space="0" w:color="000000"/>
+                <w:left w:val="none" w:sz="0" w:space="0" w:color="000000"/>
+                <w:bottom w:val="none" w:sz="0" w:space="0" w:color="000000"/>
+                <w:right w:val="none" w:sz="0" w:space="0" w:color="000000"/>
+              </w:pBdr>
+              <w:spacing w:before="80" w:after="80"/>
+              <w:ind w:left="80" w:right="80"/>
+              <w:jc w:val="right"/>
               <w:rPr>
                 <w:rFonts w:ascii="Helvetica" w:eastAsia="Helvetica" w:hAnsi="Helvetica" w:cs="Helvetica"/>
                 <w:color w:val="000000"/>
@@ -3426,17 +4859,32 @@
         <w:tc>
           <w:tcPr>
             <w:tcW w:w="0" w:type="auto"/>
-          </w:tcPr>
-          <w:p>
-            <w:pPr>
-              <w:pBdr>
-                <w:top w:val="none" w:sz="0" w:space="0" w:color="000000"/>
-                <w:left w:val="none" w:sz="0" w:space="0" w:color="000000"/>
-                <w:bottom w:val="none" w:sz="0" w:space="0" w:color="000000"/>
-                <w:right w:val="none" w:sz="0" w:space="0" w:color="000000"/>
-              </w:pBdr>
-              <w:spacing w:before="80" w:after="80"/>
-              <w:ind w:left="80" w:right="80"/>
+            <w:tcBorders>
+              <w:top w:val="none" w:sz="0" w:space="0" w:color="000000"/>
+              <w:left w:val="none" w:sz="0" w:space="0" w:color="000000"/>
+              <w:bottom w:val="none" w:sz="0" w:space="0" w:color="000000"/>
+              <w:right w:val="none" w:sz="0" w:space="0" w:color="000000"/>
+            </w:tcBorders>
+            <w:shd w:val="clear" w:color="auto" w:fill="FFFFFF"/>
+            <w:tcMar>
+              <w:top w:w="0" w:type="dxa"/>
+              <w:left w:w="0" w:type="dxa"/>
+              <w:bottom w:w="0" w:type="dxa"/>
+              <w:right w:w="0" w:type="dxa"/>
+            </w:tcMar>
+            <w:vAlign w:val="center"/>
+          </w:tcPr>
+          <w:p>
+            <w:pPr>
+              <w:pBdr>
+                <w:top w:val="none" w:sz="0" w:space="0" w:color="000000"/>
+                <w:left w:val="none" w:sz="0" w:space="0" w:color="000000"/>
+                <w:bottom w:val="none" w:sz="0" w:space="0" w:color="000000"/>
+                <w:right w:val="none" w:sz="0" w:space="0" w:color="000000"/>
+              </w:pBdr>
+              <w:spacing w:before="80" w:after="80"/>
+              <w:ind w:left="80" w:right="80"/>
+              <w:jc w:val="right"/>
               <w:rPr>
                 <w:rFonts w:ascii="Helvetica" w:eastAsia="Helvetica" w:hAnsi="Helvetica" w:cs="Helvetica"/>
                 <w:color w:val="000000"/>
@@ -3457,7 +4905,21 @@
         </w:tc>
         <w:tc>
           <w:tcPr>
-            <w:tcW w:w="693" w:type="pct"/>
+            <w:tcW w:w="0" w:type="auto"/>
+            <w:tcBorders>
+              <w:top w:val="none" w:sz="0" w:space="0" w:color="000000"/>
+              <w:left w:val="none" w:sz="0" w:space="0" w:color="000000"/>
+              <w:bottom w:val="none" w:sz="0" w:space="0" w:color="000000"/>
+              <w:right w:val="none" w:sz="0" w:space="0" w:color="000000"/>
+            </w:tcBorders>
+            <w:shd w:val="clear" w:color="auto" w:fill="FFFFFF"/>
+            <w:tcMar>
+              <w:top w:w="0" w:type="dxa"/>
+              <w:left w:w="0" w:type="dxa"/>
+              <w:bottom w:w="0" w:type="dxa"/>
+              <w:right w:w="0" w:type="dxa"/>
+            </w:tcMar>
+            <w:vAlign w:val="center"/>
           </w:tcPr>
           <w:p>
             <w:pPr>
@@ -3489,7 +4951,21 @@
         </w:tc>
         <w:tc>
           <w:tcPr>
-            <w:tcW w:w="619" w:type="pct"/>
+            <w:tcW w:w="0" w:type="auto"/>
+            <w:tcBorders>
+              <w:top w:val="none" w:sz="0" w:space="0" w:color="000000"/>
+              <w:left w:val="none" w:sz="0" w:space="0" w:color="000000"/>
+              <w:bottom w:val="none" w:sz="0" w:space="0" w:color="000000"/>
+              <w:right w:val="none" w:sz="0" w:space="0" w:color="000000"/>
+            </w:tcBorders>
+            <w:shd w:val="clear" w:color="auto" w:fill="FFFFFF"/>
+            <w:tcMar>
+              <w:top w:w="0" w:type="dxa"/>
+              <w:left w:w="0" w:type="dxa"/>
+              <w:bottom w:w="0" w:type="dxa"/>
+              <w:right w:w="0" w:type="dxa"/>
+            </w:tcMar>
+            <w:vAlign w:val="center"/>
           </w:tcPr>
           <w:p>
             <w:pPr>
@@ -3521,7 +4997,21 @@
         </w:tc>
         <w:tc>
           <w:tcPr>
-            <w:tcW w:w="620" w:type="pct"/>
+            <w:tcW w:w="0" w:type="auto"/>
+            <w:tcBorders>
+              <w:top w:val="none" w:sz="0" w:space="0" w:color="000000"/>
+              <w:left w:val="none" w:sz="0" w:space="0" w:color="000000"/>
+              <w:bottom w:val="none" w:sz="0" w:space="0" w:color="000000"/>
+              <w:right w:val="none" w:sz="0" w:space="0" w:color="000000"/>
+            </w:tcBorders>
+            <w:shd w:val="clear" w:color="auto" w:fill="FFFFFF"/>
+            <w:tcMar>
+              <w:top w:w="0" w:type="dxa"/>
+              <w:left w:w="0" w:type="dxa"/>
+              <w:bottom w:w="0" w:type="dxa"/>
+              <w:right w:w="0" w:type="dxa"/>
+            </w:tcMar>
+            <w:vAlign w:val="center"/>
           </w:tcPr>
           <w:p>
             <w:pPr>
@@ -3553,7 +5043,21 @@
         </w:tc>
         <w:tc>
           <w:tcPr>
-            <w:tcW w:w="708" w:type="pct"/>
+            <w:tcW w:w="0" w:type="auto"/>
+            <w:tcBorders>
+              <w:top w:val="none" w:sz="0" w:space="0" w:color="000000"/>
+              <w:left w:val="none" w:sz="0" w:space="0" w:color="000000"/>
+              <w:bottom w:val="none" w:sz="0" w:space="0" w:color="000000"/>
+              <w:right w:val="none" w:sz="0" w:space="0" w:color="000000"/>
+            </w:tcBorders>
+            <w:shd w:val="clear" w:color="auto" w:fill="FFFFFF"/>
+            <w:tcMar>
+              <w:top w:w="0" w:type="dxa"/>
+              <w:left w:w="0" w:type="dxa"/>
+              <w:bottom w:w="0" w:type="dxa"/>
+              <w:right w:w="0" w:type="dxa"/>
+            </w:tcMar>
+            <w:vAlign w:val="center"/>
           </w:tcPr>
           <w:p>
             <w:pPr>
@@ -3585,7 +5089,21 @@
         </w:tc>
         <w:tc>
           <w:tcPr>
-            <w:tcW w:w="442" w:type="pct"/>
+            <w:tcW w:w="0" w:type="auto"/>
+            <w:tcBorders>
+              <w:top w:val="none" w:sz="0" w:space="0" w:color="000000"/>
+              <w:left w:val="none" w:sz="0" w:space="0" w:color="000000"/>
+              <w:bottom w:val="none" w:sz="0" w:space="0" w:color="000000"/>
+              <w:right w:val="none" w:sz="0" w:space="0" w:color="000000"/>
+            </w:tcBorders>
+            <w:shd w:val="clear" w:color="auto" w:fill="FFFFFF"/>
+            <w:tcMar>
+              <w:top w:w="0" w:type="dxa"/>
+              <w:left w:w="0" w:type="dxa"/>
+              <w:bottom w:w="0" w:type="dxa"/>
+              <w:right w:w="0" w:type="dxa"/>
+            </w:tcMar>
+            <w:vAlign w:val="center"/>
           </w:tcPr>
           <w:p>
             <w:pPr>
@@ -3617,32 +5135,42 @@
         </w:tc>
         <w:tc>
           <w:tcPr>
-            <w:tcW w:w="575" w:type="pct"/>
-          </w:tcPr>
-          <w:p>
-            <w:pPr>
-              <w:pBdr>
-                <w:top w:val="none" w:sz="0" w:space="0" w:color="000000"/>
-                <w:left w:val="none" w:sz="0" w:space="0" w:color="000000"/>
-                <w:bottom w:val="none" w:sz="0" w:space="0" w:color="000000"/>
-                <w:right w:val="none" w:sz="0" w:space="0" w:color="000000"/>
-              </w:pBdr>
-              <w:spacing w:before="80" w:after="80"/>
-              <w:ind w:left="80" w:right="80"/>
-              <w:rPr>
-                <w:rFonts w:ascii="Helvetica" w:eastAsia="Helvetica" w:hAnsi="Helvetica" w:cs="Helvetica"/>
-                <w:b/>
-                <w:bCs/>
-                <w:color w:val="000000"/>
-                <w:sz w:val="20"/>
-                <w:szCs w:val="20"/>
-              </w:rPr>
-            </w:pPr>
-            <w:r>
-              <w:rPr>
-                <w:rFonts w:ascii="Helvetica" w:eastAsia="Helvetica" w:hAnsi="Helvetica" w:cs="Helvetica"/>
-                <w:b/>
-                <w:bCs/>
+            <w:tcW w:w="0" w:type="auto"/>
+            <w:tcBorders>
+              <w:top w:val="none" w:sz="0" w:space="0" w:color="000000"/>
+              <w:left w:val="none" w:sz="0" w:space="0" w:color="000000"/>
+              <w:bottom w:val="none" w:sz="0" w:space="0" w:color="000000"/>
+              <w:right w:val="none" w:sz="0" w:space="0" w:color="000000"/>
+            </w:tcBorders>
+            <w:shd w:val="clear" w:color="auto" w:fill="FFFFFF"/>
+            <w:tcMar>
+              <w:top w:w="0" w:type="dxa"/>
+              <w:left w:w="0" w:type="dxa"/>
+              <w:bottom w:w="0" w:type="dxa"/>
+              <w:right w:w="0" w:type="dxa"/>
+            </w:tcMar>
+            <w:vAlign w:val="center"/>
+          </w:tcPr>
+          <w:p>
+            <w:pPr>
+              <w:pBdr>
+                <w:top w:val="none" w:sz="0" w:space="0" w:color="000000"/>
+                <w:left w:val="none" w:sz="0" w:space="0" w:color="000000"/>
+                <w:bottom w:val="none" w:sz="0" w:space="0" w:color="000000"/>
+                <w:right w:val="none" w:sz="0" w:space="0" w:color="000000"/>
+              </w:pBdr>
+              <w:spacing w:before="80" w:after="80"/>
+              <w:ind w:left="80" w:right="80"/>
+              <w:rPr>
+                <w:rFonts w:ascii="Helvetica" w:eastAsia="Helvetica" w:hAnsi="Helvetica" w:cs="Helvetica"/>
+                <w:color w:val="000000"/>
+                <w:sz w:val="20"/>
+                <w:szCs w:val="20"/>
+              </w:rPr>
+            </w:pPr>
+            <w:r>
+              <w:rPr>
+                <w:rFonts w:ascii="Helvetica" w:eastAsia="Helvetica" w:hAnsi="Helvetica" w:cs="Helvetica"/>
                 <w:color w:val="000000"/>
                 <w:sz w:val="20"/>
                 <w:szCs w:val="20"/>
@@ -3653,9 +5181,26 @@
         </w:tc>
       </w:tr>
       <w:tr>
-        <w:tc>
-          <w:tcPr>
-            <w:tcW w:w="513" w:type="pct"/>
+        <w:trPr>
+          <w:jc w:val="center"/>
+        </w:trPr>
+        <w:tc>
+          <w:tcPr>
+            <w:tcW w:w="0" w:type="auto"/>
+            <w:tcBorders>
+              <w:top w:val="none" w:sz="0" w:space="0" w:color="000000"/>
+              <w:left w:val="none" w:sz="0" w:space="0" w:color="000000"/>
+              <w:bottom w:val="single" w:sz="12" w:space="0" w:color="666666"/>
+              <w:right w:val="none" w:sz="0" w:space="0" w:color="000000"/>
+            </w:tcBorders>
+            <w:shd w:val="clear" w:color="auto" w:fill="FFFFFF"/>
+            <w:tcMar>
+              <w:top w:w="0" w:type="dxa"/>
+              <w:left w:w="0" w:type="dxa"/>
+              <w:bottom w:w="0" w:type="dxa"/>
+              <w:right w:w="0" w:type="dxa"/>
+            </w:tcMar>
+            <w:vAlign w:val="center"/>
           </w:tcPr>
           <w:p>
             <w:pPr>
@@ -3688,17 +5233,32 @@
         <w:tc>
           <w:tcPr>
             <w:tcW w:w="0" w:type="auto"/>
-          </w:tcPr>
-          <w:p>
-            <w:pPr>
-              <w:pBdr>
-                <w:top w:val="none" w:sz="0" w:space="0" w:color="000000"/>
-                <w:left w:val="none" w:sz="0" w:space="0" w:color="000000"/>
-                <w:bottom w:val="none" w:sz="0" w:space="0" w:color="000000"/>
-                <w:right w:val="none" w:sz="0" w:space="0" w:color="000000"/>
-              </w:pBdr>
-              <w:spacing w:before="80" w:after="80"/>
-              <w:ind w:left="80" w:right="80"/>
+            <w:tcBorders>
+              <w:top w:val="none" w:sz="0" w:space="0" w:color="000000"/>
+              <w:left w:val="none" w:sz="0" w:space="0" w:color="000000"/>
+              <w:bottom w:val="single" w:sz="12" w:space="0" w:color="666666"/>
+              <w:right w:val="none" w:sz="0" w:space="0" w:color="000000"/>
+            </w:tcBorders>
+            <w:shd w:val="clear" w:color="auto" w:fill="FFFFFF"/>
+            <w:tcMar>
+              <w:top w:w="0" w:type="dxa"/>
+              <w:left w:w="0" w:type="dxa"/>
+              <w:bottom w:w="0" w:type="dxa"/>
+              <w:right w:w="0" w:type="dxa"/>
+            </w:tcMar>
+            <w:vAlign w:val="center"/>
+          </w:tcPr>
+          <w:p>
+            <w:pPr>
+              <w:pBdr>
+                <w:top w:val="none" w:sz="0" w:space="0" w:color="000000"/>
+                <w:left w:val="none" w:sz="0" w:space="0" w:color="000000"/>
+                <w:bottom w:val="none" w:sz="0" w:space="0" w:color="000000"/>
+                <w:right w:val="none" w:sz="0" w:space="0" w:color="000000"/>
+              </w:pBdr>
+              <w:spacing w:before="80" w:after="80"/>
+              <w:ind w:left="80" w:right="80"/>
+              <w:jc w:val="right"/>
               <w:rPr>
                 <w:rFonts w:ascii="Helvetica" w:eastAsia="Helvetica" w:hAnsi="Helvetica" w:cs="Helvetica"/>
                 <w:color w:val="000000"/>
@@ -3720,17 +5280,32 @@
         <w:tc>
           <w:tcPr>
             <w:tcW w:w="0" w:type="auto"/>
-          </w:tcPr>
-          <w:p>
-            <w:pPr>
-              <w:pBdr>
-                <w:top w:val="none" w:sz="0" w:space="0" w:color="000000"/>
-                <w:left w:val="none" w:sz="0" w:space="0" w:color="000000"/>
-                <w:bottom w:val="none" w:sz="0" w:space="0" w:color="000000"/>
-                <w:right w:val="none" w:sz="0" w:space="0" w:color="000000"/>
-              </w:pBdr>
-              <w:spacing w:before="80" w:after="80"/>
-              <w:ind w:left="80" w:right="80"/>
+            <w:tcBorders>
+              <w:top w:val="none" w:sz="0" w:space="0" w:color="000000"/>
+              <w:left w:val="none" w:sz="0" w:space="0" w:color="000000"/>
+              <w:bottom w:val="single" w:sz="12" w:space="0" w:color="666666"/>
+              <w:right w:val="none" w:sz="0" w:space="0" w:color="000000"/>
+            </w:tcBorders>
+            <w:shd w:val="clear" w:color="auto" w:fill="FFFFFF"/>
+            <w:tcMar>
+              <w:top w:w="0" w:type="dxa"/>
+              <w:left w:w="0" w:type="dxa"/>
+              <w:bottom w:w="0" w:type="dxa"/>
+              <w:right w:w="0" w:type="dxa"/>
+            </w:tcMar>
+            <w:vAlign w:val="center"/>
+          </w:tcPr>
+          <w:p>
+            <w:pPr>
+              <w:pBdr>
+                <w:top w:val="none" w:sz="0" w:space="0" w:color="000000"/>
+                <w:left w:val="none" w:sz="0" w:space="0" w:color="000000"/>
+                <w:bottom w:val="none" w:sz="0" w:space="0" w:color="000000"/>
+                <w:right w:val="none" w:sz="0" w:space="0" w:color="000000"/>
+              </w:pBdr>
+              <w:spacing w:before="80" w:after="80"/>
+              <w:ind w:left="80" w:right="80"/>
+              <w:jc w:val="right"/>
               <w:rPr>
                 <w:rFonts w:ascii="Helvetica" w:eastAsia="Helvetica" w:hAnsi="Helvetica" w:cs="Helvetica"/>
                 <w:color w:val="000000"/>
@@ -3751,7 +5326,21 @@
         </w:tc>
         <w:tc>
           <w:tcPr>
-            <w:tcW w:w="693" w:type="pct"/>
+            <w:tcW w:w="0" w:type="auto"/>
+            <w:tcBorders>
+              <w:top w:val="none" w:sz="0" w:space="0" w:color="000000"/>
+              <w:left w:val="none" w:sz="0" w:space="0" w:color="000000"/>
+              <w:bottom w:val="single" w:sz="12" w:space="0" w:color="666666"/>
+              <w:right w:val="none" w:sz="0" w:space="0" w:color="000000"/>
+            </w:tcBorders>
+            <w:shd w:val="clear" w:color="auto" w:fill="FFFFFF"/>
+            <w:tcMar>
+              <w:top w:w="0" w:type="dxa"/>
+              <w:left w:w="0" w:type="dxa"/>
+              <w:bottom w:w="0" w:type="dxa"/>
+              <w:right w:w="0" w:type="dxa"/>
+            </w:tcMar>
+            <w:vAlign w:val="center"/>
           </w:tcPr>
           <w:p>
             <w:pPr>
@@ -3783,7 +5372,21 @@
         </w:tc>
         <w:tc>
           <w:tcPr>
-            <w:tcW w:w="619" w:type="pct"/>
+            <w:tcW w:w="0" w:type="auto"/>
+            <w:tcBorders>
+              <w:top w:val="none" w:sz="0" w:space="0" w:color="000000"/>
+              <w:left w:val="none" w:sz="0" w:space="0" w:color="000000"/>
+              <w:bottom w:val="single" w:sz="12" w:space="0" w:color="666666"/>
+              <w:right w:val="none" w:sz="0" w:space="0" w:color="000000"/>
+            </w:tcBorders>
+            <w:shd w:val="clear" w:color="auto" w:fill="FFFFFF"/>
+            <w:tcMar>
+              <w:top w:w="0" w:type="dxa"/>
+              <w:left w:w="0" w:type="dxa"/>
+              <w:bottom w:w="0" w:type="dxa"/>
+              <w:right w:w="0" w:type="dxa"/>
+            </w:tcMar>
+            <w:vAlign w:val="center"/>
           </w:tcPr>
           <w:p>
             <w:pPr>
@@ -3815,7 +5418,21 @@
         </w:tc>
         <w:tc>
           <w:tcPr>
-            <w:tcW w:w="620" w:type="pct"/>
+            <w:tcW w:w="0" w:type="auto"/>
+            <w:tcBorders>
+              <w:top w:val="none" w:sz="0" w:space="0" w:color="000000"/>
+              <w:left w:val="none" w:sz="0" w:space="0" w:color="000000"/>
+              <w:bottom w:val="single" w:sz="12" w:space="0" w:color="666666"/>
+              <w:right w:val="none" w:sz="0" w:space="0" w:color="000000"/>
+            </w:tcBorders>
+            <w:shd w:val="clear" w:color="auto" w:fill="FFFFFF"/>
+            <w:tcMar>
+              <w:top w:w="0" w:type="dxa"/>
+              <w:left w:w="0" w:type="dxa"/>
+              <w:bottom w:w="0" w:type="dxa"/>
+              <w:right w:w="0" w:type="dxa"/>
+            </w:tcMar>
+            <w:vAlign w:val="center"/>
           </w:tcPr>
           <w:p>
             <w:pPr>
@@ -3847,7 +5464,21 @@
         </w:tc>
         <w:tc>
           <w:tcPr>
-            <w:tcW w:w="708" w:type="pct"/>
+            <w:tcW w:w="0" w:type="auto"/>
+            <w:tcBorders>
+              <w:top w:val="none" w:sz="0" w:space="0" w:color="000000"/>
+              <w:left w:val="none" w:sz="0" w:space="0" w:color="000000"/>
+              <w:bottom w:val="single" w:sz="12" w:space="0" w:color="666666"/>
+              <w:right w:val="none" w:sz="0" w:space="0" w:color="000000"/>
+            </w:tcBorders>
+            <w:shd w:val="clear" w:color="auto" w:fill="FFFFFF"/>
+            <w:tcMar>
+              <w:top w:w="0" w:type="dxa"/>
+              <w:left w:w="0" w:type="dxa"/>
+              <w:bottom w:w="0" w:type="dxa"/>
+              <w:right w:w="0" w:type="dxa"/>
+            </w:tcMar>
+            <w:vAlign w:val="center"/>
           </w:tcPr>
           <w:p>
             <w:pPr>
@@ -3879,7 +5510,21 @@
         </w:tc>
         <w:tc>
           <w:tcPr>
-            <w:tcW w:w="442" w:type="pct"/>
+            <w:tcW w:w="0" w:type="auto"/>
+            <w:tcBorders>
+              <w:top w:val="none" w:sz="0" w:space="0" w:color="000000"/>
+              <w:left w:val="none" w:sz="0" w:space="0" w:color="000000"/>
+              <w:bottom w:val="single" w:sz="12" w:space="0" w:color="666666"/>
+              <w:right w:val="none" w:sz="0" w:space="0" w:color="000000"/>
+            </w:tcBorders>
+            <w:shd w:val="clear" w:color="auto" w:fill="FFFFFF"/>
+            <w:tcMar>
+              <w:top w:w="0" w:type="dxa"/>
+              <w:left w:w="0" w:type="dxa"/>
+              <w:bottom w:w="0" w:type="dxa"/>
+              <w:right w:w="0" w:type="dxa"/>
+            </w:tcMar>
+            <w:vAlign w:val="center"/>
           </w:tcPr>
           <w:p>
             <w:pPr>
@@ -3911,7 +5556,21 @@
         </w:tc>
         <w:tc>
           <w:tcPr>
-            <w:tcW w:w="575" w:type="pct"/>
+            <w:tcW w:w="0" w:type="auto"/>
+            <w:tcBorders>
+              <w:top w:val="none" w:sz="0" w:space="0" w:color="000000"/>
+              <w:left w:val="none" w:sz="0" w:space="0" w:color="000000"/>
+              <w:bottom w:val="single" w:sz="12" w:space="0" w:color="666666"/>
+              <w:right w:val="none" w:sz="0" w:space="0" w:color="000000"/>
+            </w:tcBorders>
+            <w:shd w:val="clear" w:color="auto" w:fill="FFFFFF"/>
+            <w:tcMar>
+              <w:top w:w="0" w:type="dxa"/>
+              <w:left w:w="0" w:type="dxa"/>
+              <w:bottom w:w="0" w:type="dxa"/>
+              <w:right w:w="0" w:type="dxa"/>
+            </w:tcMar>
+            <w:vAlign w:val="center"/>
           </w:tcPr>
           <w:p>
             <w:pPr>
@@ -4218,13 +5877,13 @@
       </w:pPr>
     </w:lvl>
   </w:abstractNum>
-  <w:num w:numId="1" w16cid:durableId="14775564">
+  <w:num w:numId="1" w16cid:durableId="17005680">
     <w:abstractNumId w:val="1"/>
   </w:num>
-  <w:num w:numId="2" w16cid:durableId="1572039073">
+  <w:num w:numId="2" w16cid:durableId="159808830">
     <w:abstractNumId w:val="2"/>
   </w:num>
-  <w:num w:numId="3" w16cid:durableId="421531307">
+  <w:num w:numId="3" w16cid:durableId="1362780808">
     <w:abstractNumId w:val="0"/>
   </w:num>
 </w:numbering>
@@ -5030,82 +6689,6 @@
     <w:next w:val="Normal"/>
     <w:rsid w:val="00901463"/>
   </w:style>
-  <w:style w:type="table" w:styleId="TableGrid">
-    <w:name w:val="Table Grid"/>
-    <w:basedOn w:val="TableNormal"/>
-    <w:uiPriority w:val="59"/>
-    <w:rsid w:val="00420985"/>
-    <w:tblPr>
-      <w:tblBorders>
-        <w:top w:val="single" w:sz="4" w:space="0" w:color="auto"/>
-        <w:left w:val="single" w:sz="4" w:space="0" w:color="auto"/>
-        <w:bottom w:val="single" w:sz="4" w:space="0" w:color="auto"/>
-        <w:right w:val="single" w:sz="4" w:space="0" w:color="auto"/>
-        <w:insideH w:val="single" w:sz="4" w:space="0" w:color="auto"/>
-        <w:insideV w:val="single" w:sz="4" w:space="0" w:color="auto"/>
-      </w:tblBorders>
-    </w:tblPr>
-  </w:style>
-  <w:style w:type="table" w:styleId="PlainTable1">
-    <w:name w:val="Plain Table 1"/>
-    <w:basedOn w:val="TableNormal"/>
-    <w:uiPriority w:val="99"/>
-    <w:rsid w:val="00420985"/>
-    <w:tblPr>
-      <w:tblStyleRowBandSize w:val="1"/>
-      <w:tblStyleColBandSize w:val="1"/>
-      <w:tblBorders>
-        <w:top w:val="single" w:sz="4" w:space="0" w:color="BFBFBF" w:themeColor="background1" w:themeShade="BF"/>
-        <w:left w:val="single" w:sz="4" w:space="0" w:color="BFBFBF" w:themeColor="background1" w:themeShade="BF"/>
-        <w:bottom w:val="single" w:sz="4" w:space="0" w:color="BFBFBF" w:themeColor="background1" w:themeShade="BF"/>
-        <w:right w:val="single" w:sz="4" w:space="0" w:color="BFBFBF" w:themeColor="background1" w:themeShade="BF"/>
-        <w:insideH w:val="single" w:sz="4" w:space="0" w:color="BFBFBF" w:themeColor="background1" w:themeShade="BF"/>
-        <w:insideV w:val="single" w:sz="4" w:space="0" w:color="BFBFBF" w:themeColor="background1" w:themeShade="BF"/>
-      </w:tblBorders>
-    </w:tblPr>
-    <w:tblStylePr w:type="firstRow">
-      <w:rPr>
-        <w:b/>
-        <w:bCs/>
-      </w:rPr>
-    </w:tblStylePr>
-    <w:tblStylePr w:type="lastRow">
-      <w:rPr>
-        <w:b/>
-        <w:bCs/>
-      </w:rPr>
-      <w:tblPr/>
-      <w:tcPr>
-        <w:tcBorders>
-          <w:top w:val="double" w:sz="4" w:space="0" w:color="BFBFBF" w:themeColor="background1" w:themeShade="BF"/>
-        </w:tcBorders>
-      </w:tcPr>
-    </w:tblStylePr>
-    <w:tblStylePr w:type="firstCol">
-      <w:rPr>
-        <w:b/>
-        <w:bCs/>
-      </w:rPr>
-    </w:tblStylePr>
-    <w:tblStylePr w:type="lastCol">
-      <w:rPr>
-        <w:b/>
-        <w:bCs/>
-      </w:rPr>
-    </w:tblStylePr>
-    <w:tblStylePr w:type="band1Vert">
-      <w:tblPr/>
-      <w:tcPr>
-        <w:shd w:val="clear" w:color="auto" w:fill="F2F2F2" w:themeFill="background1" w:themeFillShade="F2"/>
-      </w:tcPr>
-    </w:tblStylePr>
-    <w:tblStylePr w:type="band1Horz">
-      <w:tblPr/>
-      <w:tcPr>
-        <w:shd w:val="clear" w:color="auto" w:fill="F2F2F2" w:themeFill="background1" w:themeFillShade="F2"/>
-      </w:tcPr>
-    </w:tblStylePr>
-  </w:style>
 </w:styles>
 </file>
 

</xml_diff>